<commit_message>
modified with respect to Denis input
</commit_message>
<xml_diff>
--- a/assets/files/TP_E3_formulaire.docx
+++ b/assets/files/TP_E3_formulaire.docx
@@ -2,7 +2,7 @@
 <file path=word/document.xml><?xml version="1.0" encoding="utf-8"?>
 <w:document xmlns:w="http://schemas.openxmlformats.org/wordprocessingml/2006/main" xmlns:m="http://schemas.openxmlformats.org/officeDocument/2006/math" xmlns:r="http://schemas.openxmlformats.org/officeDocument/2006/relationships" xmlns:o="urn:schemas-microsoft-com:office:office" xmlns:v="urn:schemas-microsoft-com:vml" xmlns:w10="urn:schemas-microsoft-com:office:word" xmlns:a="http://schemas.openxmlformats.org/drawingml/2006/main" xmlns:pic="http://schemas.openxmlformats.org/drawingml/2006/picture" xmlns:wp="http://schemas.openxmlformats.org/drawingml/2006/wordprocessingDrawing">
   <w:body>
-    <w:bookmarkStart w:id="25" w:name="tp-e3-formulaire-de-réponses"/>
+    <w:bookmarkStart w:id="18" w:name="tp-e3-formulaire-de-réponses"/>
     <w:p>
       <w:pPr>
         <w:pStyle w:val="Heading1"/>
@@ -11,7 +11,7 @@
         <w:t xml:space="preserve">TP E3 — Formulaire de réponses</w:t>
       </w:r>
     </w:p>
-    <w:bookmarkStart w:id="16" w:name="X8ec967a2baf570ce1a8cf526366ded7c41ddbf1"/>
+    <w:bookmarkStart w:id="9" w:name="X8ec967a2baf570ce1a8cf526366ded7c41ddbf1"/>
     <w:p>
       <w:pPr>
         <w:pStyle w:val="Heading2"/>
@@ -95,8 +95,8 @@
         </w:pict>
       </w:r>
     </w:p>
-    <w:bookmarkEnd w:id="16"/>
-    <w:bookmarkStart w:id="19" w:name="Xc0f0675ae71a8f03d37da90c7033e56f583752d"/>
+    <w:bookmarkEnd w:id="9"/>
+    <w:bookmarkStart w:id="12" w:name="Xc0f0675ae71a8f03d37da90c7033e56f583752d"/>
     <w:p>
       <w:pPr>
         <w:pStyle w:val="Heading2"/>
@@ -105,7 +105,7 @@
         <w:t xml:space="preserve">Partie 2 — Tableau vs Liste : comportements asymptotiques</w:t>
       </w:r>
     </w:p>
-    <w:bookmarkStart w:id="17" w:name="exercice-2-insertion-en-tête"/>
+    <w:bookmarkStart w:id="10" w:name="exercice-2-insertion-en-tête"/>
     <w:p>
       <w:pPr>
         <w:pStyle w:val="Heading3"/>
@@ -123,7 +123,7 @@
           <w:b/>
           <w:bCs/>
         </w:rPr>
-        <w:t xml:space="preserve">2.C.</w:t>
+        <w:t xml:space="preserve">2.C–2.D.</w:t>
       </w:r>
       <w:r>
         <w:t xml:space="preserve"> </w:t>
@@ -353,7 +353,7 @@
           <w:b/>
           <w:bCs/>
         </w:rPr>
-        <w:t xml:space="preserve">2.D.</w:t>
+        <w:t xml:space="preserve">2.E.</w:t>
       </w:r>
       <w:r>
         <w:t xml:space="preserve"> </w:t>
@@ -493,7 +493,7 @@
           <w:b/>
           <w:bCs/>
         </w:rPr>
-        <w:t xml:space="preserve">2.E.</w:t>
+        <w:t xml:space="preserve">2.F.</w:t>
       </w:r>
       <w:r>
         <w:t xml:space="preserve"> </w:t>
@@ -577,8 +577,8 @@
         </w:pict>
       </w:r>
     </w:p>
-    <w:bookmarkEnd w:id="17"/>
-    <w:bookmarkStart w:id="18" w:name="exercice-3-accès-aléatoire"/>
+    <w:bookmarkEnd w:id="10"/>
+    <w:bookmarkStart w:id="11" w:name="exercice-3-accès-aléatoire"/>
     <w:p>
       <w:pPr>
         <w:pStyle w:val="Heading3"/>
@@ -1102,9 +1102,9 @@
         </w:pict>
       </w:r>
     </w:p>
-    <w:bookmarkEnd w:id="18"/>
-    <w:bookmarkEnd w:id="19"/>
-    <w:bookmarkStart w:id="21" w:name="Xce65bb98f345f1390d4815070da51fd53496bed"/>
+    <w:bookmarkEnd w:id="11"/>
+    <w:bookmarkEnd w:id="12"/>
+    <w:bookmarkStart w:id="14" w:name="Xce65bb98f345f1390d4815070da51fd53496bed"/>
     <w:p>
       <w:pPr>
         <w:pStyle w:val="Heading2"/>
@@ -1113,7 +1113,7 @@
         <w:t xml:space="preserve">Partie 3 — Impact du layout mémoire : AoS vs SoA</w:t>
       </w:r>
     </w:p>
-    <w:bookmarkStart w:id="20" w:name="exercice-4"/>
+    <w:bookmarkStart w:id="13" w:name="exercice-4"/>
     <w:p>
       <w:pPr>
         <w:pStyle w:val="Heading3"/>
@@ -1768,12 +1768,12 @@
         <w:tblLook w:firstRow="1" w:lastRow="0" w:firstColumn="0" w:lastColumn="0" w:noHBand="0" w:noVBand="0" w:val="0020"/>
       </w:tblPr>
       <w:tblGrid>
-        <w:gridCol w:w="1102"/>
-        <w:gridCol w:w="1503"/>
-        <w:gridCol w:w="1503"/>
-        <w:gridCol w:w="1704"/>
-        <w:gridCol w:w="1002"/>
-        <w:gridCol w:w="1102"/>
+        <w:gridCol w:w="1116"/>
+        <w:gridCol w:w="1523"/>
+        <w:gridCol w:w="1523"/>
+        <w:gridCol w:w="1726"/>
+        <w:gridCol w:w="913"/>
+        <w:gridCol w:w="1116"/>
       </w:tblGrid>
       <w:tr>
         <w:trPr>
@@ -1890,20 +1890,14 @@
             <w:pPr>
               <w:pStyle w:val="Compact"/>
             </w:pPr>
-            <w:r>
-              <w:t xml:space="preserve">12 Mo</w:t>
-            </w:r>
-          </w:p>
-        </w:tc>
-        <w:tc>
-          <w:tcPr/>
-          <w:p>
-            <w:pPr>
-              <w:pStyle w:val="Compact"/>
-            </w:pPr>
-            <w:r>
-              <w:t xml:space="preserve">400 Ko</w:t>
-            </w:r>
+          </w:p>
+        </w:tc>
+        <w:tc>
+          <w:tcPr/>
+          <w:p>
+            <w:pPr>
+              <w:pStyle w:val="Compact"/>
+            </w:pPr>
           </w:p>
         </w:tc>
       </w:tr>
@@ -1949,20 +1943,14 @@
             <w:pPr>
               <w:pStyle w:val="Compact"/>
             </w:pPr>
-            <w:r>
-              <w:t xml:space="preserve">48 Mo</w:t>
-            </w:r>
-          </w:p>
-        </w:tc>
-        <w:tc>
-          <w:tcPr/>
-          <w:p>
-            <w:pPr>
-              <w:pStyle w:val="Compact"/>
-            </w:pPr>
-            <w:r>
-              <w:t xml:space="preserve">1.6 Mo</w:t>
-            </w:r>
+          </w:p>
+        </w:tc>
+        <w:tc>
+          <w:tcPr/>
+          <w:p>
+            <w:pPr>
+              <w:pStyle w:val="Compact"/>
+            </w:pPr>
           </w:p>
         </w:tc>
       </w:tr>
@@ -2008,20 +1996,14 @@
             <w:pPr>
               <w:pStyle w:val="Compact"/>
             </w:pPr>
-            <w:r>
-              <w:t xml:space="preserve">120 Mo</w:t>
-            </w:r>
-          </w:p>
-        </w:tc>
-        <w:tc>
-          <w:tcPr/>
-          <w:p>
-            <w:pPr>
-              <w:pStyle w:val="Compact"/>
-            </w:pPr>
-            <w:r>
-              <w:t xml:space="preserve">4 Mo</w:t>
-            </w:r>
+          </w:p>
+        </w:tc>
+        <w:tc>
+          <w:tcPr/>
+          <w:p>
+            <w:pPr>
+              <w:pStyle w:val="Compact"/>
+            </w:pPr>
           </w:p>
         </w:tc>
       </w:tr>
@@ -2067,20 +2049,14 @@
             <w:pPr>
               <w:pStyle w:val="Compact"/>
             </w:pPr>
-            <w:r>
-              <w:t xml:space="preserve">240 Mo</w:t>
-            </w:r>
-          </w:p>
-        </w:tc>
-        <w:tc>
-          <w:tcPr/>
-          <w:p>
-            <w:pPr>
-              <w:pStyle w:val="Compact"/>
-            </w:pPr>
-            <w:r>
-              <w:t xml:space="preserve">8 Mo</w:t>
-            </w:r>
+          </w:p>
+        </w:tc>
+        <w:tc>
+          <w:tcPr/>
+          <w:p>
+            <w:pPr>
+              <w:pStyle w:val="Compact"/>
+            </w:pPr>
           </w:p>
         </w:tc>
       </w:tr>
@@ -2252,103 +2228,15 @@
       </w:r>
     </w:p>
     <w:p>
-      <w:pPr>
-        <w:pStyle w:val="FirstParagraph"/>
-      </w:pPr>
-      <w:r>
-        <w:rPr>
-          <w:b/>
-          <w:bCs/>
-        </w:rPr>
-        <w:t xml:space="preserve">4.J. (Optionnel)</w:t>
-      </w:r>
-      <w:r>
-        <w:t xml:space="preserve"> </w:t>
-      </w:r>
-      <w:r>
-        <w:t xml:space="preserve">Rapport AoS/SoA avec optimisation (</w:t>
-      </w:r>
-      <w:r>
-        <w:rPr>
-          <w:rStyle w:val="VerbatimChar"/>
-        </w:rPr>
-        <w:t xml:space="preserve">-O2</w:t>
-      </w:r>
-      <w:r>
-        <w:t xml:space="preserve">) pour</w:t>
-      </w:r>
-      <w:r>
-        <w:t xml:space="preserve"> </w:t>
-      </w:r>
-      <m:oMath>
-        <m:r>
-          <m:t>n</m:t>
-        </m:r>
-        <m:r>
-          <m:rPr>
-            <m:sty m:val="p"/>
-          </m:rPr>
-          <m:t>=</m:t>
-        </m:r>
-        <m:r>
-          <m:t>1</m:t>
-        </m:r>
-        <m:r>
-          <m:t> </m:t>
-        </m:r>
-        <m:r>
-          <m:t>000</m:t>
-        </m:r>
-        <m:r>
-          <m:t> </m:t>
-        </m:r>
-        <m:r>
-          <m:t>000</m:t>
-        </m:r>
-      </m:oMath>
-      <w:r>
-        <w:t xml:space="preserve"> </w:t>
-      </w:r>
-      <w:r>
-        <w:t xml:space="preserve">: _______</w:t>
-      </w:r>
-      <w:r>
-        <w:t xml:space="preserve"> </w:t>
-      </w:r>
-      <m:oMath>
-        <m:r>
-          <m:rPr>
-            <m:sty m:val="p"/>
-          </m:rPr>
-          <m:t>×</m:t>
-        </m:r>
-      </m:oMath>
-    </w:p>
-    <w:p>
-      <w:pPr>
-        <w:pStyle w:val="BodyText"/>
-      </w:pPr>
-      <w:r>
-        <w:t xml:space="preserve">Conclusion sur la capacité du compilateur à compenser un mauvais layout mémoire :</w:t>
-      </w:r>
-    </w:p>
-    <w:p>
       <w:r>
         <w:pict>
           <v:rect style="width:0;height:1.5pt" o:hralign="center" o:hrstd="t" o:hr="t"/>
         </w:pict>
       </w:r>
     </w:p>
-    <w:p>
-      <w:r>
-        <w:pict>
-          <v:rect style="width:0;height:1.5pt" o:hralign="center" o:hrstd="t" o:hr="t"/>
-        </w:pict>
-      </w:r>
-    </w:p>
-    <w:bookmarkEnd w:id="20"/>
-    <w:bookmarkEnd w:id="21"/>
-    <w:bookmarkStart w:id="23" w:name="partie-4-détection-de-cycle"/>
+    <w:bookmarkEnd w:id="13"/>
+    <w:bookmarkEnd w:id="14"/>
+    <w:bookmarkStart w:id="16" w:name="partie-4-détection-de-cycle"/>
     <w:p>
       <w:pPr>
         <w:pStyle w:val="Heading2"/>
@@ -2357,7 +2245,7 @@
         <w:t xml:space="preserve">Partie 4 — Détection de cycle</w:t>
       </w:r>
     </w:p>
-    <w:bookmarkStart w:id="22" w:name="exercice-7"/>
+    <w:bookmarkStart w:id="15" w:name="exercice-7"/>
     <w:p>
       <w:pPr>
         <w:pStyle w:val="Heading3"/>
@@ -3014,9 +2902,9 @@
         </w:pict>
       </w:r>
     </w:p>
-    <w:bookmarkEnd w:id="22"/>
-    <w:bookmarkEnd w:id="23"/>
-    <w:bookmarkStart w:id="24" w:name="bilan-général"/>
+    <w:bookmarkEnd w:id="15"/>
+    <w:bookmarkEnd w:id="16"/>
+    <w:bookmarkStart w:id="17" w:name="bilan-général"/>
     <w:p>
       <w:pPr>
         <w:pStyle w:val="Heading2"/>
@@ -3775,14 +3663,12 @@
         </w:pict>
       </w:r>
     </w:p>
-    <w:bookmarkEnd w:id="24"/>
-    <w:bookmarkEnd w:id="25"/>
+    <w:bookmarkEnd w:id="17"/>
+    <w:bookmarkEnd w:id="18"/>
     <w:sectPr>
-      <w:footerReference r:id="rId7" w:type="default"/>
-      <w:pgSz w:h="16838" w:w="11906"/>
-      <w:pgMar w:bottom="567" w:footer="709" w:gutter="0" w:header="709" w:left="720" w:right="720" w:top="567"/>
-      <w:cols w:space="708"/>
-      <w:docGrid w:linePitch="360"/>
+      <w:footnotePr>
+        <w:numRestart w:val="eachSect"/>
+      </w:footnotePr>
     </w:sectPr>
   </w:body>
 </w:document>
@@ -3792,237 +3678,6 @@
 <w:comments xmlns:w="http://schemas.openxmlformats.org/wordprocessingml/2006/main" xmlns:m="http://schemas.openxmlformats.org/officeDocument/2006/math" xmlns:r="http://schemas.openxmlformats.org/officeDocument/2006/relationships" xmlns:o="urn:schemas-microsoft-com:office:office" xmlns:v="urn:schemas-microsoft-com:vml" xmlns:w10="urn:schemas-microsoft-com:office:word" xmlns:a="http://schemas.openxmlformats.org/drawingml/2006/main" xmlns:pic="http://schemas.openxmlformats.org/drawingml/2006/picture" xmlns:wp="http://schemas.openxmlformats.org/drawingml/2006/wordprocessingDrawing"/>
 </file>
 
-<file path=word/footer1.xml><?xml version="1.0" encoding="utf-8"?>
-<w:ftr xmlns:wpc="http://schemas.microsoft.com/office/word/2010/wordprocessingCanvas" xmlns:cx="http://schemas.microsoft.com/office/drawing/2014/chartex" xmlns:cx1="http://schemas.microsoft.com/office/drawing/2015/9/8/chartex" xmlns:mc="http://schemas.openxmlformats.org/markup-compatibility/2006" xmlns:o="urn:schemas-microsoft-com:office:office" xmlns:r="http://schemas.openxmlformats.org/officeDocument/2006/relationships" xmlns:m="http://schemas.openxmlformats.org/officeDocument/2006/math" xmlns:v="urn:schemas-microsoft-com:vml" xmlns:wp14="http://schemas.microsoft.com/office/word/2010/wordprocessingDrawing" xmlns:wp="http://schemas.openxmlformats.org/drawingml/2006/wordprocessingDrawing" xmlns:w10="urn:schemas-microsoft-com:office:word" xmlns:w="http://schemas.openxmlformats.org/wordprocessingml/2006/main" xmlns:w14="http://schemas.microsoft.com/office/word/2010/wordml" xmlns:w15="http://schemas.microsoft.com/office/word/2012/wordml" xmlns:w16se="http://schemas.microsoft.com/office/word/2015/wordml/symex" xmlns:wpg="http://schemas.microsoft.com/office/word/2010/wordprocessingGroup" xmlns:wpi="http://schemas.microsoft.com/office/word/2010/wordprocessingInk" xmlns:wne="http://schemas.microsoft.com/office/word/2006/wordml" xmlns:wps="http://schemas.microsoft.com/office/word/2010/wordprocessingShape" mc:Ignorable="w14 w15 w16se wp14">
-  <w:sdt>
-    <w:sdtPr>
-      <w:id w:val="1519431076"/>
-      <w:docPartObj>
-        <w:docPartGallery w:val="Page Numbers (Bottom of Page)"/>
-        <w:docPartUnique/>
-      </w:docPartObj>
-    </w:sdtPr>
-    <w:sdtEndPr/>
-    <w:sdtContent>
-      <w:p>
-        <w:pPr>
-          <w:pStyle w:val="Pieddepage"/>
-        </w:pPr>
-        <w:r>
-          <w:rPr>
-            <w:noProof/>
-            <w:lang w:eastAsia="fr-FR"/>
-          </w:rPr>
-          <mc:AlternateContent>
-            <mc:Choice Requires="wpg">
-              <w:drawing>
-                <wp:anchor distT="0" distB="0" distL="114300" distR="114300" simplePos="0" relativeHeight="251659264" behindDoc="0" locked="0" layoutInCell="1" allowOverlap="1">
-                  <wp:simplePos x="0" y="0"/>
-                  <wp:positionH relativeFrom="margin">
-                    <wp:align>center</wp:align>
-                  </wp:positionH>
-                  <wp:positionV relativeFrom="page">
-                    <wp:align>bottom</wp:align>
-                  </wp:positionV>
-                  <wp:extent cx="436880" cy="716915"/>
-                  <wp:effectExtent l="9525" t="9525" r="10795" b="6985"/>
-                  <wp:wrapNone/>
-                  <wp:docPr id="1" name="Groupe 1"/>
-                  <wp:cNvGraphicFramePr>
-                    <a:graphicFrameLocks xmlns:a="http://schemas.openxmlformats.org/drawingml/2006/main"/>
-                  </wp:cNvGraphicFramePr>
-                  <a:graphic xmlns:a="http://schemas.openxmlformats.org/drawingml/2006/main">
-                    <a:graphicData uri="http://schemas.microsoft.com/office/word/2010/wordprocessingGroup">
-                      <wpg:wgp>
-                        <wpg:cNvGrpSpPr>
-                          <a:grpSpLocks/>
-                        </wpg:cNvGrpSpPr>
-                        <wpg:grpSpPr bwMode="auto">
-                          <a:xfrm>
-                            <a:off x="0" y="0"/>
-                            <a:ext cx="436880" cy="716915"/>
-                            <a:chOff x="1743" y="14699"/>
-                            <a:chExt cx="688" cy="1129"/>
-                          </a:xfrm>
-                        </wpg:grpSpPr>
-                        <wps:wsp>
-                          <wps:cNvPr id="2" name="AutoShape 77"/>
-                          <wps:cNvCnPr>
-                            <a:cxnSpLocks noChangeShapeType="1"/>
-                          </wps:cNvCnPr>
-                          <wps:spPr bwMode="auto">
-                            <a:xfrm flipV="1">
-                              <a:off x="2111" y="15387"/>
-                              <a:ext cx="0" cy="441"/>
-                            </a:xfrm>
-                            <a:prstGeom prst="straightConnector1">
-                              <a:avLst/>
-                            </a:prstGeom>
-                            <a:noFill/>
-                            <a:ln w="9525">
-                              <a:solidFill>
-                                <a:srgbClr val="7F7F7F"/>
-                              </a:solidFill>
-                              <a:round/>
-                              <a:headEnd/>
-                              <a:tailEnd/>
-                            </a:ln>
-                            <a:extLst>
-                              <a:ext uri="{909E8E84-426E-40DD-AFC4-6F175D3DCCD1}">
-                                <a14:hiddenFill xmlns:a14="http://schemas.microsoft.com/office/drawing/2010/main">
-                                  <a:noFill/>
-                                </a14:hiddenFill>
-                              </a:ext>
-                            </a:extLst>
-                          </wps:spPr>
-                          <wps:bodyPr/>
-                        </wps:wsp>
-                        <wps:wsp>
-                          <wps:cNvPr id="3" name="Rectangle 78"/>
-                          <wps:cNvSpPr>
-                            <a:spLocks noChangeArrowheads="1"/>
-                          </wps:cNvSpPr>
-                          <wps:spPr bwMode="auto">
-                            <a:xfrm>
-                              <a:off x="1743" y="14699"/>
-                              <a:ext cx="688" cy="688"/>
-                            </a:xfrm>
-                            <a:prstGeom prst="rect">
-                              <a:avLst/>
-                            </a:prstGeom>
-                            <a:noFill/>
-                            <a:ln w="9525">
-                              <a:solidFill>
-                                <a:srgbClr val="7F7F7F"/>
-                              </a:solidFill>
-                              <a:miter lim="800000"/>
-                              <a:headEnd/>
-                              <a:tailEnd/>
-                            </a:ln>
-                            <a:extLst>
-                              <a:ext uri="{909E8E84-426E-40DD-AFC4-6F175D3DCCD1}">
-                                <a14:hiddenFill xmlns:a14="http://schemas.microsoft.com/office/drawing/2010/main">
-                                  <a:solidFill>
-                                    <a:srgbClr val="FFFFFF"/>
-                                  </a:solidFill>
-                                </a14:hiddenFill>
-                              </a:ext>
-                            </a:extLst>
-                          </wps:spPr>
-                          <wps:txbx>
-                            <w:txbxContent>
-                              <w:p>
-                                <w:pPr>
-                                  <w:pStyle w:val="Pieddepage"/>
-                                  <w:jc w:val="center"/>
-                                  <w:rPr>
-                                    <w:sz w:val="16"/>
-                                    <w:szCs w:val="16"/>
-                                  </w:rPr>
-                                </w:pPr>
-                                <w:r>
-                                  <w:fldChar w:fldCharType="begin"/>
-                                </w:r>
-                                <w:r>
-                                  <w:instrText>PAGE    \* MERGEFORMAT</w:instrText>
-                                </w:r>
-                                <w:r>
-                                  <w:fldChar w:fldCharType="separate"/>
-                                </w:r>
-                                <w:r>
-                                  <w:rPr>
-                                    <w:noProof/>
-                                    <w:sz w:val="16"/>
-                                    <w:szCs w:val="16"/>
-                                  </w:rPr>
-                                  <w:t>1</w:t>
-                                </w:r>
-                                <w:r>
-                                  <w:rPr>
-                                    <w:sz w:val="16"/>
-                                    <w:szCs w:val="16"/>
-                                  </w:rPr>
-                                  <w:fldChar w:fldCharType="end"/>
-                                </w:r>
-                              </w:p>
-                            </w:txbxContent>
-                          </wps:txbx>
-                          <wps:bodyPr rot="0" vert="horz" wrap="square" lIns="91440" tIns="45720" rIns="91440" bIns="45720" anchor="ctr" anchorCtr="0" upright="1">
-                            <a:noAutofit/>
-                          </wps:bodyPr>
-                        </wps:wsp>
-                      </wpg:wgp>
-                    </a:graphicData>
-                  </a:graphic>
-                  <wp14:sizeRelH relativeFrom="page">
-                    <wp14:pctWidth>0</wp14:pctWidth>
-                  </wp14:sizeRelH>
-                  <wp14:sizeRelV relativeFrom="page">
-                    <wp14:pctHeight>0</wp14:pctHeight>
-                  </wp14:sizeRelV>
-                </wp:anchor>
-              </w:drawing>
-            </mc:Choice>
-            <mc:Fallback>
-              <w:pict>
-                <v:group id="Groupe 1" o:spid="_x0000_s1026" style="position:absolute;margin-left:0;margin-top:0;width:34.4pt;height:56.45pt;z-index:251659264;mso-position-horizontal:center;mso-position-horizontal-relative:margin;mso-position-vertical:bottom;mso-position-vertical-relative:page" coordorigin="1743,14699" coordsize="688,1129" o:gfxdata="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">
-                  <v:shapetype id="_x0000_t32" coordsize="21600,21600" o:spt="32" o:oned="t" path="m,l21600,21600e" filled="f">
-                    <v:path arrowok="t" fillok="f" o:connecttype="none"/>
-                    <o:lock v:ext="edit" shapetype="t"/>
-                  </v:shapetype>
-                  <v:shape id="AutoShape 77" o:spid="_x0000_s1027" type="#_x0000_t32" style="position:absolute;left:2111;top:15387;width:0;height:441;flip:y;visibility:visible;mso-wrap-style:square" o:connectortype="straight" o:gfxdata="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" strokecolor="#7f7f7f"/>
-                  <v:rect id="Rectangle 78" o:spid="_x0000_s1028" style="position:absolute;left:1743;top:14699;width:688;height:688;visibility:visible;mso-wrap-style:square;v-text-anchor:middle" o:gfxdata="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" filled="f" strokecolor="#7f7f7f">
-                    <v:textbox>
-                      <w:txbxContent>
-                        <w:p>
-                          <w:pPr>
-                            <w:pStyle w:val="Pieddepage"/>
-                            <w:jc w:val="center"/>
-                            <w:rPr>
-                              <w:sz w:val="16"/>
-                              <w:szCs w:val="16"/>
-                            </w:rPr>
-                          </w:pPr>
-                          <w:r>
-                            <w:fldChar w:fldCharType="begin"/>
-                          </w:r>
-                          <w:r>
-                            <w:instrText>PAGE    \* MERGEFORMAT</w:instrText>
-                          </w:r>
-                          <w:r>
-                            <w:fldChar w:fldCharType="separate"/>
-                          </w:r>
-                          <w:r>
-                            <w:rPr>
-                              <w:noProof/>
-                              <w:sz w:val="16"/>
-                              <w:szCs w:val="16"/>
-                            </w:rPr>
-                            <w:t>1</w:t>
-                          </w:r>
-                          <w:r>
-                            <w:rPr>
-                              <w:sz w:val="16"/>
-                              <w:szCs w:val="16"/>
-                            </w:rPr>
-                            <w:fldChar w:fldCharType="end"/>
-                          </w:r>
-                        </w:p>
-                      </w:txbxContent>
-                    </v:textbox>
-                  </v:rect>
-                  <w10:wrap anchorx="margin" anchory="page"/>
-                </v:group>
-              </w:pict>
-            </mc:Fallback>
-          </mc:AlternateContent>
-        </w:r>
-      </w:p>
-    </w:sdtContent>
-  </w:sdt>
-</w:ftr>
-</file>
-
 <file path=word/footnotes.xml><?xml version="1.0" encoding="utf-8"?>
 <w:footnotes xmlns:w="http://schemas.openxmlformats.org/wordprocessingml/2006/main" xmlns:m="http://schemas.openxmlformats.org/officeDocument/2006/math" xmlns:r="http://schemas.openxmlformats.org/officeDocument/2006/relationships" xmlns:o="urn:schemas-microsoft-com:office:office" xmlns:v="urn:schemas-microsoft-com:vml" xmlns:w10="urn:schemas-microsoft-com:office:word" xmlns:a="http://schemas.openxmlformats.org/drawingml/2006/main" xmlns:pic="http://schemas.openxmlformats.org/drawingml/2006/picture" xmlns:wp="http://schemas.openxmlformats.org/drawingml/2006/wordprocessingDrawing">
   <w:footnote w:type="continuationSeparator" w:id="0">
@@ -4043,119 +3698,7 @@
 </file>
 
 <file path=word/numbering.xml><?xml version="1.0" encoding="utf-8"?>
-<w:numbering xmlns:cx="http://schemas.microsoft.com/office/drawing/2014/chartex" xmlns:cx1="http://schemas.microsoft.com/office/drawing/2015/9/8/chartex" xmlns:m="http://schemas.openxmlformats.org/officeDocument/2006/math" xmlns:mc="http://schemas.openxmlformats.org/markup-compatibility/2006" xmlns:o="urn:schemas-microsoft-com:office:office" xmlns:r="http://schemas.openxmlformats.org/officeDocument/2006/relationships" xmlns:v="urn:schemas-microsoft-com:vml" xmlns:w="http://schemas.openxmlformats.org/wordprocessingml/2006/main" xmlns:w10="urn:schemas-microsoft-com:office:word" xmlns:w14="http://schemas.microsoft.com/office/word/2010/wordml" xmlns:w15="http://schemas.microsoft.com/office/word/2012/wordml" xmlns:w16se="http://schemas.microsoft.com/office/word/2015/wordml/symex" xmlns:wne="http://schemas.microsoft.com/office/word/2006/wordml" xmlns:wp="http://schemas.openxmlformats.org/drawingml/2006/wordprocessingDrawing" xmlns:wp14="http://schemas.microsoft.com/office/word/2010/wordprocessingDrawing" xmlns:wpc="http://schemas.microsoft.com/office/word/2010/wordprocessingCanvas" xmlns:wpg="http://schemas.microsoft.com/office/word/2010/wordprocessingGroup" xmlns:wpi="http://schemas.microsoft.com/office/word/2010/wordprocessingInk" xmlns:wps="http://schemas.microsoft.com/office/word/2010/wordprocessingShape" mc:Ignorable="w14 w15 w16se wp14">
-  <w:abstractNum w15:restartNumberingAfterBreak="0" w:abstractNumId="0">
-    <w:nsid w:val="038C2E39"/>
-    <w:multiLevelType w:val="hybridMultilevel"/>
-    <w:tmpl w:val="68C0F988"/>
-    <w:lvl w:ilvl="0" w:tplc="8C6206D4">
-      <w:numFmt w:val="bullet"/>
-      <w:lvlText w:val="-"/>
-      <w:lvlJc w:val="left"/>
-      <w:pPr>
-        <w:ind w:hanging="360" w:left="720"/>
-      </w:pPr>
-      <w:rPr>
-        <w:rFonts w:ascii="Courier New" w:cs="Courier New" w:eastAsiaTheme="minorHAnsi" w:hAnsi="Courier New" w:hint="default"/>
-      </w:rPr>
-    </w:lvl>
-    <w:lvl w:ilvl="1" w:tentative="1" w:tplc="040C0003">
-      <w:start w:val="1"/>
-      <w:numFmt w:val="bullet"/>
-      <w:lvlText w:val="o"/>
-      <w:lvlJc w:val="left"/>
-      <w:pPr>
-        <w:ind w:hanging="360" w:left="1440"/>
-      </w:pPr>
-      <w:rPr>
-        <w:rFonts w:ascii="Courier New" w:cs="Courier New" w:hAnsi="Courier New" w:hint="default"/>
-      </w:rPr>
-    </w:lvl>
-    <w:lvl w:ilvl="2" w:tentative="1" w:tplc="040C0005">
-      <w:start w:val="1"/>
-      <w:numFmt w:val="bullet"/>
-      <w:lvlText w:val=""/>
-      <w:lvlJc w:val="left"/>
-      <w:pPr>
-        <w:ind w:hanging="360" w:left="2160"/>
-      </w:pPr>
-      <w:rPr>
-        <w:rFonts w:ascii="Wingdings" w:hAnsi="Wingdings" w:hint="default"/>
-      </w:rPr>
-    </w:lvl>
-    <w:lvl w:ilvl="3" w:tentative="1" w:tplc="040C0001">
-      <w:start w:val="1"/>
-      <w:numFmt w:val="bullet"/>
-      <w:lvlText w:val=""/>
-      <w:lvlJc w:val="left"/>
-      <w:pPr>
-        <w:ind w:hanging="360" w:left="2880"/>
-      </w:pPr>
-      <w:rPr>
-        <w:rFonts w:ascii="Symbol" w:hAnsi="Symbol" w:hint="default"/>
-      </w:rPr>
-    </w:lvl>
-    <w:lvl w:ilvl="4" w:tentative="1" w:tplc="040C0003">
-      <w:start w:val="1"/>
-      <w:numFmt w:val="bullet"/>
-      <w:lvlText w:val="o"/>
-      <w:lvlJc w:val="left"/>
-      <w:pPr>
-        <w:ind w:hanging="360" w:left="3600"/>
-      </w:pPr>
-      <w:rPr>
-        <w:rFonts w:ascii="Courier New" w:cs="Courier New" w:hAnsi="Courier New" w:hint="default"/>
-      </w:rPr>
-    </w:lvl>
-    <w:lvl w:ilvl="5" w:tentative="1" w:tplc="040C0005">
-      <w:start w:val="1"/>
-      <w:numFmt w:val="bullet"/>
-      <w:lvlText w:val=""/>
-      <w:lvlJc w:val="left"/>
-      <w:pPr>
-        <w:ind w:hanging="360" w:left="4320"/>
-      </w:pPr>
-      <w:rPr>
-        <w:rFonts w:ascii="Wingdings" w:hAnsi="Wingdings" w:hint="default"/>
-      </w:rPr>
-    </w:lvl>
-    <w:lvl w:ilvl="6" w:tentative="1" w:tplc="040C0001">
-      <w:start w:val="1"/>
-      <w:numFmt w:val="bullet"/>
-      <w:lvlText w:val=""/>
-      <w:lvlJc w:val="left"/>
-      <w:pPr>
-        <w:ind w:hanging="360" w:left="5040"/>
-      </w:pPr>
-      <w:rPr>
-        <w:rFonts w:ascii="Symbol" w:hAnsi="Symbol" w:hint="default"/>
-      </w:rPr>
-    </w:lvl>
-    <w:lvl w:ilvl="7" w:tentative="1" w:tplc="040C0003">
-      <w:start w:val="1"/>
-      <w:numFmt w:val="bullet"/>
-      <w:lvlText w:val="o"/>
-      <w:lvlJc w:val="left"/>
-      <w:pPr>
-        <w:ind w:hanging="360" w:left="5760"/>
-      </w:pPr>
-      <w:rPr>
-        <w:rFonts w:ascii="Courier New" w:cs="Courier New" w:hAnsi="Courier New" w:hint="default"/>
-      </w:rPr>
-    </w:lvl>
-    <w:lvl w:ilvl="8" w:tentative="1" w:tplc="040C0005">
-      <w:start w:val="1"/>
-      <w:numFmt w:val="bullet"/>
-      <w:lvlText w:val=""/>
-      <w:lvlJc w:val="left"/>
-      <w:pPr>
-        <w:ind w:hanging="360" w:left="6480"/>
-      </w:pPr>
-      <w:rPr>
-        <w:rFonts w:ascii="Wingdings" w:hAnsi="Wingdings" w:hint="default"/>
-      </w:rPr>
-    </w:lvl>
-  </w:abstractNum>
+<w:numbering xmlns:w="http://schemas.openxmlformats.org/wordprocessingml/2006/main">
   <w:abstractNum w:abstractNumId="990">
     <w:nsid w:val="0000A990"/>
     <w:multiLevelType w:val="multilevel"/>
@@ -4335,9 +3878,6 @@
       </w:rPr>
     </w:lvl>
   </w:abstractNum>
-  <w:num w:numId="1">
-    <w:abstractNumId w:val="0"/>
-  </w:num>
   <w:num w:numId="1000">
     <w:abstractNumId w:val="990"/>
   </w:num>
@@ -4354,411 +3894,544 @@
 </file>
 
 <file path=word/styles.xml><?xml version="1.0" encoding="utf-8"?>
-<w:styles xmlns:mc="http://schemas.openxmlformats.org/markup-compatibility/2006" xmlns:r="http://schemas.openxmlformats.org/officeDocument/2006/relationships" xmlns:w="http://schemas.openxmlformats.org/wordprocessingml/2006/main" xmlns:w14="http://schemas.microsoft.com/office/word/2010/wordml" xmlns:w15="http://schemas.microsoft.com/office/word/2012/wordml" xmlns:w16se="http://schemas.microsoft.com/office/word/2015/wordml/symex" mc:Ignorable="w14 w15 w16se">
+<w:styles xmlns:r="http://schemas.openxmlformats.org/officeDocument/2006/relationships" xmlns:w="http://schemas.openxmlformats.org/wordprocessingml/2006/main">
   <w:docDefaults>
     <w:rPrDefault>
       <w:rPr>
-        <w:rFonts w:asciiTheme="minorHAnsi" w:cstheme="minorBidi" w:eastAsiaTheme="minorHAnsi" w:hAnsiTheme="minorHAnsi"/>
-        <w:sz w:val="22"/>
-        <w:szCs w:val="22"/>
-        <w:lang w:bidi="ar-SA" w:eastAsia="en-US" w:val="fr-FR"/>
+        <w:rFonts w:asciiTheme="minorHAnsi" w:cstheme="minorBidi" w:eastAsiaTheme="minorEastAsia" w:hAnsiTheme="minorHAnsi"/>
+        <w:sz w:val="24"/>
+        <w:szCs w:val="24"/>
+        <w:lang w:bidi="ar-SA" w:eastAsia="zh-CN" w:val="en-US"/>
       </w:rPr>
     </w:rPrDefault>
     <w:pPrDefault>
       <w:pPr>
-        <w:spacing w:after="160" w:line="259" w:lineRule="auto"/>
+        <w:spacing w:after="200"/>
       </w:pPr>
     </w:pPrDefault>
   </w:docDefaults>
-  <w:latentStyles w:count="371" w:defLockedState="0" w:defQFormat="0" w:defSemiHidden="0" w:defUIPriority="99" w:defUnhideWhenUsed="0">
-    <w:lsdException w:name="Normal" w:qFormat="1" w:uiPriority="0"/>
-    <w:lsdException w:name="heading 1" w:qFormat="1" w:uiPriority="9"/>
-    <w:lsdException w:name="heading 2" w:qFormat="1" w:semiHidden="1" w:uiPriority="9" w:unhideWhenUsed="1"/>
-    <w:lsdException w:name="heading 3" w:qFormat="1" w:semiHidden="1" w:uiPriority="9" w:unhideWhenUsed="1"/>
-    <w:lsdException w:name="heading 4" w:qFormat="1" w:semiHidden="1" w:uiPriority="9" w:unhideWhenUsed="1"/>
-    <w:lsdException w:name="heading 5" w:qFormat="1" w:semiHidden="1" w:uiPriority="9" w:unhideWhenUsed="1"/>
-    <w:lsdException w:name="heading 6" w:qFormat="1" w:semiHidden="1" w:uiPriority="9" w:unhideWhenUsed="1"/>
-    <w:lsdException w:name="heading 7" w:qFormat="1" w:semiHidden="1" w:uiPriority="9" w:unhideWhenUsed="1"/>
-    <w:lsdException w:name="heading 8" w:qFormat="1" w:semiHidden="1" w:uiPriority="9" w:unhideWhenUsed="1"/>
-    <w:lsdException w:name="heading 9" w:qFormat="1" w:semiHidden="1" w:uiPriority="9" w:unhideWhenUsed="1"/>
-    <w:lsdException w:name="index 1" w:semiHidden="1" w:unhideWhenUsed="1"/>
-    <w:lsdException w:name="index 2" w:semiHidden="1" w:unhideWhenUsed="1"/>
-    <w:lsdException w:name="index 3" w:semiHidden="1" w:unhideWhenUsed="1"/>
-    <w:lsdException w:name="index 4" w:semiHidden="1" w:unhideWhenUsed="1"/>
-    <w:lsdException w:name="index 5" w:semiHidden="1" w:unhideWhenUsed="1"/>
-    <w:lsdException w:name="index 6" w:semiHidden="1" w:unhideWhenUsed="1"/>
-    <w:lsdException w:name="index 7" w:semiHidden="1" w:unhideWhenUsed="1"/>
-    <w:lsdException w:name="index 8" w:semiHidden="1" w:unhideWhenUsed="1"/>
-    <w:lsdException w:name="index 9" w:semiHidden="1" w:unhideWhenUsed="1"/>
-    <w:lsdException w:name="toc 1" w:semiHidden="1" w:uiPriority="39" w:unhideWhenUsed="1"/>
-    <w:lsdException w:name="toc 2" w:semiHidden="1" w:uiPriority="39" w:unhideWhenUsed="1"/>
-    <w:lsdException w:name="toc 3" w:semiHidden="1" w:uiPriority="39" w:unhideWhenUsed="1"/>
-    <w:lsdException w:name="toc 4" w:semiHidden="1" w:uiPriority="39" w:unhideWhenUsed="1"/>
-    <w:lsdException w:name="toc 5" w:semiHidden="1" w:uiPriority="39" w:unhideWhenUsed="1"/>
-    <w:lsdException w:name="toc 6" w:semiHidden="1" w:uiPriority="39" w:unhideWhenUsed="1"/>
-    <w:lsdException w:name="toc 7" w:semiHidden="1" w:uiPriority="39" w:unhideWhenUsed="1"/>
-    <w:lsdException w:name="toc 8" w:semiHidden="1" w:uiPriority="39" w:unhideWhenUsed="1"/>
-    <w:lsdException w:name="toc 9" w:semiHidden="1" w:uiPriority="39" w:unhideWhenUsed="1"/>
-    <w:lsdException w:name="Normal Indent" w:semiHidden="1" w:unhideWhenUsed="1"/>
-    <w:lsdException w:name="footnote text" w:semiHidden="1" w:unhideWhenUsed="1"/>
-    <w:lsdException w:name="annotation text" w:semiHidden="1" w:unhideWhenUsed="1"/>
-    <w:lsdException w:name="header" w:semiHidden="1" w:unhideWhenUsed="1"/>
-    <w:lsdException w:name="footer" w:semiHidden="1" w:unhideWhenUsed="1"/>
-    <w:lsdException w:name="index heading" w:semiHidden="1" w:unhideWhenUsed="1"/>
-    <w:lsdException w:name="caption" w:qFormat="1" w:semiHidden="1" w:uiPriority="35" w:unhideWhenUsed="1"/>
-    <w:lsdException w:name="table of figures" w:semiHidden="1" w:unhideWhenUsed="1"/>
-    <w:lsdException w:name="envelope address" w:semiHidden="1" w:unhideWhenUsed="1"/>
-    <w:lsdException w:name="envelope return" w:semiHidden="1" w:unhideWhenUsed="1"/>
-    <w:lsdException w:name="footnote reference" w:semiHidden="1" w:unhideWhenUsed="1"/>
-    <w:lsdException w:name="annotation reference" w:semiHidden="1" w:unhideWhenUsed="1"/>
-    <w:lsdException w:name="line number" w:semiHidden="1" w:unhideWhenUsed="1"/>
-    <w:lsdException w:name="page number" w:semiHidden="1" w:unhideWhenUsed="1"/>
-    <w:lsdException w:name="endnote reference" w:semiHidden="1" w:unhideWhenUsed="1"/>
-    <w:lsdException w:name="endnote text" w:semiHidden="1" w:unhideWhenUsed="1"/>
-    <w:lsdException w:name="table of authorities" w:semiHidden="1" w:unhideWhenUsed="1"/>
-    <w:lsdException w:name="macro" w:semiHidden="1" w:unhideWhenUsed="1"/>
-    <w:lsdException w:name="toa heading" w:semiHidden="1" w:unhideWhenUsed="1"/>
-    <w:lsdException w:name="List" w:semiHidden="1" w:unhideWhenUsed="1"/>
-    <w:lsdException w:name="List Bullet" w:semiHidden="1" w:unhideWhenUsed="1"/>
-    <w:lsdException w:name="List Number" w:semiHidden="1" w:unhideWhenUsed="1"/>
-    <w:lsdException w:name="List 2" w:semiHidden="1" w:unhideWhenUsed="1"/>
-    <w:lsdException w:name="List 3" w:semiHidden="1" w:unhideWhenUsed="1"/>
-    <w:lsdException w:name="List 4" w:semiHidden="1" w:unhideWhenUsed="1"/>
-    <w:lsdException w:name="List 5" w:semiHidden="1" w:unhideWhenUsed="1"/>
-    <w:lsdException w:name="List Bullet 2" w:semiHidden="1" w:unhideWhenUsed="1"/>
-    <w:lsdException w:name="List Bullet 3" w:semiHidden="1" w:unhideWhenUsed="1"/>
-    <w:lsdException w:name="List Bullet 4" w:semiHidden="1" w:unhideWhenUsed="1"/>
-    <w:lsdException w:name="List Bullet 5" w:semiHidden="1" w:unhideWhenUsed="1"/>
-    <w:lsdException w:name="List Number 2" w:semiHidden="1" w:unhideWhenUsed="1"/>
-    <w:lsdException w:name="List Number 3" w:semiHidden="1" w:unhideWhenUsed="1"/>
-    <w:lsdException w:name="List Number 4" w:semiHidden="1" w:unhideWhenUsed="1"/>
-    <w:lsdException w:name="List Number 5" w:semiHidden="1" w:unhideWhenUsed="1"/>
-    <w:lsdException w:name="Title" w:qFormat="1" w:uiPriority="10"/>
-    <w:lsdException w:name="Closing" w:semiHidden="1" w:unhideWhenUsed="1"/>
-    <w:lsdException w:name="Signature" w:semiHidden="1" w:unhideWhenUsed="1"/>
-    <w:lsdException w:name="Default Paragraph Font" w:semiHidden="1" w:uiPriority="1" w:unhideWhenUsed="1"/>
-    <w:lsdException w:name="Body Text" w:semiHidden="1" w:unhideWhenUsed="1"/>
-    <w:lsdException w:name="Body Text Indent" w:semiHidden="1" w:unhideWhenUsed="1"/>
-    <w:lsdException w:name="List Continue" w:semiHidden="1" w:unhideWhenUsed="1"/>
-    <w:lsdException w:name="List Continue 2" w:semiHidden="1" w:unhideWhenUsed="1"/>
-    <w:lsdException w:name="List Continue 3" w:semiHidden="1" w:unhideWhenUsed="1"/>
-    <w:lsdException w:name="List Continue 4" w:semiHidden="1" w:unhideWhenUsed="1"/>
-    <w:lsdException w:name="List Continue 5" w:semiHidden="1" w:unhideWhenUsed="1"/>
-    <w:lsdException w:name="Message Header" w:semiHidden="1" w:unhideWhenUsed="1"/>
-    <w:lsdException w:name="Subtitle" w:qFormat="1" w:uiPriority="11"/>
-    <w:lsdException w:name="Salutation" w:semiHidden="1" w:unhideWhenUsed="1"/>
-    <w:lsdException w:name="Date" w:semiHidden="1" w:unhideWhenUsed="1"/>
-    <w:lsdException w:name="Body Text First Indent" w:semiHidden="1" w:unhideWhenUsed="1"/>
-    <w:lsdException w:name="Body Text First Indent 2" w:semiHidden="1" w:unhideWhenUsed="1"/>
-    <w:lsdException w:name="Note Heading" w:semiHidden="1" w:unhideWhenUsed="1"/>
-    <w:lsdException w:name="Body Text 2" w:semiHidden="1" w:unhideWhenUsed="1"/>
-    <w:lsdException w:name="Body Text 3" w:semiHidden="1" w:unhideWhenUsed="1"/>
-    <w:lsdException w:name="Body Text Indent 2" w:semiHidden="1" w:unhideWhenUsed="1"/>
-    <w:lsdException w:name="Body Text Indent 3" w:semiHidden="1" w:unhideWhenUsed="1"/>
-    <w:lsdException w:name="Block Text" w:semiHidden="1" w:unhideWhenUsed="1"/>
-    <w:lsdException w:name="Hyperlink" w:semiHidden="1" w:unhideWhenUsed="1"/>
-    <w:lsdException w:name="FollowedHyperlink" w:semiHidden="1" w:unhideWhenUsed="1"/>
-    <w:lsdException w:name="Strong" w:qFormat="1" w:uiPriority="22"/>
-    <w:lsdException w:name="Emphasis" w:qFormat="1" w:uiPriority="20"/>
-    <w:lsdException w:name="Document Map" w:semiHidden="1" w:unhideWhenUsed="1"/>
-    <w:lsdException w:name="Plain Text" w:semiHidden="1" w:unhideWhenUsed="1"/>
-    <w:lsdException w:name="E-mail Signature" w:semiHidden="1" w:unhideWhenUsed="1"/>
-    <w:lsdException w:name="HTML Top of Form" w:semiHidden="1" w:unhideWhenUsed="1"/>
-    <w:lsdException w:name="HTML Bottom of Form" w:semiHidden="1" w:unhideWhenUsed="1"/>
-    <w:lsdException w:name="Normal (Web)" w:semiHidden="1" w:unhideWhenUsed="1"/>
-    <w:lsdException w:name="HTML Acronym" w:semiHidden="1" w:unhideWhenUsed="1"/>
-    <w:lsdException w:name="HTML Address" w:semiHidden="1" w:unhideWhenUsed="1"/>
-    <w:lsdException w:name="HTML Cite" w:semiHidden="1" w:unhideWhenUsed="1"/>
-    <w:lsdException w:name="HTML Code" w:semiHidden="1" w:unhideWhenUsed="1"/>
-    <w:lsdException w:name="HTML Definition" w:semiHidden="1" w:unhideWhenUsed="1"/>
-    <w:lsdException w:name="HTML Keyboard" w:semiHidden="1" w:unhideWhenUsed="1"/>
-    <w:lsdException w:name="HTML Preformatted" w:semiHidden="1" w:unhideWhenUsed="1"/>
-    <w:lsdException w:name="HTML Sample" w:semiHidden="1" w:unhideWhenUsed="1"/>
-    <w:lsdException w:name="HTML Typewriter" w:semiHidden="1" w:unhideWhenUsed="1"/>
-    <w:lsdException w:name="HTML Variable" w:semiHidden="1" w:unhideWhenUsed="1"/>
-    <w:lsdException w:name="Normal Table" w:semiHidden="1" w:unhideWhenUsed="1"/>
-    <w:lsdException w:name="annotation subject" w:semiHidden="1" w:unhideWhenUsed="1"/>
-    <w:lsdException w:name="No List" w:semiHidden="1" w:unhideWhenUsed="1"/>
-    <w:lsdException w:name="Outline List 1" w:semiHidden="1" w:unhideWhenUsed="1"/>
-    <w:lsdException w:name="Outline List 2" w:semiHidden="1" w:unhideWhenUsed="1"/>
-    <w:lsdException w:name="Outline List 3" w:semiHidden="1" w:unhideWhenUsed="1"/>
-    <w:lsdException w:name="Table Simple 1" w:semiHidden="1" w:unhideWhenUsed="1"/>
-    <w:lsdException w:name="Table Simple 2" w:semiHidden="1" w:unhideWhenUsed="1"/>
-    <w:lsdException w:name="Table Simple 3" w:semiHidden="1" w:unhideWhenUsed="1"/>
-    <w:lsdException w:name="Table Classic 1" w:semiHidden="1" w:unhideWhenUsed="1"/>
-    <w:lsdException w:name="Table Classic 2" w:semiHidden="1" w:unhideWhenUsed="1"/>
-    <w:lsdException w:name="Table Classic 3" w:semiHidden="1" w:unhideWhenUsed="1"/>
-    <w:lsdException w:name="Table Classic 4" w:semiHidden="1" w:unhideWhenUsed="1"/>
-    <w:lsdException w:name="Table Colorful 1" w:semiHidden="1" w:unhideWhenUsed="1"/>
-    <w:lsdException w:name="Table Colorful 2" w:semiHidden="1" w:unhideWhenUsed="1"/>
-    <w:lsdException w:name="Table Colorful 3" w:semiHidden="1" w:unhideWhenUsed="1"/>
-    <w:lsdException w:name="Table Columns 1" w:semiHidden="1" w:unhideWhenUsed="1"/>
-    <w:lsdException w:name="Table Columns 2" w:semiHidden="1" w:unhideWhenUsed="1"/>
-    <w:lsdException w:name="Table Columns 3" w:semiHidden="1" w:unhideWhenUsed="1"/>
-    <w:lsdException w:name="Table Columns 4" w:semiHidden="1" w:unhideWhenUsed="1"/>
-    <w:lsdException w:name="Table Columns 5" w:semiHidden="1" w:unhideWhenUsed="1"/>
-    <w:lsdException w:name="Table Grid 1" w:semiHidden="1" w:unhideWhenUsed="1"/>
-    <w:lsdException w:name="Table Grid 2" w:semiHidden="1" w:unhideWhenUsed="1"/>
-    <w:lsdException w:name="Table Grid 3" w:semiHidden="1" w:unhideWhenUsed="1"/>
-    <w:lsdException w:name="Table Grid 4" w:semiHidden="1" w:unhideWhenUsed="1"/>
-    <w:lsdException w:name="Table Grid 5" w:semiHidden="1" w:unhideWhenUsed="1"/>
-    <w:lsdException w:name="Table Grid 6" w:semiHidden="1" w:unhideWhenUsed="1"/>
-    <w:lsdException w:name="Table Grid 7" w:semiHidden="1" w:unhideWhenUsed="1"/>
-    <w:lsdException w:name="Table Grid 8" w:semiHidden="1" w:unhideWhenUsed="1"/>
-    <w:lsdException w:name="Table List 1" w:semiHidden="1" w:unhideWhenUsed="1"/>
-    <w:lsdException w:name="Table List 2" w:semiHidden="1" w:unhideWhenUsed="1"/>
-    <w:lsdException w:name="Table List 3" w:semiHidden="1" w:unhideWhenUsed="1"/>
-    <w:lsdException w:name="Table List 4" w:semiHidden="1" w:unhideWhenUsed="1"/>
-    <w:lsdException w:name="Table List 5" w:semiHidden="1" w:unhideWhenUsed="1"/>
-    <w:lsdException w:name="Table List 6" w:semiHidden="1" w:unhideWhenUsed="1"/>
-    <w:lsdException w:name="Table List 7" w:semiHidden="1" w:unhideWhenUsed="1"/>
-    <w:lsdException w:name="Table List 8" w:semiHidden="1" w:unhideWhenUsed="1"/>
-    <w:lsdException w:name="Table 3D effects 1" w:semiHidden="1" w:unhideWhenUsed="1"/>
-    <w:lsdException w:name="Table 3D effects 2" w:semiHidden="1" w:unhideWhenUsed="1"/>
-    <w:lsdException w:name="Table 3D effects 3" w:semiHidden="1" w:unhideWhenUsed="1"/>
-    <w:lsdException w:name="Table Contemporary" w:semiHidden="1" w:unhideWhenUsed="1"/>
-    <w:lsdException w:name="Table Elegant" w:semiHidden="1" w:unhideWhenUsed="1"/>
-    <w:lsdException w:name="Table Professional" w:semiHidden="1" w:unhideWhenUsed="1"/>
-    <w:lsdException w:name="Table Subtle 1" w:semiHidden="1" w:unhideWhenUsed="1"/>
-    <w:lsdException w:name="Table Subtle 2" w:semiHidden="1" w:unhideWhenUsed="1"/>
-    <w:lsdException w:name="Table Web 1" w:semiHidden="1" w:unhideWhenUsed="1"/>
-    <w:lsdException w:name="Table Web 2" w:semiHidden="1" w:unhideWhenUsed="1"/>
-    <w:lsdException w:name="Table Web 3" w:semiHidden="1" w:unhideWhenUsed="1"/>
-    <w:lsdException w:name="Balloon Text" w:semiHidden="1" w:unhideWhenUsed="1"/>
-    <w:lsdException w:name="Table Grid" w:uiPriority="39"/>
-    <w:lsdException w:name="Table Theme" w:semiHidden="1" w:unhideWhenUsed="1"/>
-    <w:lsdException w:name="Placeholder Text" w:semiHidden="1"/>
-    <w:lsdException w:name="No Spacing" w:qFormat="1" w:uiPriority="1"/>
-    <w:lsdException w:name="Light Shading" w:uiPriority="60"/>
-    <w:lsdException w:name="Light List" w:uiPriority="61"/>
-    <w:lsdException w:name="Light Grid" w:uiPriority="62"/>
-    <w:lsdException w:name="Medium Shading 1" w:uiPriority="63"/>
-    <w:lsdException w:name="Medium Shading 2" w:uiPriority="64"/>
-    <w:lsdException w:name="Medium List 1" w:uiPriority="65"/>
-    <w:lsdException w:name="Medium List 2" w:uiPriority="66"/>
-    <w:lsdException w:name="Medium Grid 1" w:uiPriority="67"/>
-    <w:lsdException w:name="Medium Grid 2" w:uiPriority="68"/>
-    <w:lsdException w:name="Medium Grid 3" w:uiPriority="69"/>
-    <w:lsdException w:name="Dark List" w:uiPriority="70"/>
-    <w:lsdException w:name="Colorful Shading" w:uiPriority="71"/>
-    <w:lsdException w:name="Colorful List" w:uiPriority="72"/>
-    <w:lsdException w:name="Colorful Grid" w:uiPriority="73"/>
-    <w:lsdException w:name="Light Shading Accent 1" w:uiPriority="60"/>
-    <w:lsdException w:name="Light List Accent 1" w:uiPriority="61"/>
-    <w:lsdException w:name="Light Grid Accent 1" w:uiPriority="62"/>
-    <w:lsdException w:name="Medium Shading 1 Accent 1" w:uiPriority="63"/>
-    <w:lsdException w:name="Medium Shading 2 Accent 1" w:uiPriority="64"/>
-    <w:lsdException w:name="Medium List 1 Accent 1" w:uiPriority="65"/>
-    <w:lsdException w:name="Revision" w:semiHidden="1"/>
-    <w:lsdException w:name="List Paragraph" w:qFormat="1" w:uiPriority="34"/>
-    <w:lsdException w:name="Quote" w:qFormat="1" w:uiPriority="29"/>
-    <w:lsdException w:name="Intense Quote" w:qFormat="1" w:uiPriority="30"/>
-    <w:lsdException w:name="Medium List 2 Accent 1" w:uiPriority="66"/>
-    <w:lsdException w:name="Medium Grid 1 Accent 1" w:uiPriority="67"/>
-    <w:lsdException w:name="Medium Grid 2 Accent 1" w:uiPriority="68"/>
-    <w:lsdException w:name="Medium Grid 3 Accent 1" w:uiPriority="69"/>
-    <w:lsdException w:name="Dark List Accent 1" w:uiPriority="70"/>
-    <w:lsdException w:name="Colorful Shading Accent 1" w:uiPriority="71"/>
-    <w:lsdException w:name="Colorful List Accent 1" w:uiPriority="72"/>
-    <w:lsdException w:name="Colorful Grid Accent 1" w:uiPriority="73"/>
-    <w:lsdException w:name="Light Shading Accent 2" w:uiPriority="60"/>
-    <w:lsdException w:name="Light List Accent 2" w:uiPriority="61"/>
-    <w:lsdException w:name="Light Grid Accent 2" w:uiPriority="62"/>
-    <w:lsdException w:name="Medium Shading 1 Accent 2" w:uiPriority="63"/>
-    <w:lsdException w:name="Medium Shading 2 Accent 2" w:uiPriority="64"/>
-    <w:lsdException w:name="Medium List 1 Accent 2" w:uiPriority="65"/>
-    <w:lsdException w:name="Medium List 2 Accent 2" w:uiPriority="66"/>
-    <w:lsdException w:name="Medium Grid 1 Accent 2" w:uiPriority="67"/>
-    <w:lsdException w:name="Medium Grid 2 Accent 2" w:uiPriority="68"/>
-    <w:lsdException w:name="Medium Grid 3 Accent 2" w:uiPriority="69"/>
-    <w:lsdException w:name="Dark List Accent 2" w:uiPriority="70"/>
-    <w:lsdException w:name="Colorful Shading Accent 2" w:uiPriority="71"/>
-    <w:lsdException w:name="Colorful List Accent 2" w:uiPriority="72"/>
-    <w:lsdException w:name="Colorful Grid Accent 2" w:uiPriority="73"/>
-    <w:lsdException w:name="Light Shading Accent 3" w:uiPriority="60"/>
-    <w:lsdException w:name="Light List Accent 3" w:uiPriority="61"/>
-    <w:lsdException w:name="Light Grid Accent 3" w:uiPriority="62"/>
-    <w:lsdException w:name="Medium Shading 1 Accent 3" w:uiPriority="63"/>
-    <w:lsdException w:name="Medium Shading 2 Accent 3" w:uiPriority="64"/>
-    <w:lsdException w:name="Medium List 1 Accent 3" w:uiPriority="65"/>
-    <w:lsdException w:name="Medium List 2 Accent 3" w:uiPriority="66"/>
-    <w:lsdException w:name="Medium Grid 1 Accent 3" w:uiPriority="67"/>
-    <w:lsdException w:name="Medium Grid 2 Accent 3" w:uiPriority="68"/>
-    <w:lsdException w:name="Medium Grid 3 Accent 3" w:uiPriority="69"/>
-    <w:lsdException w:name="Dark List Accent 3" w:uiPriority="70"/>
-    <w:lsdException w:name="Colorful Shading Accent 3" w:uiPriority="71"/>
-    <w:lsdException w:name="Colorful List Accent 3" w:uiPriority="72"/>
-    <w:lsdException w:name="Colorful Grid Accent 3" w:uiPriority="73"/>
-    <w:lsdException w:name="Light Shading Accent 4" w:uiPriority="60"/>
-    <w:lsdException w:name="Light List Accent 4" w:uiPriority="61"/>
-    <w:lsdException w:name="Light Grid Accent 4" w:uiPriority="62"/>
-    <w:lsdException w:name="Medium Shading 1 Accent 4" w:uiPriority="63"/>
-    <w:lsdException w:name="Medium Shading 2 Accent 4" w:uiPriority="64"/>
-    <w:lsdException w:name="Medium List 1 Accent 4" w:uiPriority="65"/>
-    <w:lsdException w:name="Medium List 2 Accent 4" w:uiPriority="66"/>
-    <w:lsdException w:name="Medium Grid 1 Accent 4" w:uiPriority="67"/>
-    <w:lsdException w:name="Medium Grid 2 Accent 4" w:uiPriority="68"/>
-    <w:lsdException w:name="Medium Grid 3 Accent 4" w:uiPriority="69"/>
-    <w:lsdException w:name="Dark List Accent 4" w:uiPriority="70"/>
-    <w:lsdException w:name="Colorful Shading Accent 4" w:uiPriority="71"/>
-    <w:lsdException w:name="Colorful List Accent 4" w:uiPriority="72"/>
-    <w:lsdException w:name="Colorful Grid Accent 4" w:uiPriority="73"/>
-    <w:lsdException w:name="Light Shading Accent 5" w:uiPriority="60"/>
-    <w:lsdException w:name="Light List Accent 5" w:uiPriority="61"/>
-    <w:lsdException w:name="Light Grid Accent 5" w:uiPriority="62"/>
-    <w:lsdException w:name="Medium Shading 1 Accent 5" w:uiPriority="63"/>
-    <w:lsdException w:name="Medium Shading 2 Accent 5" w:uiPriority="64"/>
-    <w:lsdException w:name="Medium List 1 Accent 5" w:uiPriority="65"/>
-    <w:lsdException w:name="Medium List 2 Accent 5" w:uiPriority="66"/>
-    <w:lsdException w:name="Medium Grid 1 Accent 5" w:uiPriority="67"/>
-    <w:lsdException w:name="Medium Grid 2 Accent 5" w:uiPriority="68"/>
-    <w:lsdException w:name="Medium Grid 3 Accent 5" w:uiPriority="69"/>
-    <w:lsdException w:name="Dark List Accent 5" w:uiPriority="70"/>
-    <w:lsdException w:name="Colorful Shading Accent 5" w:uiPriority="71"/>
-    <w:lsdException w:name="Colorful List Accent 5" w:uiPriority="72"/>
-    <w:lsdException w:name="Colorful Grid Accent 5" w:uiPriority="73"/>
-    <w:lsdException w:name="Light Shading Accent 6" w:uiPriority="60"/>
-    <w:lsdException w:name="Light List Accent 6" w:uiPriority="61"/>
-    <w:lsdException w:name="Light Grid Accent 6" w:uiPriority="62"/>
-    <w:lsdException w:name="Medium Shading 1 Accent 6" w:uiPriority="63"/>
-    <w:lsdException w:name="Medium Shading 2 Accent 6" w:uiPriority="64"/>
-    <w:lsdException w:name="Medium List 1 Accent 6" w:uiPriority="65"/>
-    <w:lsdException w:name="Medium List 2 Accent 6" w:uiPriority="66"/>
-    <w:lsdException w:name="Medium Grid 1 Accent 6" w:uiPriority="67"/>
-    <w:lsdException w:name="Medium Grid 2 Accent 6" w:uiPriority="68"/>
-    <w:lsdException w:name="Medium Grid 3 Accent 6" w:uiPriority="69"/>
-    <w:lsdException w:name="Dark List Accent 6" w:uiPriority="70"/>
-    <w:lsdException w:name="Colorful Shading Accent 6" w:uiPriority="71"/>
-    <w:lsdException w:name="Colorful List Accent 6" w:uiPriority="72"/>
-    <w:lsdException w:name="Colorful Grid Accent 6" w:uiPriority="73"/>
-    <w:lsdException w:name="Subtle Emphasis" w:qFormat="1" w:uiPriority="19"/>
-    <w:lsdException w:name="Intense Emphasis" w:qFormat="1" w:uiPriority="21"/>
-    <w:lsdException w:name="Subtle Reference" w:qFormat="1" w:uiPriority="31"/>
-    <w:lsdException w:name="Intense Reference" w:qFormat="1" w:uiPriority="32"/>
-    <w:lsdException w:name="Book Title" w:qFormat="1" w:uiPriority="33"/>
-    <w:lsdException w:name="Bibliography" w:semiHidden="1" w:uiPriority="37" w:unhideWhenUsed="1"/>
-    <w:lsdException w:name="TOC Heading" w:qFormat="1" w:semiHidden="1" w:uiPriority="39" w:unhideWhenUsed="1"/>
-    <w:lsdException w:name="Plain Table 1" w:uiPriority="41"/>
-    <w:lsdException w:name="Plain Table 2" w:uiPriority="42"/>
-    <w:lsdException w:name="Plain Table 3" w:uiPriority="43"/>
-    <w:lsdException w:name="Plain Table 4" w:uiPriority="44"/>
-    <w:lsdException w:name="Plain Table 5" w:uiPriority="45"/>
-    <w:lsdException w:name="Grid Table Light" w:uiPriority="40"/>
-    <w:lsdException w:name="Grid Table 1 Light" w:uiPriority="46"/>
-    <w:lsdException w:name="Grid Table 2" w:uiPriority="47"/>
-    <w:lsdException w:name="Grid Table 3" w:uiPriority="48"/>
-    <w:lsdException w:name="Grid Table 4" w:uiPriority="49"/>
-    <w:lsdException w:name="Grid Table 5 Dark" w:uiPriority="50"/>
-    <w:lsdException w:name="Grid Table 6 Colorful" w:uiPriority="51"/>
-    <w:lsdException w:name="Grid Table 7 Colorful" w:uiPriority="52"/>
-    <w:lsdException w:name="Grid Table 1 Light Accent 1" w:uiPriority="46"/>
-    <w:lsdException w:name="Grid Table 2 Accent 1" w:uiPriority="47"/>
-    <w:lsdException w:name="Grid Table 3 Accent 1" w:uiPriority="48"/>
-    <w:lsdException w:name="Grid Table 4 Accent 1" w:uiPriority="49"/>
-    <w:lsdException w:name="Grid Table 5 Dark Accent 1" w:uiPriority="50"/>
-    <w:lsdException w:name="Grid Table 6 Colorful Accent 1" w:uiPriority="51"/>
-    <w:lsdException w:name="Grid Table 7 Colorful Accent 1" w:uiPriority="52"/>
-    <w:lsdException w:name="Grid Table 1 Light Accent 2" w:uiPriority="46"/>
-    <w:lsdException w:name="Grid Table 2 Accent 2" w:uiPriority="47"/>
-    <w:lsdException w:name="Grid Table 3 Accent 2" w:uiPriority="48"/>
-    <w:lsdException w:name="Grid Table 4 Accent 2" w:uiPriority="49"/>
-    <w:lsdException w:name="Grid Table 5 Dark Accent 2" w:uiPriority="50"/>
-    <w:lsdException w:name="Grid Table 6 Colorful Accent 2" w:uiPriority="51"/>
-    <w:lsdException w:name="Grid Table 7 Colorful Accent 2" w:uiPriority="52"/>
-    <w:lsdException w:name="Grid Table 1 Light Accent 3" w:uiPriority="46"/>
-    <w:lsdException w:name="Grid Table 2 Accent 3" w:uiPriority="47"/>
-    <w:lsdException w:name="Grid Table 3 Accent 3" w:uiPriority="48"/>
-    <w:lsdException w:name="Grid Table 4 Accent 3" w:uiPriority="49"/>
-    <w:lsdException w:name="Grid Table 5 Dark Accent 3" w:uiPriority="50"/>
-    <w:lsdException w:name="Grid Table 6 Colorful Accent 3" w:uiPriority="51"/>
-    <w:lsdException w:name="Grid Table 7 Colorful Accent 3" w:uiPriority="52"/>
-    <w:lsdException w:name="Grid Table 1 Light Accent 4" w:uiPriority="46"/>
-    <w:lsdException w:name="Grid Table 2 Accent 4" w:uiPriority="47"/>
-    <w:lsdException w:name="Grid Table 3 Accent 4" w:uiPriority="48"/>
-    <w:lsdException w:name="Grid Table 4 Accent 4" w:uiPriority="49"/>
-    <w:lsdException w:name="Grid Table 5 Dark Accent 4" w:uiPriority="50"/>
-    <w:lsdException w:name="Grid Table 6 Colorful Accent 4" w:uiPriority="51"/>
-    <w:lsdException w:name="Grid Table 7 Colorful Accent 4" w:uiPriority="52"/>
-    <w:lsdException w:name="Grid Table 1 Light Accent 5" w:uiPriority="46"/>
-    <w:lsdException w:name="Grid Table 2 Accent 5" w:uiPriority="47"/>
-    <w:lsdException w:name="Grid Table 3 Accent 5" w:uiPriority="48"/>
-    <w:lsdException w:name="Grid Table 4 Accent 5" w:uiPriority="49"/>
-    <w:lsdException w:name="Grid Table 5 Dark Accent 5" w:uiPriority="50"/>
-    <w:lsdException w:name="Grid Table 6 Colorful Accent 5" w:uiPriority="51"/>
-    <w:lsdException w:name="Grid Table 7 Colorful Accent 5" w:uiPriority="52"/>
-    <w:lsdException w:name="Grid Table 1 Light Accent 6" w:uiPriority="46"/>
-    <w:lsdException w:name="Grid Table 2 Accent 6" w:uiPriority="47"/>
-    <w:lsdException w:name="Grid Table 3 Accent 6" w:uiPriority="48"/>
-    <w:lsdException w:name="Grid Table 4 Accent 6" w:uiPriority="49"/>
-    <w:lsdException w:name="Grid Table 5 Dark Accent 6" w:uiPriority="50"/>
-    <w:lsdException w:name="Grid Table 6 Colorful Accent 6" w:uiPriority="51"/>
-    <w:lsdException w:name="Grid Table 7 Colorful Accent 6" w:uiPriority="52"/>
-    <w:lsdException w:name="List Table 1 Light" w:uiPriority="46"/>
-    <w:lsdException w:name="List Table 2" w:uiPriority="47"/>
-    <w:lsdException w:name="List Table 3" w:uiPriority="48"/>
-    <w:lsdException w:name="List Table 4" w:uiPriority="49"/>
-    <w:lsdException w:name="List Table 5 Dark" w:uiPriority="50"/>
-    <w:lsdException w:name="List Table 6 Colorful" w:uiPriority="51"/>
-    <w:lsdException w:name="List Table 7 Colorful" w:uiPriority="52"/>
-    <w:lsdException w:name="List Table 1 Light Accent 1" w:uiPriority="46"/>
-    <w:lsdException w:name="List Table 2 Accent 1" w:uiPriority="47"/>
-    <w:lsdException w:name="List Table 3 Accent 1" w:uiPriority="48"/>
-    <w:lsdException w:name="List Table 4 Accent 1" w:uiPriority="49"/>
-    <w:lsdException w:name="List Table 5 Dark Accent 1" w:uiPriority="50"/>
-    <w:lsdException w:name="List Table 6 Colorful Accent 1" w:uiPriority="51"/>
-    <w:lsdException w:name="List Table 7 Colorful Accent 1" w:uiPriority="52"/>
-    <w:lsdException w:name="List Table 1 Light Accent 2" w:uiPriority="46"/>
-    <w:lsdException w:name="List Table 2 Accent 2" w:uiPriority="47"/>
-    <w:lsdException w:name="List Table 3 Accent 2" w:uiPriority="48"/>
-    <w:lsdException w:name="List Table 4 Accent 2" w:uiPriority="49"/>
-    <w:lsdException w:name="List Table 5 Dark Accent 2" w:uiPriority="50"/>
-    <w:lsdException w:name="List Table 6 Colorful Accent 2" w:uiPriority="51"/>
-    <w:lsdException w:name="List Table 7 Colorful Accent 2" w:uiPriority="52"/>
-    <w:lsdException w:name="List Table 1 Light Accent 3" w:uiPriority="46"/>
-    <w:lsdException w:name="List Table 2 Accent 3" w:uiPriority="47"/>
-    <w:lsdException w:name="List Table 3 Accent 3" w:uiPriority="48"/>
-    <w:lsdException w:name="List Table 4 Accent 3" w:uiPriority="49"/>
-    <w:lsdException w:name="List Table 5 Dark Accent 3" w:uiPriority="50"/>
-    <w:lsdException w:name="List Table 6 Colorful Accent 3" w:uiPriority="51"/>
-    <w:lsdException w:name="List Table 7 Colorful Accent 3" w:uiPriority="52"/>
-    <w:lsdException w:name="List Table 1 Light Accent 4" w:uiPriority="46"/>
-    <w:lsdException w:name="List Table 2 Accent 4" w:uiPriority="47"/>
-    <w:lsdException w:name="List Table 3 Accent 4" w:uiPriority="48"/>
-    <w:lsdException w:name="List Table 4 Accent 4" w:uiPriority="49"/>
-    <w:lsdException w:name="List Table 5 Dark Accent 4" w:uiPriority="50"/>
-    <w:lsdException w:name="List Table 6 Colorful Accent 4" w:uiPriority="51"/>
-    <w:lsdException w:name="List Table 7 Colorful Accent 4" w:uiPriority="52"/>
-    <w:lsdException w:name="List Table 1 Light Accent 5" w:uiPriority="46"/>
-    <w:lsdException w:name="List Table 2 Accent 5" w:uiPriority="47"/>
-    <w:lsdException w:name="List Table 3 Accent 5" w:uiPriority="48"/>
-    <w:lsdException w:name="List Table 4 Accent 5" w:uiPriority="49"/>
-    <w:lsdException w:name="List Table 5 Dark Accent 5" w:uiPriority="50"/>
-    <w:lsdException w:name="List Table 6 Colorful Accent 5" w:uiPriority="51"/>
-    <w:lsdException w:name="List Table 7 Colorful Accent 5" w:uiPriority="52"/>
-    <w:lsdException w:name="List Table 1 Light Accent 6" w:uiPriority="46"/>
-    <w:lsdException w:name="List Table 2 Accent 6" w:uiPriority="47"/>
-    <w:lsdException w:name="List Table 3 Accent 6" w:uiPriority="48"/>
-    <w:lsdException w:name="List Table 4 Accent 6" w:uiPriority="49"/>
-    <w:lsdException w:name="List Table 5 Dark Accent 6" w:uiPriority="50"/>
-    <w:lsdException w:name="List Table 6 Colorful Accent 6" w:uiPriority="51"/>
-    <w:lsdException w:name="List Table 7 Colorful Accent 6" w:uiPriority="52"/>
-  </w:latentStyles>
+  <w:latentStyles w:count="276" w:defLockedState="0" w:defQFormat="0" w:defSemiHidden="0" w:defUIPriority="0" w:defUnhideWhenUsed="0"/>
   <w:style w:default="1" w:styleId="Normal" w:type="paragraph">
     <w:name w:val="Normal"/>
     <w:qFormat/>
-    <w:rsid w:val="001C6832"/>
-  </w:style>
-  <w:style w:default="1" w:styleId="Policepardfaut" w:type="character">
-    <w:name w:val="Default Paragraph Font"/>
-    <w:uiPriority w:val="1"/>
+  </w:style>
+  <w:style w:styleId="BodyText" w:type="paragraph">
+    <w:name w:val="Body Text"/>
+    <w:basedOn w:val="Normal"/>
+    <w:link w:val="BodyTextChar"/>
+    <w:qFormat/>
+    <w:pPr>
+      <w:spacing w:after="180" w:before="180"/>
+    </w:pPr>
+  </w:style>
+  <w:style w:customStyle="1" w:styleId="FirstParagraph" w:type="paragraph">
+    <w:name w:val="First Paragraph"/>
+    <w:basedOn w:val="BodyText"/>
+    <w:next w:val="BodyText"/>
+    <w:qFormat/>
+  </w:style>
+  <w:style w:customStyle="1" w:styleId="Compact" w:type="paragraph">
+    <w:name w:val="Compact"/>
+    <w:basedOn w:val="BodyText"/>
+    <w:qFormat/>
+    <w:pPr>
+      <w:spacing w:after="36" w:before="36"/>
+    </w:pPr>
+  </w:style>
+  <w:style w:styleId="Title" w:type="paragraph">
+    <w:name w:val="Title"/>
+    <w:basedOn w:val="Normal"/>
+    <w:next w:val="BodyText"/>
+    <w:link w:val="TitleChar"/>
+    <w:uiPriority w:val="10"/>
+    <w:qFormat/>
+    <w:rsid w:val="00A10FD9"/>
+    <w:pPr>
+      <w:spacing w:after="80" w:line="240" w:lineRule="auto"/>
+      <w:contextualSpacing/>
+      <w:jc w:val="center"/>
+    </w:pPr>
+    <w:rPr>
+      <w:rFonts w:asciiTheme="majorHAnsi" w:cstheme="majorBidi" w:eastAsiaTheme="majorEastAsia" w:hAnsiTheme="majorHAnsi"/>
+      <w:sz w:val="56"/>
+      <w:szCs w:val="56"/>
+    </w:rPr>
+  </w:style>
+  <w:style w:customStyle="1" w:styleId="TitleChar" w:type="character">
+    <w:name w:val="Title Char"/>
+    <w:basedOn w:val="DefaultParagraphFont"/>
+    <w:link w:val="Title"/>
+    <w:uiPriority w:val="10"/>
+    <w:rsid w:val="00A10FD9"/>
+    <w:rPr>
+      <w:rFonts w:asciiTheme="majorHAnsi" w:cstheme="majorBidi" w:eastAsiaTheme="majorEastAsia" w:hAnsiTheme="majorHAnsi"/>
+      <w:sz w:val="56"/>
+      <w:szCs w:val="56"/>
+    </w:rPr>
+  </w:style>
+  <w:style w:styleId="Subtitle" w:type="paragraph">
+    <w:name w:val="Subtitle"/>
+    <w:basedOn w:val="Title"/>
+    <w:next w:val="BodyText"/>
+    <w:link w:val="SubtitleChar"/>
+    <w:uiPriority w:val="11"/>
+    <w:qFormat/>
+    <w:rsid w:val="00A10FD9"/>
+    <w:pPr>
+      <w:numPr>
+        <w:ilvl w:val="1"/>
+      </w:numPr>
+    </w:pPr>
+    <w:rPr>
+      <w:rFonts w:cstheme="majorBidi" w:eastAsiaTheme="majorEastAsia"/>
+      <w:spacing w:val="15"/>
+      <w:sz w:val="28"/>
+      <w:szCs w:val="28"/>
+    </w:rPr>
+  </w:style>
+  <w:style w:customStyle="1" w:styleId="SubtitleChar" w:type="character">
+    <w:name w:val="Subtitle Char"/>
+    <w:basedOn w:val="DefaultParagraphFont"/>
+    <w:link w:val="Subtitle"/>
+    <w:uiPriority w:val="11"/>
+    <w:rsid w:val="00A10FD9"/>
+    <w:rPr>
+      <w:rFonts w:cstheme="majorBidi" w:eastAsiaTheme="majorEastAsia"/>
+      <w:color w:themeColor="text1" w:themeTint="A6" w:val="595959"/>
+      <w:spacing w:val="15"/>
+      <w:sz w:val="28"/>
+      <w:szCs w:val="28"/>
+    </w:rPr>
+  </w:style>
+  <w:style w:customStyle="1" w:styleId="Author" w:type="paragraph">
+    <w:name w:val="Author"/>
+    <w:basedOn w:val="Title"/>
+    <w:next w:val="BodyText"/>
+    <w:qFormat/>
+    <w:pPr>
+      <w:keepNext/>
+      <w:keepLines/>
+    </w:pPr>
+    <w:rPr>
+      <w:sz w:val="24"/>
+      <w:szCs w:val="24"/>
+    </w:rPr>
+  </w:style>
+  <w:style w:styleId="Date" w:type="paragraph">
+    <w:name w:val="Date"/>
+    <w:basedOn w:val="Title"/>
+    <w:next w:val="BodyText"/>
+    <w:qFormat/>
+    <w:pPr>
+      <w:keepNext/>
+      <w:keepLines/>
+    </w:pPr>
+    <w:rPr>
+      <w:sz w:val="24"/>
+      <w:szCs w:val="24"/>
+    </w:rPr>
+  </w:style>
+  <w:style w:customStyle="1" w:styleId="AbstractTitle" w:type="paragraph">
+    <w:name w:val="Abstract Title"/>
+    <w:basedOn w:val="Normal"/>
+    <w:next w:val="Abstract"/>
+    <w:qFormat/>
+    <w:pPr>
+      <w:keepNext/>
+      <w:keepLines/>
+      <w:spacing w:after="0" w:before="300"/>
+      <w:jc w:val="center"/>
+    </w:pPr>
+    <w:rPr>
+      <w:b/>
+      <w:sz w:val="20"/>
+      <w:szCs w:val="20"/>
+    </w:rPr>
+  </w:style>
+  <w:style w:customStyle="1" w:styleId="Abstract" w:type="paragraph">
+    <w:name w:val="Abstract"/>
+    <w:basedOn w:val="Normal"/>
+    <w:next w:val="BodyText"/>
+    <w:qFormat/>
+    <w:pPr>
+      <w:keepNext/>
+      <w:keepLines/>
+      <w:spacing w:after="300" w:before="100"/>
+    </w:pPr>
+    <w:rPr>
+      <w:sz w:val="20"/>
+      <w:szCs w:val="20"/>
+    </w:rPr>
+  </w:style>
+  <w:style w:styleId="Bibliography" w:type="paragraph">
+    <w:name w:val="Bibliography"/>
+    <w:basedOn w:val="Normal"/>
+    <w:next w:val="Bibliography"/>
+    <w:qFormat/>
+    <w:pPr/>
+    <w:rPr/>
+  </w:style>
+  <w:style w:styleId="Heading1" w:type="paragraph">
+    <w:name w:val="heading 1"/>
+    <w:basedOn w:val="Normal"/>
+    <w:next w:val="BodyText"/>
+    <w:link w:val="Heading1Char"/>
+    <w:uiPriority w:val="9"/>
+    <w:qFormat/>
+    <w:rsid w:val="00A10FD9"/>
+    <w:pPr>
+      <w:keepNext/>
+      <w:keepLines/>
+      <w:spacing w:after="80" w:before="360"/>
+      <w:outlineLvl w:val="0"/>
+    </w:pPr>
+    <w:rPr>
+      <w:rFonts w:asciiTheme="majorHAnsi" w:cstheme="majorBidi" w:eastAsiaTheme="majorEastAsia" w:hAnsiTheme="majorHAnsi"/>
+      <w:color w:themeColor="accent1" w:themeShade="BF" w:val="0F4761"/>
+      <w:sz w:val="40"/>
+      <w:szCs w:val="40"/>
+    </w:rPr>
+  </w:style>
+  <w:style w:styleId="Heading2" w:type="paragraph">
+    <w:name w:val="heading 2"/>
+    <w:basedOn w:val="Normal"/>
+    <w:next w:val="BodyText"/>
+    <w:link w:val="Heading2Char"/>
+    <w:uiPriority w:val="9"/>
     <w:semiHidden/>
     <w:unhideWhenUsed/>
-  </w:style>
-  <w:style w:default="1" w:styleId="TableauNormal" w:type="table">
-    <w:name w:val="Normal Table"/>
-    <w:uiPriority w:val="99"/>
+    <w:qFormat/>
+    <w:rsid w:val="00A10FD9"/>
+    <w:pPr>
+      <w:keepNext/>
+      <w:keepLines/>
+      <w:spacing w:after="80" w:before="160"/>
+      <w:outlineLvl w:val="1"/>
+    </w:pPr>
+    <w:rPr>
+      <w:rFonts w:asciiTheme="majorHAnsi" w:cstheme="majorBidi" w:eastAsiaTheme="majorEastAsia" w:hAnsiTheme="majorHAnsi"/>
+      <w:color w:themeColor="accent1" w:themeShade="BF" w:val="0F4761"/>
+      <w:sz w:val="32"/>
+      <w:szCs w:val="32"/>
+    </w:rPr>
+  </w:style>
+  <w:style w:styleId="Heading3" w:type="paragraph">
+    <w:name w:val="heading 3"/>
+    <w:basedOn w:val="Normal"/>
+    <w:next w:val="BodyText"/>
+    <w:link w:val="Heading3Char"/>
+    <w:uiPriority w:val="9"/>
     <w:semiHidden/>
     <w:unhideWhenUsed/>
+    <w:qFormat/>
+    <w:rsid w:val="00A10FD9"/>
+    <w:pPr>
+      <w:keepNext/>
+      <w:keepLines/>
+      <w:spacing w:after="80" w:before="160"/>
+      <w:outlineLvl w:val="2"/>
+    </w:pPr>
+    <w:rPr>
+      <w:rFonts w:cstheme="majorBidi" w:eastAsiaTheme="majorEastAsia"/>
+      <w:color w:themeColor="accent1" w:themeShade="BF" w:val="0F4761"/>
+      <w:sz w:val="28"/>
+      <w:szCs w:val="28"/>
+    </w:rPr>
+  </w:style>
+  <w:style w:styleId="Heading4" w:type="paragraph">
+    <w:name w:val="heading 4"/>
+    <w:basedOn w:val="Normal"/>
+    <w:next w:val="BodyText"/>
+    <w:link w:val="Heading4Char"/>
+    <w:uiPriority w:val="9"/>
+    <w:semiHidden/>
+    <w:unhideWhenUsed/>
+    <w:qFormat/>
+    <w:rsid w:val="00A10FD9"/>
+    <w:pPr>
+      <w:keepNext/>
+      <w:keepLines/>
+      <w:spacing w:after="40" w:before="80"/>
+      <w:outlineLvl w:val="3"/>
+    </w:pPr>
+    <w:rPr>
+      <w:rFonts w:cstheme="majorBidi" w:eastAsiaTheme="majorEastAsia"/>
+      <w:i/>
+      <w:iCs/>
+      <w:color w:themeColor="accent1" w:themeShade="BF" w:val="0F4761"/>
+    </w:rPr>
+  </w:style>
+  <w:style w:styleId="Heading5" w:type="paragraph">
+    <w:name w:val="heading 5"/>
+    <w:basedOn w:val="Normal"/>
+    <w:next w:val="BodyText"/>
+    <w:link w:val="Heading5Char"/>
+    <w:uiPriority w:val="9"/>
+    <w:semiHidden/>
+    <w:unhideWhenUsed/>
+    <w:qFormat/>
+    <w:rsid w:val="00A10FD9"/>
+    <w:pPr>
+      <w:keepNext/>
+      <w:keepLines/>
+      <w:spacing w:after="40" w:before="80"/>
+      <w:outlineLvl w:val="4"/>
+    </w:pPr>
+    <w:rPr>
+      <w:rFonts w:cstheme="majorBidi" w:eastAsiaTheme="majorEastAsia"/>
+      <w:color w:themeColor="accent1" w:themeShade="BF" w:val="0F4761"/>
+    </w:rPr>
+  </w:style>
+  <w:style w:styleId="Heading6" w:type="paragraph">
+    <w:name w:val="heading 6"/>
+    <w:basedOn w:val="Normal"/>
+    <w:next w:val="BodyText"/>
+    <w:link w:val="Heading6Char"/>
+    <w:uiPriority w:val="9"/>
+    <w:semiHidden/>
+    <w:unhideWhenUsed/>
+    <w:qFormat/>
+    <w:rsid w:val="00A10FD9"/>
+    <w:pPr>
+      <w:keepNext/>
+      <w:keepLines/>
+      <w:spacing w:after="0" w:before="40"/>
+      <w:outlineLvl w:val="5"/>
+    </w:pPr>
+    <w:rPr>
+      <w:rFonts w:cstheme="majorBidi" w:eastAsiaTheme="majorEastAsia"/>
+      <w:i/>
+      <w:iCs/>
+      <w:color w:themeColor="text1" w:themeTint="A6" w:val="595959"/>
+    </w:rPr>
+  </w:style>
+  <w:style w:styleId="Heading7" w:type="paragraph">
+    <w:name w:val="heading 7"/>
+    <w:basedOn w:val="Normal"/>
+    <w:next w:val="BodyText"/>
+    <w:link w:val="Heading7Char"/>
+    <w:uiPriority w:val="9"/>
+    <w:semiHidden/>
+    <w:unhideWhenUsed/>
+    <w:qFormat/>
+    <w:rsid w:val="00A10FD9"/>
+    <w:pPr>
+      <w:keepNext/>
+      <w:keepLines/>
+      <w:spacing w:after="0" w:before="40"/>
+      <w:outlineLvl w:val="6"/>
+    </w:pPr>
+    <w:rPr>
+      <w:rFonts w:cstheme="majorBidi" w:eastAsiaTheme="majorEastAsia"/>
+      <w:color w:themeColor="text1" w:themeTint="A6" w:val="595959"/>
+    </w:rPr>
+  </w:style>
+  <w:style w:styleId="Heading8" w:type="paragraph">
+    <w:name w:val="heading 8"/>
+    <w:basedOn w:val="Normal"/>
+    <w:next w:val="BodyText"/>
+    <w:link w:val="Heading8Char"/>
+    <w:uiPriority w:val="9"/>
+    <w:semiHidden/>
+    <w:unhideWhenUsed/>
+    <w:qFormat/>
+    <w:rsid w:val="00A10FD9"/>
+    <w:pPr>
+      <w:keepNext/>
+      <w:keepLines/>
+      <w:spacing w:after="0"/>
+      <w:outlineLvl w:val="7"/>
+    </w:pPr>
+    <w:rPr>
+      <w:rFonts w:cstheme="majorBidi" w:eastAsiaTheme="majorEastAsia"/>
+      <w:i/>
+      <w:iCs/>
+      <w:color w:themeColor="text1" w:themeTint="D8" w:val="272727"/>
+    </w:rPr>
+  </w:style>
+  <w:style w:styleId="Heading9" w:type="paragraph">
+    <w:name w:val="heading 9"/>
+    <w:basedOn w:val="Normal"/>
+    <w:next w:val="BodyText"/>
+    <w:link w:val="Heading9Char"/>
+    <w:uiPriority w:val="9"/>
+    <w:semiHidden/>
+    <w:unhideWhenUsed/>
+    <w:qFormat/>
+    <w:rsid w:val="00A10FD9"/>
+    <w:pPr>
+      <w:keepNext/>
+      <w:keepLines/>
+      <w:spacing w:after="0"/>
+      <w:outlineLvl w:val="8"/>
+    </w:pPr>
+    <w:rPr>
+      <w:rFonts w:cstheme="majorBidi" w:eastAsiaTheme="majorEastAsia"/>
+      <w:color w:themeColor="text1" w:themeTint="D8" w:val="272727"/>
+    </w:rPr>
+  </w:style>
+  <w:style w:customStyle="1" w:styleId="Heading1Char" w:type="character">
+    <w:name w:val="Heading 1 Char"/>
+    <w:basedOn w:val="DefaultParagraphFont"/>
+    <w:link w:val="Heading1"/>
+    <w:uiPriority w:val="9"/>
+    <w:rsid w:val="00A10FD9"/>
+    <w:rPr>
+      <w:rFonts w:asciiTheme="majorHAnsi" w:cstheme="majorBidi" w:eastAsiaTheme="majorEastAsia" w:hAnsiTheme="majorHAnsi"/>
+      <w:color w:themeColor="accent1" w:themeShade="BF" w:val="0F4761"/>
+      <w:sz w:val="40"/>
+      <w:szCs w:val="40"/>
+    </w:rPr>
+  </w:style>
+  <w:style w:customStyle="1" w:styleId="Heading2Char" w:type="character">
+    <w:name w:val="Heading 2 Char"/>
+    <w:basedOn w:val="DefaultParagraphFont"/>
+    <w:link w:val="Heading2"/>
+    <w:uiPriority w:val="9"/>
+    <w:semiHidden/>
+    <w:rsid w:val="00A10FD9"/>
+    <w:rPr>
+      <w:rFonts w:asciiTheme="majorHAnsi" w:cstheme="majorBidi" w:eastAsiaTheme="majorEastAsia" w:hAnsiTheme="majorHAnsi"/>
+      <w:color w:themeColor="accent1" w:themeShade="BF" w:val="0F4761"/>
+      <w:sz w:val="32"/>
+      <w:szCs w:val="32"/>
+    </w:rPr>
+  </w:style>
+  <w:style w:customStyle="1" w:styleId="Heading3Char" w:type="character">
+    <w:name w:val="Heading 3 Char"/>
+    <w:basedOn w:val="DefaultParagraphFont"/>
+    <w:link w:val="Heading3"/>
+    <w:uiPriority w:val="9"/>
+    <w:semiHidden/>
+    <w:rsid w:val="00A10FD9"/>
+    <w:rPr>
+      <w:rFonts w:cstheme="majorBidi" w:eastAsiaTheme="majorEastAsia"/>
+      <w:color w:themeColor="accent1" w:themeShade="BF" w:val="0F4761"/>
+      <w:sz w:val="28"/>
+      <w:szCs w:val="28"/>
+    </w:rPr>
+  </w:style>
+  <w:style w:customStyle="1" w:styleId="Heading4Char" w:type="character">
+    <w:name w:val="Heading 4 Char"/>
+    <w:basedOn w:val="DefaultParagraphFont"/>
+    <w:link w:val="Heading4"/>
+    <w:uiPriority w:val="9"/>
+    <w:semiHidden/>
+    <w:rsid w:val="00A10FD9"/>
+    <w:rPr>
+      <w:rFonts w:cstheme="majorBidi" w:eastAsiaTheme="majorEastAsia"/>
+      <w:i/>
+      <w:iCs/>
+      <w:color w:themeColor="accent1" w:themeShade="BF" w:val="0F4761"/>
+    </w:rPr>
+  </w:style>
+  <w:style w:customStyle="1" w:styleId="Heading5Char" w:type="character">
+    <w:name w:val="Heading 5 Char"/>
+    <w:basedOn w:val="DefaultParagraphFont"/>
+    <w:link w:val="Heading5"/>
+    <w:uiPriority w:val="9"/>
+    <w:semiHidden/>
+    <w:rsid w:val="00A10FD9"/>
+    <w:rPr>
+      <w:rFonts w:cstheme="majorBidi" w:eastAsiaTheme="majorEastAsia"/>
+      <w:color w:themeColor="accent1" w:themeShade="BF" w:val="0F4761"/>
+    </w:rPr>
+  </w:style>
+  <w:style w:customStyle="1" w:styleId="Heading6Char" w:type="character">
+    <w:name w:val="Heading 6 Char"/>
+    <w:basedOn w:val="DefaultParagraphFont"/>
+    <w:link w:val="Heading6"/>
+    <w:uiPriority w:val="9"/>
+    <w:semiHidden/>
+    <w:rsid w:val="00A10FD9"/>
+    <w:rPr>
+      <w:rFonts w:cstheme="majorBidi" w:eastAsiaTheme="majorEastAsia"/>
+      <w:i/>
+      <w:iCs/>
+      <w:color w:themeColor="text1" w:themeTint="A6" w:val="595959"/>
+    </w:rPr>
+  </w:style>
+  <w:style w:customStyle="1" w:styleId="Heading7Char" w:type="character">
+    <w:name w:val="Heading 7 Char"/>
+    <w:basedOn w:val="DefaultParagraphFont"/>
+    <w:link w:val="Heading7"/>
+    <w:uiPriority w:val="9"/>
+    <w:semiHidden/>
+    <w:rsid w:val="00A10FD9"/>
+    <w:rPr>
+      <w:rFonts w:cstheme="majorBidi" w:eastAsiaTheme="majorEastAsia"/>
+      <w:color w:themeColor="text1" w:themeTint="A6" w:val="595959"/>
+    </w:rPr>
+  </w:style>
+  <w:style w:customStyle="1" w:styleId="Heading8Char" w:type="character">
+    <w:name w:val="Heading 8 Char"/>
+    <w:basedOn w:val="DefaultParagraphFont"/>
+    <w:link w:val="Heading8"/>
+    <w:uiPriority w:val="9"/>
+    <w:semiHidden/>
+    <w:rsid w:val="00A10FD9"/>
+    <w:rPr>
+      <w:rFonts w:cstheme="majorBidi" w:eastAsiaTheme="majorEastAsia"/>
+      <w:i/>
+      <w:iCs/>
+      <w:color w:themeColor="text1" w:themeTint="D8" w:val="272727"/>
+    </w:rPr>
+  </w:style>
+  <w:style w:customStyle="1" w:styleId="Heading9Char" w:type="character">
+    <w:name w:val="Heading 9 Char"/>
+    <w:basedOn w:val="DefaultParagraphFont"/>
+    <w:link w:val="Heading9"/>
+    <w:uiPriority w:val="9"/>
+    <w:semiHidden/>
+    <w:rsid w:val="00A10FD9"/>
+    <w:rPr>
+      <w:rFonts w:cstheme="majorBidi" w:eastAsiaTheme="majorEastAsia"/>
+      <w:color w:themeColor="text1" w:themeTint="D8" w:val="272727"/>
+    </w:rPr>
+  </w:style>
+  <w:style w:styleId="BlockText" w:type="paragraph">
+    <w:name w:val="Block Text"/>
+    <w:basedOn w:val="BodyText"/>
+    <w:next w:val="BodyText"/>
+    <w:uiPriority w:val="9"/>
+    <w:unhideWhenUsed/>
+    <w:qFormat/>
+    <w:pPr>
+      <w:spacing w:after="100" w:before="100"/>
+      <w:ind w:firstLine="0" w:left="480" w:right="480"/>
+    </w:pPr>
+  </w:style>
+  <w:style w:styleId="FootnoteText" w:type="paragraph">
+    <w:name w:val="Footnote Text"/>
+    <w:basedOn w:val="Normal"/>
+    <w:next w:val="FootnoteText"/>
+    <w:uiPriority w:val="9"/>
+    <w:unhideWhenUsed/>
+    <w:qFormat/>
+  </w:style>
+  <w:style w:styleId="FootnoteBlockText" w:type="paragraph">
+    <w:name w:val="Footnote Block Text"/>
+    <w:basedOn w:val="FootnoteText"/>
+    <w:next w:val="FootnoteText"/>
+    <w:uiPriority w:val="9"/>
+    <w:unhideWhenUsed/>
+    <w:qFormat/>
+    <w:pPr>
+      <w:spacing w:after="100" w:before="100"/>
+      <w:ind w:firstLine="0" w:left="480" w:right="480"/>
+    </w:pPr>
+  </w:style>
+  <w:style w:default="1" w:styleId="DefaultParagraphFont" w:type="character">
+    <w:name w:val="Default Paragraph Font"/>
+    <w:semiHidden/>
+    <w:unhideWhenUsed/>
+  </w:style>
+  <w:style w:default="1" w:styleId="Table" w:type="table">
+    <w:name w:val="Table"/>
+    <w:basedOn w:val="TableNormal"/>
+    <w:semiHidden/>
+    <w:unhideWhenUsed/>
+    <w:qFormat/>
     <w:tblPr>
       <w:tblInd w:type="dxa" w:w="0"/>
       <w:tblCellMar>
@@ -4768,67 +4441,113 @@
         <w:right w:type="dxa" w:w="108"/>
       </w:tblCellMar>
     </w:tblPr>
-  </w:style>
-  <w:style w:default="1" w:styleId="Aucuneliste" w:type="numbering">
-    <w:name w:val="No List"/>
-    <w:uiPriority w:val="99"/>
-    <w:semiHidden/>
+    <w:tblStylePr w:type="firstRow">
+      <w:tcPr>
+        <w:tcBorders>
+          <w:bottom w:val="single"/>
+        </w:tcBorders>
+        <w:vAlign w:val="bottom"/>
+      </w:tcPr>
+    </w:tblStylePr>
+  </w:style>
+  <w:style w:customStyle="1" w:styleId="DefinitionTerm" w:type="paragraph">
+    <w:name w:val="Definition Term"/>
+    <w:basedOn w:val="Normal"/>
+    <w:next w:val="Definition"/>
+    <w:pPr>
+      <w:keepNext/>
+      <w:keepLines/>
+      <w:spacing w:after="0"/>
+    </w:pPr>
+    <w:rPr>
+      <w:b/>
+    </w:rPr>
+  </w:style>
+  <w:style w:customStyle="1" w:styleId="Definition" w:type="paragraph">
+    <w:name w:val="Definition"/>
+    <w:basedOn w:val="Normal"/>
+  </w:style>
+  <w:style w:styleId="Caption" w:type="paragraph">
+    <w:name w:val="Caption"/>
+    <w:basedOn w:val="Normal"/>
+    <w:link w:val="BodyTextChar"/>
+    <w:pPr>
+      <w:spacing w:after="120" w:before="0"/>
+    </w:pPr>
+    <w:rPr>
+      <w:i/>
+    </w:rPr>
+  </w:style>
+  <w:style w:customStyle="1" w:styleId="TableCaption" w:type="paragraph">
+    <w:name w:val="Table Caption"/>
+    <w:basedOn w:val="Caption"/>
+    <w:pPr>
+      <w:keepNext/>
+    </w:pPr>
+  </w:style>
+  <w:style w:customStyle="1" w:styleId="ImageCaption" w:type="paragraph">
+    <w:name w:val="Image Caption"/>
+    <w:basedOn w:val="Caption"/>
+  </w:style>
+  <w:style w:customStyle="1" w:styleId="Figure" w:type="paragraph">
+    <w:name w:val="Figure"/>
+    <w:basedOn w:val="Normal"/>
+  </w:style>
+  <w:style w:customStyle="1" w:styleId="CaptionedFigure" w:type="paragraph">
+    <w:name w:val="Captioned Figure"/>
+    <w:basedOn w:val="Figure"/>
+    <w:pPr>
+      <w:keepNext/>
+    </w:pPr>
+  </w:style>
+  <w:style w:customStyle="1" w:styleId="BodyTextChar" w:type="character">
+    <w:name w:val="Body Text Char"/>
+    <w:basedOn w:val="DefaultParagraphFont"/>
+    <w:link w:val="BodyText"/>
+  </w:style>
+  <w:style w:customStyle="1" w:styleId="VerbatimChar" w:type="character">
+    <w:name w:val="Verbatim Char"/>
+    <w:basedOn w:val="BodyTextChar"/>
+    <w:rPr>
+      <w:rFonts w:ascii="Consolas" w:hAnsi="Consolas"/>
+      <w:sz w:val="22"/>
+    </w:rPr>
+  </w:style>
+  <w:style w:customStyle="1" w:styleId="SectionNumber" w:type="character">
+    <w:name w:val="Section Number"/>
+    <w:basedOn w:val="BodyTextChar"/>
+  </w:style>
+  <w:style w:styleId="FootnoteReference" w:type="character">
+    <w:name w:val="Footnote Reference"/>
+    <w:basedOn w:val="BodyTextChar"/>
+    <w:rPr>
+      <w:vertAlign w:val="superscript"/>
+    </w:rPr>
+  </w:style>
+  <w:style w:styleId="Hyperlink" w:type="character">
+    <w:name w:val="Hyperlink"/>
+    <w:basedOn w:val="BodyTextChar"/>
+    <w:rPr>
+      <w:color w:themeColor="accent1" w:val="4F81BD"/>
+    </w:rPr>
+  </w:style>
+  <w:style w:styleId="TOCHeading" w:type="paragraph">
+    <w:name w:val="TOC Heading"/>
+    <w:basedOn w:val="Heading1"/>
+    <w:next w:val="BodyText"/>
+    <w:uiPriority w:val="39"/>
     <w:unhideWhenUsed/>
-  </w:style>
-  <w:style w:styleId="En-tte" w:type="paragraph">
-    <w:name w:val="header"/>
-    <w:basedOn w:val="Normal"/>
-    <w:link w:val="En-tteCar"/>
-    <w:uiPriority w:val="99"/>
-    <w:unhideWhenUsed/>
-    <w:rsid w:val="005405C5"/>
+    <w:qFormat/>
     <w:pPr>
-      <w:tabs>
-        <w:tab w:pos="4536" w:val="center"/>
-        <w:tab w:pos="9072" w:val="right"/>
-      </w:tabs>
-      <w:spacing w:after="0" w:line="240" w:lineRule="auto"/>
+      <w:spacing w:before="240" w:line="259" w:lineRule="auto"/>
+      <w:outlineLvl w:val="9"/>
     </w:pPr>
-  </w:style>
-  <w:style w:customStyle="1" w:styleId="En-tteCar" w:type="character">
-    <w:name w:val="En-tête Car"/>
-    <w:basedOn w:val="Policepardfaut"/>
-    <w:link w:val="En-tte"/>
-    <w:uiPriority w:val="99"/>
-    <w:rsid w:val="005405C5"/>
-  </w:style>
-  <w:style w:styleId="Pieddepage" w:type="paragraph">
-    <w:name w:val="footer"/>
-    <w:basedOn w:val="Normal"/>
-    <w:link w:val="PieddepageCar"/>
-    <w:uiPriority w:val="99"/>
-    <w:unhideWhenUsed/>
-    <w:rsid w:val="005405C5"/>
-    <w:pPr>
-      <w:tabs>
-        <w:tab w:pos="4536" w:val="center"/>
-        <w:tab w:pos="9072" w:val="right"/>
-      </w:tabs>
-      <w:spacing w:after="0" w:line="240" w:lineRule="auto"/>
-    </w:pPr>
-  </w:style>
-  <w:style w:customStyle="1" w:styleId="PieddepageCar" w:type="character">
-    <w:name w:val="Pied de page Car"/>
-    <w:basedOn w:val="Policepardfaut"/>
-    <w:link w:val="Pieddepage"/>
-    <w:uiPriority w:val="99"/>
-    <w:rsid w:val="005405C5"/>
-  </w:style>
-  <w:style w:styleId="Paragraphedeliste" w:type="paragraph">
-    <w:name w:val="List Paragraph"/>
-    <w:basedOn w:val="Normal"/>
-    <w:uiPriority w:val="34"/>
-    <w:qFormat/>
-    <w:rsid w:val="0090180A"/>
-    <w:pPr>
-      <w:ind w:left="720"/>
-      <w:contextualSpacing/>
-    </w:pPr>
+    <w:rPr>
+      <w:rFonts w:asciiTheme="majorHAnsi" w:cstheme="majorBidi" w:eastAsiaTheme="majorEastAsia" w:hAnsiTheme="majorHAnsi"/>
+      <w:b w:val="0"/>
+      <w:bCs w:val="0"/>
+      <w:color w:themeColor="accent1" w:themeShade="BF" w:val="365F91"/>
+    </w:rPr>
   </w:style>
   <w:style w:type="paragraph" w:customStyle="1" w:styleId="SourceCode">
     <w:name w:val="Source Code"/>
@@ -5068,7 +4787,7 @@
 </file>
 
 <file path=word/theme/theme1.xml><?xml version="1.0" encoding="utf-8"?>
-<a:theme xmlns:a="http://schemas.openxmlformats.org/drawingml/2006/main" name="Thème Office">
+<a:theme xmlns:a="http://schemas.openxmlformats.org/drawingml/2006/main" name="Office Theme">
   <a:themeElements>
     <a:clrScheme name="Office">
       <a:dk1>
@@ -5078,39 +4797,39 @@
         <a:sysClr val="window" lastClr="FFFFFF"/>
       </a:lt1>
       <a:dk2>
-        <a:srgbClr val="44546A"/>
+        <a:srgbClr val="0E2841"/>
       </a:dk2>
       <a:lt2>
-        <a:srgbClr val="E7E6E6"/>
+        <a:srgbClr val="E8E8E8"/>
       </a:lt2>
       <a:accent1>
-        <a:srgbClr val="5B9BD5"/>
+        <a:srgbClr val="156082"/>
       </a:accent1>
       <a:accent2>
-        <a:srgbClr val="ED7D31"/>
+        <a:srgbClr val="E97132"/>
       </a:accent2>
       <a:accent3>
-        <a:srgbClr val="A5A5A5"/>
+        <a:srgbClr val="196B24"/>
       </a:accent3>
       <a:accent4>
-        <a:srgbClr val="FFC000"/>
+        <a:srgbClr val="0F9ED5"/>
       </a:accent4>
       <a:accent5>
-        <a:srgbClr val="4472C4"/>
+        <a:srgbClr val="A02B93"/>
       </a:accent5>
       <a:accent6>
-        <a:srgbClr val="70AD47"/>
+        <a:srgbClr val="4EA72E"/>
       </a:accent6>
       <a:hlink>
-        <a:srgbClr val="0563C1"/>
+        <a:srgbClr val="467886"/>
       </a:hlink>
       <a:folHlink>
-        <a:srgbClr val="954F72"/>
+        <a:srgbClr val="96607D"/>
       </a:folHlink>
     </a:clrScheme>
     <a:fontScheme name="Office">
       <a:majorFont>
-        <a:latin typeface="Calibri Light" panose="020F0302020204030204"/>
+        <a:latin typeface="Aptos Display" panose="02110004020202020204"/>
         <a:ea typeface=""/>
         <a:cs typeface=""/>
         <a:font script="Jpan" typeface="游ゴシック Light"/>
@@ -5143,9 +4862,26 @@
         <a:font script="Viet" typeface="Times New Roman"/>
         <a:font script="Uigh" typeface="Microsoft Uighur"/>
         <a:font script="Geor" typeface="Sylfaen"/>
+        <a:font script="Armn" typeface="Arial"/>
+        <a:font script="Bugi" typeface="Leelawadee UI"/>
+        <a:font script="Bopo" typeface="Microsoft JhengHei"/>
+        <a:font script="Java" typeface="Javanese Text"/>
+        <a:font script="Lisu" typeface="Segoe UI"/>
+        <a:font script="Mymr" typeface="Myanmar Text"/>
+        <a:font script="Nkoo" typeface="Ebrima"/>
+        <a:font script="Olck" typeface="Nirmala UI"/>
+        <a:font script="Osma" typeface="Ebrima"/>
+        <a:font script="Phag" typeface="Phagspa"/>
+        <a:font script="Syrn" typeface="Estrangelo Edessa"/>
+        <a:font script="Syrj" typeface="Estrangelo Edessa"/>
+        <a:font script="Syre" typeface="Estrangelo Edessa"/>
+        <a:font script="Sora" typeface="Nirmala UI"/>
+        <a:font script="Tale" typeface="Microsoft Tai Le"/>
+        <a:font script="Talu" typeface="Microsoft New Tai Lue"/>
+        <a:font script="Tfng" typeface="Ebrima"/>
       </a:majorFont>
       <a:minorFont>
-        <a:latin typeface="Calibri" panose="020F0502020204030204"/>
+        <a:latin typeface="Aptos" panose="02110004020202020204"/>
         <a:ea typeface=""/>
         <a:cs typeface=""/>
         <a:font script="Jpan" typeface="游明朝"/>
@@ -5178,6 +4914,23 @@
         <a:font script="Viet" typeface="Arial"/>
         <a:font script="Uigh" typeface="Microsoft Uighur"/>
         <a:font script="Geor" typeface="Sylfaen"/>
+        <a:font script="Armn" typeface="Arial"/>
+        <a:font script="Bugi" typeface="Leelawadee UI"/>
+        <a:font script="Bopo" typeface="Microsoft JhengHei"/>
+        <a:font script="Java" typeface="Javanese Text"/>
+        <a:font script="Lisu" typeface="Segoe UI"/>
+        <a:font script="Mymr" typeface="Myanmar Text"/>
+        <a:font script="Nkoo" typeface="Ebrima"/>
+        <a:font script="Olck" typeface="Nirmala UI"/>
+        <a:font script="Osma" typeface="Ebrima"/>
+        <a:font script="Phag" typeface="Phagspa"/>
+        <a:font script="Syrn" typeface="Estrangelo Edessa"/>
+        <a:font script="Syrj" typeface="Estrangelo Edessa"/>
+        <a:font script="Syre" typeface="Estrangelo Edessa"/>
+        <a:font script="Sora" typeface="Nirmala UI"/>
+        <a:font script="Tale" typeface="Microsoft Tai Le"/>
+        <a:font script="Talu" typeface="Microsoft New Tai Lue"/>
+        <a:font script="Tfng" typeface="Ebrima"/>
       </a:minorFont>
     </a:fontScheme>
     <a:fmtScheme name="Office">
@@ -5322,7 +5075,7 @@
   <a:extraClrSchemeLst/>
   <a:extLst>
     <a:ext uri="{05A4C25C-085E-4340-85A3-A5531E510DB2}">
-      <thm15:themeFamily xmlns:thm15="http://schemas.microsoft.com/office/thememl/2012/main" name="Office Theme" id="{62F939B6-93AF-4DB8-9C6B-D6C7DFDC589F}" vid="{4A3C46E8-61CC-4603-A589-7422A47A8E4A}"/>
+      <thm15:themeFamily xmlns:thm15="http://schemas.microsoft.com/office/thememl/2012/main" name="Office Theme" id="{2E142A2C-CD16-42D6-873A-C26D2A0506FA}" vid="{1BDDFF52-6CD6-40A5-AB3C-68EB2F1E4D0A}"/>
     </a:ext>
   </a:extLst>
 </a:theme>

</xml_diff>

<commit_message>
Deploying to gh-pages from @ rachddou/rachddou.github.io@16f645c24291d66da45c6261d591aa8d8091c8e2 🚀
</commit_message>
<xml_diff>
--- a/assets/files/TP_E3_formulaire.docx
+++ b/assets/files/TP_E3_formulaire.docx
@@ -2,7 +2,7 @@
 <file path=word/document.xml><?xml version="1.0" encoding="utf-8"?>
 <w:document xmlns:w="http://schemas.openxmlformats.org/wordprocessingml/2006/main" xmlns:m="http://schemas.openxmlformats.org/officeDocument/2006/math" xmlns:r="http://schemas.openxmlformats.org/officeDocument/2006/relationships" xmlns:o="urn:schemas-microsoft-com:office:office" xmlns:v="urn:schemas-microsoft-com:vml" xmlns:w10="urn:schemas-microsoft-com:office:word" xmlns:a="http://schemas.openxmlformats.org/drawingml/2006/main" xmlns:pic="http://schemas.openxmlformats.org/drawingml/2006/picture" xmlns:wp="http://schemas.openxmlformats.org/drawingml/2006/wordprocessingDrawing">
   <w:body>
-    <w:bookmarkStart w:id="25" w:name="tp-e3-formulaire-de-réponses"/>
+    <w:bookmarkStart w:id="18" w:name="tp-e3-formulaire-de-réponses"/>
     <w:p>
       <w:pPr>
         <w:pStyle w:val="Heading1"/>
@@ -11,7 +11,7 @@
         <w:t xml:space="preserve">TP E3 — Formulaire de réponses</w:t>
       </w:r>
     </w:p>
-    <w:bookmarkStart w:id="16" w:name="X8ec967a2baf570ce1a8cf526366ded7c41ddbf1"/>
+    <w:bookmarkStart w:id="9" w:name="X8ec967a2baf570ce1a8cf526366ded7c41ddbf1"/>
     <w:p>
       <w:pPr>
         <w:pStyle w:val="Heading2"/>
@@ -95,8 +95,8 @@
         </w:pict>
       </w:r>
     </w:p>
-    <w:bookmarkEnd w:id="16"/>
-    <w:bookmarkStart w:id="19" w:name="Xc0f0675ae71a8f03d37da90c7033e56f583752d"/>
+    <w:bookmarkEnd w:id="9"/>
+    <w:bookmarkStart w:id="12" w:name="Xc0f0675ae71a8f03d37da90c7033e56f583752d"/>
     <w:p>
       <w:pPr>
         <w:pStyle w:val="Heading2"/>
@@ -105,7 +105,7 @@
         <w:t xml:space="preserve">Partie 2 — Tableau vs Liste : comportements asymptotiques</w:t>
       </w:r>
     </w:p>
-    <w:bookmarkStart w:id="17" w:name="exercice-2-insertion-en-tête"/>
+    <w:bookmarkStart w:id="10" w:name="exercice-2-insertion-en-tête"/>
     <w:p>
       <w:pPr>
         <w:pStyle w:val="Heading3"/>
@@ -123,7 +123,7 @@
           <w:b/>
           <w:bCs/>
         </w:rPr>
-        <w:t xml:space="preserve">2.C.</w:t>
+        <w:t xml:space="preserve">2.C–2.D.</w:t>
       </w:r>
       <w:r>
         <w:t xml:space="preserve"> </w:t>
@@ -353,7 +353,7 @@
           <w:b/>
           <w:bCs/>
         </w:rPr>
-        <w:t xml:space="preserve">2.D.</w:t>
+        <w:t xml:space="preserve">2.E.</w:t>
       </w:r>
       <w:r>
         <w:t xml:space="preserve"> </w:t>
@@ -493,7 +493,7 @@
           <w:b/>
           <w:bCs/>
         </w:rPr>
-        <w:t xml:space="preserve">2.E.</w:t>
+        <w:t xml:space="preserve">2.F.</w:t>
       </w:r>
       <w:r>
         <w:t xml:space="preserve"> </w:t>
@@ -577,8 +577,8 @@
         </w:pict>
       </w:r>
     </w:p>
-    <w:bookmarkEnd w:id="17"/>
-    <w:bookmarkStart w:id="18" w:name="exercice-3-accès-aléatoire"/>
+    <w:bookmarkEnd w:id="10"/>
+    <w:bookmarkStart w:id="11" w:name="exercice-3-accès-aléatoire"/>
     <w:p>
       <w:pPr>
         <w:pStyle w:val="Heading3"/>
@@ -1102,9 +1102,9 @@
         </w:pict>
       </w:r>
     </w:p>
-    <w:bookmarkEnd w:id="18"/>
-    <w:bookmarkEnd w:id="19"/>
-    <w:bookmarkStart w:id="21" w:name="Xce65bb98f345f1390d4815070da51fd53496bed"/>
+    <w:bookmarkEnd w:id="11"/>
+    <w:bookmarkEnd w:id="12"/>
+    <w:bookmarkStart w:id="14" w:name="Xce65bb98f345f1390d4815070da51fd53496bed"/>
     <w:p>
       <w:pPr>
         <w:pStyle w:val="Heading2"/>
@@ -1113,7 +1113,7 @@
         <w:t xml:space="preserve">Partie 3 — Impact du layout mémoire : AoS vs SoA</w:t>
       </w:r>
     </w:p>
-    <w:bookmarkStart w:id="20" w:name="exercice-4"/>
+    <w:bookmarkStart w:id="13" w:name="exercice-4"/>
     <w:p>
       <w:pPr>
         <w:pStyle w:val="Heading3"/>
@@ -1768,12 +1768,12 @@
         <w:tblLook w:firstRow="1" w:lastRow="0" w:firstColumn="0" w:lastColumn="0" w:noHBand="0" w:noVBand="0" w:val="0020"/>
       </w:tblPr>
       <w:tblGrid>
-        <w:gridCol w:w="1102"/>
-        <w:gridCol w:w="1503"/>
-        <w:gridCol w:w="1503"/>
-        <w:gridCol w:w="1704"/>
-        <w:gridCol w:w="1002"/>
-        <w:gridCol w:w="1102"/>
+        <w:gridCol w:w="1116"/>
+        <w:gridCol w:w="1523"/>
+        <w:gridCol w:w="1523"/>
+        <w:gridCol w:w="1726"/>
+        <w:gridCol w:w="913"/>
+        <w:gridCol w:w="1116"/>
       </w:tblGrid>
       <w:tr>
         <w:trPr>
@@ -1890,20 +1890,14 @@
             <w:pPr>
               <w:pStyle w:val="Compact"/>
             </w:pPr>
-            <w:r>
-              <w:t xml:space="preserve">12 Mo</w:t>
-            </w:r>
-          </w:p>
-        </w:tc>
-        <w:tc>
-          <w:tcPr/>
-          <w:p>
-            <w:pPr>
-              <w:pStyle w:val="Compact"/>
-            </w:pPr>
-            <w:r>
-              <w:t xml:space="preserve">400 Ko</w:t>
-            </w:r>
+          </w:p>
+        </w:tc>
+        <w:tc>
+          <w:tcPr/>
+          <w:p>
+            <w:pPr>
+              <w:pStyle w:val="Compact"/>
+            </w:pPr>
           </w:p>
         </w:tc>
       </w:tr>
@@ -1949,20 +1943,14 @@
             <w:pPr>
               <w:pStyle w:val="Compact"/>
             </w:pPr>
-            <w:r>
-              <w:t xml:space="preserve">48 Mo</w:t>
-            </w:r>
-          </w:p>
-        </w:tc>
-        <w:tc>
-          <w:tcPr/>
-          <w:p>
-            <w:pPr>
-              <w:pStyle w:val="Compact"/>
-            </w:pPr>
-            <w:r>
-              <w:t xml:space="preserve">1.6 Mo</w:t>
-            </w:r>
+          </w:p>
+        </w:tc>
+        <w:tc>
+          <w:tcPr/>
+          <w:p>
+            <w:pPr>
+              <w:pStyle w:val="Compact"/>
+            </w:pPr>
           </w:p>
         </w:tc>
       </w:tr>
@@ -2008,20 +1996,14 @@
             <w:pPr>
               <w:pStyle w:val="Compact"/>
             </w:pPr>
-            <w:r>
-              <w:t xml:space="preserve">120 Mo</w:t>
-            </w:r>
-          </w:p>
-        </w:tc>
-        <w:tc>
-          <w:tcPr/>
-          <w:p>
-            <w:pPr>
-              <w:pStyle w:val="Compact"/>
-            </w:pPr>
-            <w:r>
-              <w:t xml:space="preserve">4 Mo</w:t>
-            </w:r>
+          </w:p>
+        </w:tc>
+        <w:tc>
+          <w:tcPr/>
+          <w:p>
+            <w:pPr>
+              <w:pStyle w:val="Compact"/>
+            </w:pPr>
           </w:p>
         </w:tc>
       </w:tr>
@@ -2067,20 +2049,14 @@
             <w:pPr>
               <w:pStyle w:val="Compact"/>
             </w:pPr>
-            <w:r>
-              <w:t xml:space="preserve">240 Mo</w:t>
-            </w:r>
-          </w:p>
-        </w:tc>
-        <w:tc>
-          <w:tcPr/>
-          <w:p>
-            <w:pPr>
-              <w:pStyle w:val="Compact"/>
-            </w:pPr>
-            <w:r>
-              <w:t xml:space="preserve">8 Mo</w:t>
-            </w:r>
+          </w:p>
+        </w:tc>
+        <w:tc>
+          <w:tcPr/>
+          <w:p>
+            <w:pPr>
+              <w:pStyle w:val="Compact"/>
+            </w:pPr>
           </w:p>
         </w:tc>
       </w:tr>
@@ -2252,103 +2228,15 @@
       </w:r>
     </w:p>
     <w:p>
-      <w:pPr>
-        <w:pStyle w:val="FirstParagraph"/>
-      </w:pPr>
-      <w:r>
-        <w:rPr>
-          <w:b/>
-          <w:bCs/>
-        </w:rPr>
-        <w:t xml:space="preserve">4.J. (Optionnel)</w:t>
-      </w:r>
-      <w:r>
-        <w:t xml:space="preserve"> </w:t>
-      </w:r>
-      <w:r>
-        <w:t xml:space="preserve">Rapport AoS/SoA avec optimisation (</w:t>
-      </w:r>
-      <w:r>
-        <w:rPr>
-          <w:rStyle w:val="VerbatimChar"/>
-        </w:rPr>
-        <w:t xml:space="preserve">-O2</w:t>
-      </w:r>
-      <w:r>
-        <w:t xml:space="preserve">) pour</w:t>
-      </w:r>
-      <w:r>
-        <w:t xml:space="preserve"> </w:t>
-      </w:r>
-      <m:oMath>
-        <m:r>
-          <m:t>n</m:t>
-        </m:r>
-        <m:r>
-          <m:rPr>
-            <m:sty m:val="p"/>
-          </m:rPr>
-          <m:t>=</m:t>
-        </m:r>
-        <m:r>
-          <m:t>1</m:t>
-        </m:r>
-        <m:r>
-          <m:t> </m:t>
-        </m:r>
-        <m:r>
-          <m:t>000</m:t>
-        </m:r>
-        <m:r>
-          <m:t> </m:t>
-        </m:r>
-        <m:r>
-          <m:t>000</m:t>
-        </m:r>
-      </m:oMath>
-      <w:r>
-        <w:t xml:space="preserve"> </w:t>
-      </w:r>
-      <w:r>
-        <w:t xml:space="preserve">: _______</w:t>
-      </w:r>
-      <w:r>
-        <w:t xml:space="preserve"> </w:t>
-      </w:r>
-      <m:oMath>
-        <m:r>
-          <m:rPr>
-            <m:sty m:val="p"/>
-          </m:rPr>
-          <m:t>×</m:t>
-        </m:r>
-      </m:oMath>
-    </w:p>
-    <w:p>
-      <w:pPr>
-        <w:pStyle w:val="BodyText"/>
-      </w:pPr>
-      <w:r>
-        <w:t xml:space="preserve">Conclusion sur la capacité du compilateur à compenser un mauvais layout mémoire :</w:t>
-      </w:r>
-    </w:p>
-    <w:p>
       <w:r>
         <w:pict>
           <v:rect style="width:0;height:1.5pt" o:hralign="center" o:hrstd="t" o:hr="t"/>
         </w:pict>
       </w:r>
     </w:p>
-    <w:p>
-      <w:r>
-        <w:pict>
-          <v:rect style="width:0;height:1.5pt" o:hralign="center" o:hrstd="t" o:hr="t"/>
-        </w:pict>
-      </w:r>
-    </w:p>
-    <w:bookmarkEnd w:id="20"/>
-    <w:bookmarkEnd w:id="21"/>
-    <w:bookmarkStart w:id="23" w:name="partie-4-détection-de-cycle"/>
+    <w:bookmarkEnd w:id="13"/>
+    <w:bookmarkEnd w:id="14"/>
+    <w:bookmarkStart w:id="16" w:name="partie-4-détection-de-cycle"/>
     <w:p>
       <w:pPr>
         <w:pStyle w:val="Heading2"/>
@@ -2357,7 +2245,7 @@
         <w:t xml:space="preserve">Partie 4 — Détection de cycle</w:t>
       </w:r>
     </w:p>
-    <w:bookmarkStart w:id="22" w:name="exercice-7"/>
+    <w:bookmarkStart w:id="15" w:name="exercice-7"/>
     <w:p>
       <w:pPr>
         <w:pStyle w:val="Heading3"/>
@@ -3014,9 +2902,9 @@
         </w:pict>
       </w:r>
     </w:p>
-    <w:bookmarkEnd w:id="22"/>
-    <w:bookmarkEnd w:id="23"/>
-    <w:bookmarkStart w:id="24" w:name="bilan-général"/>
+    <w:bookmarkEnd w:id="15"/>
+    <w:bookmarkEnd w:id="16"/>
+    <w:bookmarkStart w:id="17" w:name="bilan-général"/>
     <w:p>
       <w:pPr>
         <w:pStyle w:val="Heading2"/>
@@ -3775,14 +3663,12 @@
         </w:pict>
       </w:r>
     </w:p>
-    <w:bookmarkEnd w:id="24"/>
-    <w:bookmarkEnd w:id="25"/>
+    <w:bookmarkEnd w:id="17"/>
+    <w:bookmarkEnd w:id="18"/>
     <w:sectPr>
-      <w:footerReference r:id="rId7" w:type="default"/>
-      <w:pgSz w:h="16838" w:w="11906"/>
-      <w:pgMar w:bottom="567" w:footer="709" w:gutter="0" w:header="709" w:left="720" w:right="720" w:top="567"/>
-      <w:cols w:space="708"/>
-      <w:docGrid w:linePitch="360"/>
+      <w:footnotePr>
+        <w:numRestart w:val="eachSect"/>
+      </w:footnotePr>
     </w:sectPr>
   </w:body>
 </w:document>
@@ -3792,237 +3678,6 @@
 <w:comments xmlns:w="http://schemas.openxmlformats.org/wordprocessingml/2006/main" xmlns:m="http://schemas.openxmlformats.org/officeDocument/2006/math" xmlns:r="http://schemas.openxmlformats.org/officeDocument/2006/relationships" xmlns:o="urn:schemas-microsoft-com:office:office" xmlns:v="urn:schemas-microsoft-com:vml" xmlns:w10="urn:schemas-microsoft-com:office:word" xmlns:a="http://schemas.openxmlformats.org/drawingml/2006/main" xmlns:pic="http://schemas.openxmlformats.org/drawingml/2006/picture" xmlns:wp="http://schemas.openxmlformats.org/drawingml/2006/wordprocessingDrawing"/>
 </file>
 
-<file path=word/footer1.xml><?xml version="1.0" encoding="utf-8"?>
-<w:ftr xmlns:wpc="http://schemas.microsoft.com/office/word/2010/wordprocessingCanvas" xmlns:cx="http://schemas.microsoft.com/office/drawing/2014/chartex" xmlns:cx1="http://schemas.microsoft.com/office/drawing/2015/9/8/chartex" xmlns:mc="http://schemas.openxmlformats.org/markup-compatibility/2006" xmlns:o="urn:schemas-microsoft-com:office:office" xmlns:r="http://schemas.openxmlformats.org/officeDocument/2006/relationships" xmlns:m="http://schemas.openxmlformats.org/officeDocument/2006/math" xmlns:v="urn:schemas-microsoft-com:vml" xmlns:wp14="http://schemas.microsoft.com/office/word/2010/wordprocessingDrawing" xmlns:wp="http://schemas.openxmlformats.org/drawingml/2006/wordprocessingDrawing" xmlns:w10="urn:schemas-microsoft-com:office:word" xmlns:w="http://schemas.openxmlformats.org/wordprocessingml/2006/main" xmlns:w14="http://schemas.microsoft.com/office/word/2010/wordml" xmlns:w15="http://schemas.microsoft.com/office/word/2012/wordml" xmlns:w16se="http://schemas.microsoft.com/office/word/2015/wordml/symex" xmlns:wpg="http://schemas.microsoft.com/office/word/2010/wordprocessingGroup" xmlns:wpi="http://schemas.microsoft.com/office/word/2010/wordprocessingInk" xmlns:wne="http://schemas.microsoft.com/office/word/2006/wordml" xmlns:wps="http://schemas.microsoft.com/office/word/2010/wordprocessingShape" mc:Ignorable="w14 w15 w16se wp14">
-  <w:sdt>
-    <w:sdtPr>
-      <w:id w:val="1519431076"/>
-      <w:docPartObj>
-        <w:docPartGallery w:val="Page Numbers (Bottom of Page)"/>
-        <w:docPartUnique/>
-      </w:docPartObj>
-    </w:sdtPr>
-    <w:sdtEndPr/>
-    <w:sdtContent>
-      <w:p>
-        <w:pPr>
-          <w:pStyle w:val="Pieddepage"/>
-        </w:pPr>
-        <w:r>
-          <w:rPr>
-            <w:noProof/>
-            <w:lang w:eastAsia="fr-FR"/>
-          </w:rPr>
-          <mc:AlternateContent>
-            <mc:Choice Requires="wpg">
-              <w:drawing>
-                <wp:anchor distT="0" distB="0" distL="114300" distR="114300" simplePos="0" relativeHeight="251659264" behindDoc="0" locked="0" layoutInCell="1" allowOverlap="1">
-                  <wp:simplePos x="0" y="0"/>
-                  <wp:positionH relativeFrom="margin">
-                    <wp:align>center</wp:align>
-                  </wp:positionH>
-                  <wp:positionV relativeFrom="page">
-                    <wp:align>bottom</wp:align>
-                  </wp:positionV>
-                  <wp:extent cx="436880" cy="716915"/>
-                  <wp:effectExtent l="9525" t="9525" r="10795" b="6985"/>
-                  <wp:wrapNone/>
-                  <wp:docPr id="1" name="Groupe 1"/>
-                  <wp:cNvGraphicFramePr>
-                    <a:graphicFrameLocks xmlns:a="http://schemas.openxmlformats.org/drawingml/2006/main"/>
-                  </wp:cNvGraphicFramePr>
-                  <a:graphic xmlns:a="http://schemas.openxmlformats.org/drawingml/2006/main">
-                    <a:graphicData uri="http://schemas.microsoft.com/office/word/2010/wordprocessingGroup">
-                      <wpg:wgp>
-                        <wpg:cNvGrpSpPr>
-                          <a:grpSpLocks/>
-                        </wpg:cNvGrpSpPr>
-                        <wpg:grpSpPr bwMode="auto">
-                          <a:xfrm>
-                            <a:off x="0" y="0"/>
-                            <a:ext cx="436880" cy="716915"/>
-                            <a:chOff x="1743" y="14699"/>
-                            <a:chExt cx="688" cy="1129"/>
-                          </a:xfrm>
-                        </wpg:grpSpPr>
-                        <wps:wsp>
-                          <wps:cNvPr id="2" name="AutoShape 77"/>
-                          <wps:cNvCnPr>
-                            <a:cxnSpLocks noChangeShapeType="1"/>
-                          </wps:cNvCnPr>
-                          <wps:spPr bwMode="auto">
-                            <a:xfrm flipV="1">
-                              <a:off x="2111" y="15387"/>
-                              <a:ext cx="0" cy="441"/>
-                            </a:xfrm>
-                            <a:prstGeom prst="straightConnector1">
-                              <a:avLst/>
-                            </a:prstGeom>
-                            <a:noFill/>
-                            <a:ln w="9525">
-                              <a:solidFill>
-                                <a:srgbClr val="7F7F7F"/>
-                              </a:solidFill>
-                              <a:round/>
-                              <a:headEnd/>
-                              <a:tailEnd/>
-                            </a:ln>
-                            <a:extLst>
-                              <a:ext uri="{909E8E84-426E-40DD-AFC4-6F175D3DCCD1}">
-                                <a14:hiddenFill xmlns:a14="http://schemas.microsoft.com/office/drawing/2010/main">
-                                  <a:noFill/>
-                                </a14:hiddenFill>
-                              </a:ext>
-                            </a:extLst>
-                          </wps:spPr>
-                          <wps:bodyPr/>
-                        </wps:wsp>
-                        <wps:wsp>
-                          <wps:cNvPr id="3" name="Rectangle 78"/>
-                          <wps:cNvSpPr>
-                            <a:spLocks noChangeArrowheads="1"/>
-                          </wps:cNvSpPr>
-                          <wps:spPr bwMode="auto">
-                            <a:xfrm>
-                              <a:off x="1743" y="14699"/>
-                              <a:ext cx="688" cy="688"/>
-                            </a:xfrm>
-                            <a:prstGeom prst="rect">
-                              <a:avLst/>
-                            </a:prstGeom>
-                            <a:noFill/>
-                            <a:ln w="9525">
-                              <a:solidFill>
-                                <a:srgbClr val="7F7F7F"/>
-                              </a:solidFill>
-                              <a:miter lim="800000"/>
-                              <a:headEnd/>
-                              <a:tailEnd/>
-                            </a:ln>
-                            <a:extLst>
-                              <a:ext uri="{909E8E84-426E-40DD-AFC4-6F175D3DCCD1}">
-                                <a14:hiddenFill xmlns:a14="http://schemas.microsoft.com/office/drawing/2010/main">
-                                  <a:solidFill>
-                                    <a:srgbClr val="FFFFFF"/>
-                                  </a:solidFill>
-                                </a14:hiddenFill>
-                              </a:ext>
-                            </a:extLst>
-                          </wps:spPr>
-                          <wps:txbx>
-                            <w:txbxContent>
-                              <w:p>
-                                <w:pPr>
-                                  <w:pStyle w:val="Pieddepage"/>
-                                  <w:jc w:val="center"/>
-                                  <w:rPr>
-                                    <w:sz w:val="16"/>
-                                    <w:szCs w:val="16"/>
-                                  </w:rPr>
-                                </w:pPr>
-                                <w:r>
-                                  <w:fldChar w:fldCharType="begin"/>
-                                </w:r>
-                                <w:r>
-                                  <w:instrText>PAGE    \* MERGEFORMAT</w:instrText>
-                                </w:r>
-                                <w:r>
-                                  <w:fldChar w:fldCharType="separate"/>
-                                </w:r>
-                                <w:r>
-                                  <w:rPr>
-                                    <w:noProof/>
-                                    <w:sz w:val="16"/>
-                                    <w:szCs w:val="16"/>
-                                  </w:rPr>
-                                  <w:t>1</w:t>
-                                </w:r>
-                                <w:r>
-                                  <w:rPr>
-                                    <w:sz w:val="16"/>
-                                    <w:szCs w:val="16"/>
-                                  </w:rPr>
-                                  <w:fldChar w:fldCharType="end"/>
-                                </w:r>
-                              </w:p>
-                            </w:txbxContent>
-                          </wps:txbx>
-                          <wps:bodyPr rot="0" vert="horz" wrap="square" lIns="91440" tIns="45720" rIns="91440" bIns="45720" anchor="ctr" anchorCtr="0" upright="1">
-                            <a:noAutofit/>
-                          </wps:bodyPr>
-                        </wps:wsp>
-                      </wpg:wgp>
-                    </a:graphicData>
-                  </a:graphic>
-                  <wp14:sizeRelH relativeFrom="page">
-                    <wp14:pctWidth>0</wp14:pctWidth>
-                  </wp14:sizeRelH>
-                  <wp14:sizeRelV relativeFrom="page">
-                    <wp14:pctHeight>0</wp14:pctHeight>
-                  </wp14:sizeRelV>
-                </wp:anchor>
-              </w:drawing>
-            </mc:Choice>
-            <mc:Fallback>
-              <w:pict>
-                <v:group id="Groupe 1" o:spid="_x0000_s1026" style="position:absolute;margin-left:0;margin-top:0;width:34.4pt;height:56.45pt;z-index:251659264;mso-position-horizontal:center;mso-position-horizontal-relative:margin;mso-position-vertical:bottom;mso-position-vertical-relative:page" coordorigin="1743,14699" coordsize="688,1129" o:gfxdata="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">
-                  <v:shapetype id="_x0000_t32" coordsize="21600,21600" o:spt="32" o:oned="t" path="m,l21600,21600e" filled="f">
-                    <v:path arrowok="t" fillok="f" o:connecttype="none"/>
-                    <o:lock v:ext="edit" shapetype="t"/>
-                  </v:shapetype>
-                  <v:shape id="AutoShape 77" o:spid="_x0000_s1027" type="#_x0000_t32" style="position:absolute;left:2111;top:15387;width:0;height:441;flip:y;visibility:visible;mso-wrap-style:square" o:connectortype="straight" o:gfxdata="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" strokecolor="#7f7f7f"/>
-                  <v:rect id="Rectangle 78" o:spid="_x0000_s1028" style="position:absolute;left:1743;top:14699;width:688;height:688;visibility:visible;mso-wrap-style:square;v-text-anchor:middle" o:gfxdata="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" filled="f" strokecolor="#7f7f7f">
-                    <v:textbox>
-                      <w:txbxContent>
-                        <w:p>
-                          <w:pPr>
-                            <w:pStyle w:val="Pieddepage"/>
-                            <w:jc w:val="center"/>
-                            <w:rPr>
-                              <w:sz w:val="16"/>
-                              <w:szCs w:val="16"/>
-                            </w:rPr>
-                          </w:pPr>
-                          <w:r>
-                            <w:fldChar w:fldCharType="begin"/>
-                          </w:r>
-                          <w:r>
-                            <w:instrText>PAGE    \* MERGEFORMAT</w:instrText>
-                          </w:r>
-                          <w:r>
-                            <w:fldChar w:fldCharType="separate"/>
-                          </w:r>
-                          <w:r>
-                            <w:rPr>
-                              <w:noProof/>
-                              <w:sz w:val="16"/>
-                              <w:szCs w:val="16"/>
-                            </w:rPr>
-                            <w:t>1</w:t>
-                          </w:r>
-                          <w:r>
-                            <w:rPr>
-                              <w:sz w:val="16"/>
-                              <w:szCs w:val="16"/>
-                            </w:rPr>
-                            <w:fldChar w:fldCharType="end"/>
-                          </w:r>
-                        </w:p>
-                      </w:txbxContent>
-                    </v:textbox>
-                  </v:rect>
-                  <w10:wrap anchorx="margin" anchory="page"/>
-                </v:group>
-              </w:pict>
-            </mc:Fallback>
-          </mc:AlternateContent>
-        </w:r>
-      </w:p>
-    </w:sdtContent>
-  </w:sdt>
-</w:ftr>
-</file>
-
 <file path=word/footnotes.xml><?xml version="1.0" encoding="utf-8"?>
 <w:footnotes xmlns:w="http://schemas.openxmlformats.org/wordprocessingml/2006/main" xmlns:m="http://schemas.openxmlformats.org/officeDocument/2006/math" xmlns:r="http://schemas.openxmlformats.org/officeDocument/2006/relationships" xmlns:o="urn:schemas-microsoft-com:office:office" xmlns:v="urn:schemas-microsoft-com:vml" xmlns:w10="urn:schemas-microsoft-com:office:word" xmlns:a="http://schemas.openxmlformats.org/drawingml/2006/main" xmlns:pic="http://schemas.openxmlformats.org/drawingml/2006/picture" xmlns:wp="http://schemas.openxmlformats.org/drawingml/2006/wordprocessingDrawing">
   <w:footnote w:type="continuationSeparator" w:id="0">
@@ -4043,119 +3698,7 @@
 </file>
 
 <file path=word/numbering.xml><?xml version="1.0" encoding="utf-8"?>
-<w:numbering xmlns:cx="http://schemas.microsoft.com/office/drawing/2014/chartex" xmlns:cx1="http://schemas.microsoft.com/office/drawing/2015/9/8/chartex" xmlns:m="http://schemas.openxmlformats.org/officeDocument/2006/math" xmlns:mc="http://schemas.openxmlformats.org/markup-compatibility/2006" xmlns:o="urn:schemas-microsoft-com:office:office" xmlns:r="http://schemas.openxmlformats.org/officeDocument/2006/relationships" xmlns:v="urn:schemas-microsoft-com:vml" xmlns:w="http://schemas.openxmlformats.org/wordprocessingml/2006/main" xmlns:w10="urn:schemas-microsoft-com:office:word" xmlns:w14="http://schemas.microsoft.com/office/word/2010/wordml" xmlns:w15="http://schemas.microsoft.com/office/word/2012/wordml" xmlns:w16se="http://schemas.microsoft.com/office/word/2015/wordml/symex" xmlns:wne="http://schemas.microsoft.com/office/word/2006/wordml" xmlns:wp="http://schemas.openxmlformats.org/drawingml/2006/wordprocessingDrawing" xmlns:wp14="http://schemas.microsoft.com/office/word/2010/wordprocessingDrawing" xmlns:wpc="http://schemas.microsoft.com/office/word/2010/wordprocessingCanvas" xmlns:wpg="http://schemas.microsoft.com/office/word/2010/wordprocessingGroup" xmlns:wpi="http://schemas.microsoft.com/office/word/2010/wordprocessingInk" xmlns:wps="http://schemas.microsoft.com/office/word/2010/wordprocessingShape" mc:Ignorable="w14 w15 w16se wp14">
-  <w:abstractNum w15:restartNumberingAfterBreak="0" w:abstractNumId="0">
-    <w:nsid w:val="038C2E39"/>
-    <w:multiLevelType w:val="hybridMultilevel"/>
-    <w:tmpl w:val="68C0F988"/>
-    <w:lvl w:ilvl="0" w:tplc="8C6206D4">
-      <w:numFmt w:val="bullet"/>
-      <w:lvlText w:val="-"/>
-      <w:lvlJc w:val="left"/>
-      <w:pPr>
-        <w:ind w:hanging="360" w:left="720"/>
-      </w:pPr>
-      <w:rPr>
-        <w:rFonts w:ascii="Courier New" w:cs="Courier New" w:eastAsiaTheme="minorHAnsi" w:hAnsi="Courier New" w:hint="default"/>
-      </w:rPr>
-    </w:lvl>
-    <w:lvl w:ilvl="1" w:tentative="1" w:tplc="040C0003">
-      <w:start w:val="1"/>
-      <w:numFmt w:val="bullet"/>
-      <w:lvlText w:val="o"/>
-      <w:lvlJc w:val="left"/>
-      <w:pPr>
-        <w:ind w:hanging="360" w:left="1440"/>
-      </w:pPr>
-      <w:rPr>
-        <w:rFonts w:ascii="Courier New" w:cs="Courier New" w:hAnsi="Courier New" w:hint="default"/>
-      </w:rPr>
-    </w:lvl>
-    <w:lvl w:ilvl="2" w:tentative="1" w:tplc="040C0005">
-      <w:start w:val="1"/>
-      <w:numFmt w:val="bullet"/>
-      <w:lvlText w:val=""/>
-      <w:lvlJc w:val="left"/>
-      <w:pPr>
-        <w:ind w:hanging="360" w:left="2160"/>
-      </w:pPr>
-      <w:rPr>
-        <w:rFonts w:ascii="Wingdings" w:hAnsi="Wingdings" w:hint="default"/>
-      </w:rPr>
-    </w:lvl>
-    <w:lvl w:ilvl="3" w:tentative="1" w:tplc="040C0001">
-      <w:start w:val="1"/>
-      <w:numFmt w:val="bullet"/>
-      <w:lvlText w:val=""/>
-      <w:lvlJc w:val="left"/>
-      <w:pPr>
-        <w:ind w:hanging="360" w:left="2880"/>
-      </w:pPr>
-      <w:rPr>
-        <w:rFonts w:ascii="Symbol" w:hAnsi="Symbol" w:hint="default"/>
-      </w:rPr>
-    </w:lvl>
-    <w:lvl w:ilvl="4" w:tentative="1" w:tplc="040C0003">
-      <w:start w:val="1"/>
-      <w:numFmt w:val="bullet"/>
-      <w:lvlText w:val="o"/>
-      <w:lvlJc w:val="left"/>
-      <w:pPr>
-        <w:ind w:hanging="360" w:left="3600"/>
-      </w:pPr>
-      <w:rPr>
-        <w:rFonts w:ascii="Courier New" w:cs="Courier New" w:hAnsi="Courier New" w:hint="default"/>
-      </w:rPr>
-    </w:lvl>
-    <w:lvl w:ilvl="5" w:tentative="1" w:tplc="040C0005">
-      <w:start w:val="1"/>
-      <w:numFmt w:val="bullet"/>
-      <w:lvlText w:val=""/>
-      <w:lvlJc w:val="left"/>
-      <w:pPr>
-        <w:ind w:hanging="360" w:left="4320"/>
-      </w:pPr>
-      <w:rPr>
-        <w:rFonts w:ascii="Wingdings" w:hAnsi="Wingdings" w:hint="default"/>
-      </w:rPr>
-    </w:lvl>
-    <w:lvl w:ilvl="6" w:tentative="1" w:tplc="040C0001">
-      <w:start w:val="1"/>
-      <w:numFmt w:val="bullet"/>
-      <w:lvlText w:val=""/>
-      <w:lvlJc w:val="left"/>
-      <w:pPr>
-        <w:ind w:hanging="360" w:left="5040"/>
-      </w:pPr>
-      <w:rPr>
-        <w:rFonts w:ascii="Symbol" w:hAnsi="Symbol" w:hint="default"/>
-      </w:rPr>
-    </w:lvl>
-    <w:lvl w:ilvl="7" w:tentative="1" w:tplc="040C0003">
-      <w:start w:val="1"/>
-      <w:numFmt w:val="bullet"/>
-      <w:lvlText w:val="o"/>
-      <w:lvlJc w:val="left"/>
-      <w:pPr>
-        <w:ind w:hanging="360" w:left="5760"/>
-      </w:pPr>
-      <w:rPr>
-        <w:rFonts w:ascii="Courier New" w:cs="Courier New" w:hAnsi="Courier New" w:hint="default"/>
-      </w:rPr>
-    </w:lvl>
-    <w:lvl w:ilvl="8" w:tentative="1" w:tplc="040C0005">
-      <w:start w:val="1"/>
-      <w:numFmt w:val="bullet"/>
-      <w:lvlText w:val=""/>
-      <w:lvlJc w:val="left"/>
-      <w:pPr>
-        <w:ind w:hanging="360" w:left="6480"/>
-      </w:pPr>
-      <w:rPr>
-        <w:rFonts w:ascii="Wingdings" w:hAnsi="Wingdings" w:hint="default"/>
-      </w:rPr>
-    </w:lvl>
-  </w:abstractNum>
+<w:numbering xmlns:w="http://schemas.openxmlformats.org/wordprocessingml/2006/main">
   <w:abstractNum w:abstractNumId="990">
     <w:nsid w:val="0000A990"/>
     <w:multiLevelType w:val="multilevel"/>
@@ -4335,9 +3878,6 @@
       </w:rPr>
     </w:lvl>
   </w:abstractNum>
-  <w:num w:numId="1">
-    <w:abstractNumId w:val="0"/>
-  </w:num>
   <w:num w:numId="1000">
     <w:abstractNumId w:val="990"/>
   </w:num>
@@ -4354,411 +3894,544 @@
 </file>
 
 <file path=word/styles.xml><?xml version="1.0" encoding="utf-8"?>
-<w:styles xmlns:mc="http://schemas.openxmlformats.org/markup-compatibility/2006" xmlns:r="http://schemas.openxmlformats.org/officeDocument/2006/relationships" xmlns:w="http://schemas.openxmlformats.org/wordprocessingml/2006/main" xmlns:w14="http://schemas.microsoft.com/office/word/2010/wordml" xmlns:w15="http://schemas.microsoft.com/office/word/2012/wordml" xmlns:w16se="http://schemas.microsoft.com/office/word/2015/wordml/symex" mc:Ignorable="w14 w15 w16se">
+<w:styles xmlns:r="http://schemas.openxmlformats.org/officeDocument/2006/relationships" xmlns:w="http://schemas.openxmlformats.org/wordprocessingml/2006/main">
   <w:docDefaults>
     <w:rPrDefault>
       <w:rPr>
-        <w:rFonts w:asciiTheme="minorHAnsi" w:cstheme="minorBidi" w:eastAsiaTheme="minorHAnsi" w:hAnsiTheme="minorHAnsi"/>
-        <w:sz w:val="22"/>
-        <w:szCs w:val="22"/>
-        <w:lang w:bidi="ar-SA" w:eastAsia="en-US" w:val="fr-FR"/>
+        <w:rFonts w:asciiTheme="minorHAnsi" w:cstheme="minorBidi" w:eastAsiaTheme="minorEastAsia" w:hAnsiTheme="minorHAnsi"/>
+        <w:sz w:val="24"/>
+        <w:szCs w:val="24"/>
+        <w:lang w:bidi="ar-SA" w:eastAsia="zh-CN" w:val="en-US"/>
       </w:rPr>
     </w:rPrDefault>
     <w:pPrDefault>
       <w:pPr>
-        <w:spacing w:after="160" w:line="259" w:lineRule="auto"/>
+        <w:spacing w:after="200"/>
       </w:pPr>
     </w:pPrDefault>
   </w:docDefaults>
-  <w:latentStyles w:count="371" w:defLockedState="0" w:defQFormat="0" w:defSemiHidden="0" w:defUIPriority="99" w:defUnhideWhenUsed="0">
-    <w:lsdException w:name="Normal" w:qFormat="1" w:uiPriority="0"/>
-    <w:lsdException w:name="heading 1" w:qFormat="1" w:uiPriority="9"/>
-    <w:lsdException w:name="heading 2" w:qFormat="1" w:semiHidden="1" w:uiPriority="9" w:unhideWhenUsed="1"/>
-    <w:lsdException w:name="heading 3" w:qFormat="1" w:semiHidden="1" w:uiPriority="9" w:unhideWhenUsed="1"/>
-    <w:lsdException w:name="heading 4" w:qFormat="1" w:semiHidden="1" w:uiPriority="9" w:unhideWhenUsed="1"/>
-    <w:lsdException w:name="heading 5" w:qFormat="1" w:semiHidden="1" w:uiPriority="9" w:unhideWhenUsed="1"/>
-    <w:lsdException w:name="heading 6" w:qFormat="1" w:semiHidden="1" w:uiPriority="9" w:unhideWhenUsed="1"/>
-    <w:lsdException w:name="heading 7" w:qFormat="1" w:semiHidden="1" w:uiPriority="9" w:unhideWhenUsed="1"/>
-    <w:lsdException w:name="heading 8" w:qFormat="1" w:semiHidden="1" w:uiPriority="9" w:unhideWhenUsed="1"/>
-    <w:lsdException w:name="heading 9" w:qFormat="1" w:semiHidden="1" w:uiPriority="9" w:unhideWhenUsed="1"/>
-    <w:lsdException w:name="index 1" w:semiHidden="1" w:unhideWhenUsed="1"/>
-    <w:lsdException w:name="index 2" w:semiHidden="1" w:unhideWhenUsed="1"/>
-    <w:lsdException w:name="index 3" w:semiHidden="1" w:unhideWhenUsed="1"/>
-    <w:lsdException w:name="index 4" w:semiHidden="1" w:unhideWhenUsed="1"/>
-    <w:lsdException w:name="index 5" w:semiHidden="1" w:unhideWhenUsed="1"/>
-    <w:lsdException w:name="index 6" w:semiHidden="1" w:unhideWhenUsed="1"/>
-    <w:lsdException w:name="index 7" w:semiHidden="1" w:unhideWhenUsed="1"/>
-    <w:lsdException w:name="index 8" w:semiHidden="1" w:unhideWhenUsed="1"/>
-    <w:lsdException w:name="index 9" w:semiHidden="1" w:unhideWhenUsed="1"/>
-    <w:lsdException w:name="toc 1" w:semiHidden="1" w:uiPriority="39" w:unhideWhenUsed="1"/>
-    <w:lsdException w:name="toc 2" w:semiHidden="1" w:uiPriority="39" w:unhideWhenUsed="1"/>
-    <w:lsdException w:name="toc 3" w:semiHidden="1" w:uiPriority="39" w:unhideWhenUsed="1"/>
-    <w:lsdException w:name="toc 4" w:semiHidden="1" w:uiPriority="39" w:unhideWhenUsed="1"/>
-    <w:lsdException w:name="toc 5" w:semiHidden="1" w:uiPriority="39" w:unhideWhenUsed="1"/>
-    <w:lsdException w:name="toc 6" w:semiHidden="1" w:uiPriority="39" w:unhideWhenUsed="1"/>
-    <w:lsdException w:name="toc 7" w:semiHidden="1" w:uiPriority="39" w:unhideWhenUsed="1"/>
-    <w:lsdException w:name="toc 8" w:semiHidden="1" w:uiPriority="39" w:unhideWhenUsed="1"/>
-    <w:lsdException w:name="toc 9" w:semiHidden="1" w:uiPriority="39" w:unhideWhenUsed="1"/>
-    <w:lsdException w:name="Normal Indent" w:semiHidden="1" w:unhideWhenUsed="1"/>
-    <w:lsdException w:name="footnote text" w:semiHidden="1" w:unhideWhenUsed="1"/>
-    <w:lsdException w:name="annotation text" w:semiHidden="1" w:unhideWhenUsed="1"/>
-    <w:lsdException w:name="header" w:semiHidden="1" w:unhideWhenUsed="1"/>
-    <w:lsdException w:name="footer" w:semiHidden="1" w:unhideWhenUsed="1"/>
-    <w:lsdException w:name="index heading" w:semiHidden="1" w:unhideWhenUsed="1"/>
-    <w:lsdException w:name="caption" w:qFormat="1" w:semiHidden="1" w:uiPriority="35" w:unhideWhenUsed="1"/>
-    <w:lsdException w:name="table of figures" w:semiHidden="1" w:unhideWhenUsed="1"/>
-    <w:lsdException w:name="envelope address" w:semiHidden="1" w:unhideWhenUsed="1"/>
-    <w:lsdException w:name="envelope return" w:semiHidden="1" w:unhideWhenUsed="1"/>
-    <w:lsdException w:name="footnote reference" w:semiHidden="1" w:unhideWhenUsed="1"/>
-    <w:lsdException w:name="annotation reference" w:semiHidden="1" w:unhideWhenUsed="1"/>
-    <w:lsdException w:name="line number" w:semiHidden="1" w:unhideWhenUsed="1"/>
-    <w:lsdException w:name="page number" w:semiHidden="1" w:unhideWhenUsed="1"/>
-    <w:lsdException w:name="endnote reference" w:semiHidden="1" w:unhideWhenUsed="1"/>
-    <w:lsdException w:name="endnote text" w:semiHidden="1" w:unhideWhenUsed="1"/>
-    <w:lsdException w:name="table of authorities" w:semiHidden="1" w:unhideWhenUsed="1"/>
-    <w:lsdException w:name="macro" w:semiHidden="1" w:unhideWhenUsed="1"/>
-    <w:lsdException w:name="toa heading" w:semiHidden="1" w:unhideWhenUsed="1"/>
-    <w:lsdException w:name="List" w:semiHidden="1" w:unhideWhenUsed="1"/>
-    <w:lsdException w:name="List Bullet" w:semiHidden="1" w:unhideWhenUsed="1"/>
-    <w:lsdException w:name="List Number" w:semiHidden="1" w:unhideWhenUsed="1"/>
-    <w:lsdException w:name="List 2" w:semiHidden="1" w:unhideWhenUsed="1"/>
-    <w:lsdException w:name="List 3" w:semiHidden="1" w:unhideWhenUsed="1"/>
-    <w:lsdException w:name="List 4" w:semiHidden="1" w:unhideWhenUsed="1"/>
-    <w:lsdException w:name="List 5" w:semiHidden="1" w:unhideWhenUsed="1"/>
-    <w:lsdException w:name="List Bullet 2" w:semiHidden="1" w:unhideWhenUsed="1"/>
-    <w:lsdException w:name="List Bullet 3" w:semiHidden="1" w:unhideWhenUsed="1"/>
-    <w:lsdException w:name="List Bullet 4" w:semiHidden="1" w:unhideWhenUsed="1"/>
-    <w:lsdException w:name="List Bullet 5" w:semiHidden="1" w:unhideWhenUsed="1"/>
-    <w:lsdException w:name="List Number 2" w:semiHidden="1" w:unhideWhenUsed="1"/>
-    <w:lsdException w:name="List Number 3" w:semiHidden="1" w:unhideWhenUsed="1"/>
-    <w:lsdException w:name="List Number 4" w:semiHidden="1" w:unhideWhenUsed="1"/>
-    <w:lsdException w:name="List Number 5" w:semiHidden="1" w:unhideWhenUsed="1"/>
-    <w:lsdException w:name="Title" w:qFormat="1" w:uiPriority="10"/>
-    <w:lsdException w:name="Closing" w:semiHidden="1" w:unhideWhenUsed="1"/>
-    <w:lsdException w:name="Signature" w:semiHidden="1" w:unhideWhenUsed="1"/>
-    <w:lsdException w:name="Default Paragraph Font" w:semiHidden="1" w:uiPriority="1" w:unhideWhenUsed="1"/>
-    <w:lsdException w:name="Body Text" w:semiHidden="1" w:unhideWhenUsed="1"/>
-    <w:lsdException w:name="Body Text Indent" w:semiHidden="1" w:unhideWhenUsed="1"/>
-    <w:lsdException w:name="List Continue" w:semiHidden="1" w:unhideWhenUsed="1"/>
-    <w:lsdException w:name="List Continue 2" w:semiHidden="1" w:unhideWhenUsed="1"/>
-    <w:lsdException w:name="List Continue 3" w:semiHidden="1" w:unhideWhenUsed="1"/>
-    <w:lsdException w:name="List Continue 4" w:semiHidden="1" w:unhideWhenUsed="1"/>
-    <w:lsdException w:name="List Continue 5" w:semiHidden="1" w:unhideWhenUsed="1"/>
-    <w:lsdException w:name="Message Header" w:semiHidden="1" w:unhideWhenUsed="1"/>
-    <w:lsdException w:name="Subtitle" w:qFormat="1" w:uiPriority="11"/>
-    <w:lsdException w:name="Salutation" w:semiHidden="1" w:unhideWhenUsed="1"/>
-    <w:lsdException w:name="Date" w:semiHidden="1" w:unhideWhenUsed="1"/>
-    <w:lsdException w:name="Body Text First Indent" w:semiHidden="1" w:unhideWhenUsed="1"/>
-    <w:lsdException w:name="Body Text First Indent 2" w:semiHidden="1" w:unhideWhenUsed="1"/>
-    <w:lsdException w:name="Note Heading" w:semiHidden="1" w:unhideWhenUsed="1"/>
-    <w:lsdException w:name="Body Text 2" w:semiHidden="1" w:unhideWhenUsed="1"/>
-    <w:lsdException w:name="Body Text 3" w:semiHidden="1" w:unhideWhenUsed="1"/>
-    <w:lsdException w:name="Body Text Indent 2" w:semiHidden="1" w:unhideWhenUsed="1"/>
-    <w:lsdException w:name="Body Text Indent 3" w:semiHidden="1" w:unhideWhenUsed="1"/>
-    <w:lsdException w:name="Block Text" w:semiHidden="1" w:unhideWhenUsed="1"/>
-    <w:lsdException w:name="Hyperlink" w:semiHidden="1" w:unhideWhenUsed="1"/>
-    <w:lsdException w:name="FollowedHyperlink" w:semiHidden="1" w:unhideWhenUsed="1"/>
-    <w:lsdException w:name="Strong" w:qFormat="1" w:uiPriority="22"/>
-    <w:lsdException w:name="Emphasis" w:qFormat="1" w:uiPriority="20"/>
-    <w:lsdException w:name="Document Map" w:semiHidden="1" w:unhideWhenUsed="1"/>
-    <w:lsdException w:name="Plain Text" w:semiHidden="1" w:unhideWhenUsed="1"/>
-    <w:lsdException w:name="E-mail Signature" w:semiHidden="1" w:unhideWhenUsed="1"/>
-    <w:lsdException w:name="HTML Top of Form" w:semiHidden="1" w:unhideWhenUsed="1"/>
-    <w:lsdException w:name="HTML Bottom of Form" w:semiHidden="1" w:unhideWhenUsed="1"/>
-    <w:lsdException w:name="Normal (Web)" w:semiHidden="1" w:unhideWhenUsed="1"/>
-    <w:lsdException w:name="HTML Acronym" w:semiHidden="1" w:unhideWhenUsed="1"/>
-    <w:lsdException w:name="HTML Address" w:semiHidden="1" w:unhideWhenUsed="1"/>
-    <w:lsdException w:name="HTML Cite" w:semiHidden="1" w:unhideWhenUsed="1"/>
-    <w:lsdException w:name="HTML Code" w:semiHidden="1" w:unhideWhenUsed="1"/>
-    <w:lsdException w:name="HTML Definition" w:semiHidden="1" w:unhideWhenUsed="1"/>
-    <w:lsdException w:name="HTML Keyboard" w:semiHidden="1" w:unhideWhenUsed="1"/>
-    <w:lsdException w:name="HTML Preformatted" w:semiHidden="1" w:unhideWhenUsed="1"/>
-    <w:lsdException w:name="HTML Sample" w:semiHidden="1" w:unhideWhenUsed="1"/>
-    <w:lsdException w:name="HTML Typewriter" w:semiHidden="1" w:unhideWhenUsed="1"/>
-    <w:lsdException w:name="HTML Variable" w:semiHidden="1" w:unhideWhenUsed="1"/>
-    <w:lsdException w:name="Normal Table" w:semiHidden="1" w:unhideWhenUsed="1"/>
-    <w:lsdException w:name="annotation subject" w:semiHidden="1" w:unhideWhenUsed="1"/>
-    <w:lsdException w:name="No List" w:semiHidden="1" w:unhideWhenUsed="1"/>
-    <w:lsdException w:name="Outline List 1" w:semiHidden="1" w:unhideWhenUsed="1"/>
-    <w:lsdException w:name="Outline List 2" w:semiHidden="1" w:unhideWhenUsed="1"/>
-    <w:lsdException w:name="Outline List 3" w:semiHidden="1" w:unhideWhenUsed="1"/>
-    <w:lsdException w:name="Table Simple 1" w:semiHidden="1" w:unhideWhenUsed="1"/>
-    <w:lsdException w:name="Table Simple 2" w:semiHidden="1" w:unhideWhenUsed="1"/>
-    <w:lsdException w:name="Table Simple 3" w:semiHidden="1" w:unhideWhenUsed="1"/>
-    <w:lsdException w:name="Table Classic 1" w:semiHidden="1" w:unhideWhenUsed="1"/>
-    <w:lsdException w:name="Table Classic 2" w:semiHidden="1" w:unhideWhenUsed="1"/>
-    <w:lsdException w:name="Table Classic 3" w:semiHidden="1" w:unhideWhenUsed="1"/>
-    <w:lsdException w:name="Table Classic 4" w:semiHidden="1" w:unhideWhenUsed="1"/>
-    <w:lsdException w:name="Table Colorful 1" w:semiHidden="1" w:unhideWhenUsed="1"/>
-    <w:lsdException w:name="Table Colorful 2" w:semiHidden="1" w:unhideWhenUsed="1"/>
-    <w:lsdException w:name="Table Colorful 3" w:semiHidden="1" w:unhideWhenUsed="1"/>
-    <w:lsdException w:name="Table Columns 1" w:semiHidden="1" w:unhideWhenUsed="1"/>
-    <w:lsdException w:name="Table Columns 2" w:semiHidden="1" w:unhideWhenUsed="1"/>
-    <w:lsdException w:name="Table Columns 3" w:semiHidden="1" w:unhideWhenUsed="1"/>
-    <w:lsdException w:name="Table Columns 4" w:semiHidden="1" w:unhideWhenUsed="1"/>
-    <w:lsdException w:name="Table Columns 5" w:semiHidden="1" w:unhideWhenUsed="1"/>
-    <w:lsdException w:name="Table Grid 1" w:semiHidden="1" w:unhideWhenUsed="1"/>
-    <w:lsdException w:name="Table Grid 2" w:semiHidden="1" w:unhideWhenUsed="1"/>
-    <w:lsdException w:name="Table Grid 3" w:semiHidden="1" w:unhideWhenUsed="1"/>
-    <w:lsdException w:name="Table Grid 4" w:semiHidden="1" w:unhideWhenUsed="1"/>
-    <w:lsdException w:name="Table Grid 5" w:semiHidden="1" w:unhideWhenUsed="1"/>
-    <w:lsdException w:name="Table Grid 6" w:semiHidden="1" w:unhideWhenUsed="1"/>
-    <w:lsdException w:name="Table Grid 7" w:semiHidden="1" w:unhideWhenUsed="1"/>
-    <w:lsdException w:name="Table Grid 8" w:semiHidden="1" w:unhideWhenUsed="1"/>
-    <w:lsdException w:name="Table List 1" w:semiHidden="1" w:unhideWhenUsed="1"/>
-    <w:lsdException w:name="Table List 2" w:semiHidden="1" w:unhideWhenUsed="1"/>
-    <w:lsdException w:name="Table List 3" w:semiHidden="1" w:unhideWhenUsed="1"/>
-    <w:lsdException w:name="Table List 4" w:semiHidden="1" w:unhideWhenUsed="1"/>
-    <w:lsdException w:name="Table List 5" w:semiHidden="1" w:unhideWhenUsed="1"/>
-    <w:lsdException w:name="Table List 6" w:semiHidden="1" w:unhideWhenUsed="1"/>
-    <w:lsdException w:name="Table List 7" w:semiHidden="1" w:unhideWhenUsed="1"/>
-    <w:lsdException w:name="Table List 8" w:semiHidden="1" w:unhideWhenUsed="1"/>
-    <w:lsdException w:name="Table 3D effects 1" w:semiHidden="1" w:unhideWhenUsed="1"/>
-    <w:lsdException w:name="Table 3D effects 2" w:semiHidden="1" w:unhideWhenUsed="1"/>
-    <w:lsdException w:name="Table 3D effects 3" w:semiHidden="1" w:unhideWhenUsed="1"/>
-    <w:lsdException w:name="Table Contemporary" w:semiHidden="1" w:unhideWhenUsed="1"/>
-    <w:lsdException w:name="Table Elegant" w:semiHidden="1" w:unhideWhenUsed="1"/>
-    <w:lsdException w:name="Table Professional" w:semiHidden="1" w:unhideWhenUsed="1"/>
-    <w:lsdException w:name="Table Subtle 1" w:semiHidden="1" w:unhideWhenUsed="1"/>
-    <w:lsdException w:name="Table Subtle 2" w:semiHidden="1" w:unhideWhenUsed="1"/>
-    <w:lsdException w:name="Table Web 1" w:semiHidden="1" w:unhideWhenUsed="1"/>
-    <w:lsdException w:name="Table Web 2" w:semiHidden="1" w:unhideWhenUsed="1"/>
-    <w:lsdException w:name="Table Web 3" w:semiHidden="1" w:unhideWhenUsed="1"/>
-    <w:lsdException w:name="Balloon Text" w:semiHidden="1" w:unhideWhenUsed="1"/>
-    <w:lsdException w:name="Table Grid" w:uiPriority="39"/>
-    <w:lsdException w:name="Table Theme" w:semiHidden="1" w:unhideWhenUsed="1"/>
-    <w:lsdException w:name="Placeholder Text" w:semiHidden="1"/>
-    <w:lsdException w:name="No Spacing" w:qFormat="1" w:uiPriority="1"/>
-    <w:lsdException w:name="Light Shading" w:uiPriority="60"/>
-    <w:lsdException w:name="Light List" w:uiPriority="61"/>
-    <w:lsdException w:name="Light Grid" w:uiPriority="62"/>
-    <w:lsdException w:name="Medium Shading 1" w:uiPriority="63"/>
-    <w:lsdException w:name="Medium Shading 2" w:uiPriority="64"/>
-    <w:lsdException w:name="Medium List 1" w:uiPriority="65"/>
-    <w:lsdException w:name="Medium List 2" w:uiPriority="66"/>
-    <w:lsdException w:name="Medium Grid 1" w:uiPriority="67"/>
-    <w:lsdException w:name="Medium Grid 2" w:uiPriority="68"/>
-    <w:lsdException w:name="Medium Grid 3" w:uiPriority="69"/>
-    <w:lsdException w:name="Dark List" w:uiPriority="70"/>
-    <w:lsdException w:name="Colorful Shading" w:uiPriority="71"/>
-    <w:lsdException w:name="Colorful List" w:uiPriority="72"/>
-    <w:lsdException w:name="Colorful Grid" w:uiPriority="73"/>
-    <w:lsdException w:name="Light Shading Accent 1" w:uiPriority="60"/>
-    <w:lsdException w:name="Light List Accent 1" w:uiPriority="61"/>
-    <w:lsdException w:name="Light Grid Accent 1" w:uiPriority="62"/>
-    <w:lsdException w:name="Medium Shading 1 Accent 1" w:uiPriority="63"/>
-    <w:lsdException w:name="Medium Shading 2 Accent 1" w:uiPriority="64"/>
-    <w:lsdException w:name="Medium List 1 Accent 1" w:uiPriority="65"/>
-    <w:lsdException w:name="Revision" w:semiHidden="1"/>
-    <w:lsdException w:name="List Paragraph" w:qFormat="1" w:uiPriority="34"/>
-    <w:lsdException w:name="Quote" w:qFormat="1" w:uiPriority="29"/>
-    <w:lsdException w:name="Intense Quote" w:qFormat="1" w:uiPriority="30"/>
-    <w:lsdException w:name="Medium List 2 Accent 1" w:uiPriority="66"/>
-    <w:lsdException w:name="Medium Grid 1 Accent 1" w:uiPriority="67"/>
-    <w:lsdException w:name="Medium Grid 2 Accent 1" w:uiPriority="68"/>
-    <w:lsdException w:name="Medium Grid 3 Accent 1" w:uiPriority="69"/>
-    <w:lsdException w:name="Dark List Accent 1" w:uiPriority="70"/>
-    <w:lsdException w:name="Colorful Shading Accent 1" w:uiPriority="71"/>
-    <w:lsdException w:name="Colorful List Accent 1" w:uiPriority="72"/>
-    <w:lsdException w:name="Colorful Grid Accent 1" w:uiPriority="73"/>
-    <w:lsdException w:name="Light Shading Accent 2" w:uiPriority="60"/>
-    <w:lsdException w:name="Light List Accent 2" w:uiPriority="61"/>
-    <w:lsdException w:name="Light Grid Accent 2" w:uiPriority="62"/>
-    <w:lsdException w:name="Medium Shading 1 Accent 2" w:uiPriority="63"/>
-    <w:lsdException w:name="Medium Shading 2 Accent 2" w:uiPriority="64"/>
-    <w:lsdException w:name="Medium List 1 Accent 2" w:uiPriority="65"/>
-    <w:lsdException w:name="Medium List 2 Accent 2" w:uiPriority="66"/>
-    <w:lsdException w:name="Medium Grid 1 Accent 2" w:uiPriority="67"/>
-    <w:lsdException w:name="Medium Grid 2 Accent 2" w:uiPriority="68"/>
-    <w:lsdException w:name="Medium Grid 3 Accent 2" w:uiPriority="69"/>
-    <w:lsdException w:name="Dark List Accent 2" w:uiPriority="70"/>
-    <w:lsdException w:name="Colorful Shading Accent 2" w:uiPriority="71"/>
-    <w:lsdException w:name="Colorful List Accent 2" w:uiPriority="72"/>
-    <w:lsdException w:name="Colorful Grid Accent 2" w:uiPriority="73"/>
-    <w:lsdException w:name="Light Shading Accent 3" w:uiPriority="60"/>
-    <w:lsdException w:name="Light List Accent 3" w:uiPriority="61"/>
-    <w:lsdException w:name="Light Grid Accent 3" w:uiPriority="62"/>
-    <w:lsdException w:name="Medium Shading 1 Accent 3" w:uiPriority="63"/>
-    <w:lsdException w:name="Medium Shading 2 Accent 3" w:uiPriority="64"/>
-    <w:lsdException w:name="Medium List 1 Accent 3" w:uiPriority="65"/>
-    <w:lsdException w:name="Medium List 2 Accent 3" w:uiPriority="66"/>
-    <w:lsdException w:name="Medium Grid 1 Accent 3" w:uiPriority="67"/>
-    <w:lsdException w:name="Medium Grid 2 Accent 3" w:uiPriority="68"/>
-    <w:lsdException w:name="Medium Grid 3 Accent 3" w:uiPriority="69"/>
-    <w:lsdException w:name="Dark List Accent 3" w:uiPriority="70"/>
-    <w:lsdException w:name="Colorful Shading Accent 3" w:uiPriority="71"/>
-    <w:lsdException w:name="Colorful List Accent 3" w:uiPriority="72"/>
-    <w:lsdException w:name="Colorful Grid Accent 3" w:uiPriority="73"/>
-    <w:lsdException w:name="Light Shading Accent 4" w:uiPriority="60"/>
-    <w:lsdException w:name="Light List Accent 4" w:uiPriority="61"/>
-    <w:lsdException w:name="Light Grid Accent 4" w:uiPriority="62"/>
-    <w:lsdException w:name="Medium Shading 1 Accent 4" w:uiPriority="63"/>
-    <w:lsdException w:name="Medium Shading 2 Accent 4" w:uiPriority="64"/>
-    <w:lsdException w:name="Medium List 1 Accent 4" w:uiPriority="65"/>
-    <w:lsdException w:name="Medium List 2 Accent 4" w:uiPriority="66"/>
-    <w:lsdException w:name="Medium Grid 1 Accent 4" w:uiPriority="67"/>
-    <w:lsdException w:name="Medium Grid 2 Accent 4" w:uiPriority="68"/>
-    <w:lsdException w:name="Medium Grid 3 Accent 4" w:uiPriority="69"/>
-    <w:lsdException w:name="Dark List Accent 4" w:uiPriority="70"/>
-    <w:lsdException w:name="Colorful Shading Accent 4" w:uiPriority="71"/>
-    <w:lsdException w:name="Colorful List Accent 4" w:uiPriority="72"/>
-    <w:lsdException w:name="Colorful Grid Accent 4" w:uiPriority="73"/>
-    <w:lsdException w:name="Light Shading Accent 5" w:uiPriority="60"/>
-    <w:lsdException w:name="Light List Accent 5" w:uiPriority="61"/>
-    <w:lsdException w:name="Light Grid Accent 5" w:uiPriority="62"/>
-    <w:lsdException w:name="Medium Shading 1 Accent 5" w:uiPriority="63"/>
-    <w:lsdException w:name="Medium Shading 2 Accent 5" w:uiPriority="64"/>
-    <w:lsdException w:name="Medium List 1 Accent 5" w:uiPriority="65"/>
-    <w:lsdException w:name="Medium List 2 Accent 5" w:uiPriority="66"/>
-    <w:lsdException w:name="Medium Grid 1 Accent 5" w:uiPriority="67"/>
-    <w:lsdException w:name="Medium Grid 2 Accent 5" w:uiPriority="68"/>
-    <w:lsdException w:name="Medium Grid 3 Accent 5" w:uiPriority="69"/>
-    <w:lsdException w:name="Dark List Accent 5" w:uiPriority="70"/>
-    <w:lsdException w:name="Colorful Shading Accent 5" w:uiPriority="71"/>
-    <w:lsdException w:name="Colorful List Accent 5" w:uiPriority="72"/>
-    <w:lsdException w:name="Colorful Grid Accent 5" w:uiPriority="73"/>
-    <w:lsdException w:name="Light Shading Accent 6" w:uiPriority="60"/>
-    <w:lsdException w:name="Light List Accent 6" w:uiPriority="61"/>
-    <w:lsdException w:name="Light Grid Accent 6" w:uiPriority="62"/>
-    <w:lsdException w:name="Medium Shading 1 Accent 6" w:uiPriority="63"/>
-    <w:lsdException w:name="Medium Shading 2 Accent 6" w:uiPriority="64"/>
-    <w:lsdException w:name="Medium List 1 Accent 6" w:uiPriority="65"/>
-    <w:lsdException w:name="Medium List 2 Accent 6" w:uiPriority="66"/>
-    <w:lsdException w:name="Medium Grid 1 Accent 6" w:uiPriority="67"/>
-    <w:lsdException w:name="Medium Grid 2 Accent 6" w:uiPriority="68"/>
-    <w:lsdException w:name="Medium Grid 3 Accent 6" w:uiPriority="69"/>
-    <w:lsdException w:name="Dark List Accent 6" w:uiPriority="70"/>
-    <w:lsdException w:name="Colorful Shading Accent 6" w:uiPriority="71"/>
-    <w:lsdException w:name="Colorful List Accent 6" w:uiPriority="72"/>
-    <w:lsdException w:name="Colorful Grid Accent 6" w:uiPriority="73"/>
-    <w:lsdException w:name="Subtle Emphasis" w:qFormat="1" w:uiPriority="19"/>
-    <w:lsdException w:name="Intense Emphasis" w:qFormat="1" w:uiPriority="21"/>
-    <w:lsdException w:name="Subtle Reference" w:qFormat="1" w:uiPriority="31"/>
-    <w:lsdException w:name="Intense Reference" w:qFormat="1" w:uiPriority="32"/>
-    <w:lsdException w:name="Book Title" w:qFormat="1" w:uiPriority="33"/>
-    <w:lsdException w:name="Bibliography" w:semiHidden="1" w:uiPriority="37" w:unhideWhenUsed="1"/>
-    <w:lsdException w:name="TOC Heading" w:qFormat="1" w:semiHidden="1" w:uiPriority="39" w:unhideWhenUsed="1"/>
-    <w:lsdException w:name="Plain Table 1" w:uiPriority="41"/>
-    <w:lsdException w:name="Plain Table 2" w:uiPriority="42"/>
-    <w:lsdException w:name="Plain Table 3" w:uiPriority="43"/>
-    <w:lsdException w:name="Plain Table 4" w:uiPriority="44"/>
-    <w:lsdException w:name="Plain Table 5" w:uiPriority="45"/>
-    <w:lsdException w:name="Grid Table Light" w:uiPriority="40"/>
-    <w:lsdException w:name="Grid Table 1 Light" w:uiPriority="46"/>
-    <w:lsdException w:name="Grid Table 2" w:uiPriority="47"/>
-    <w:lsdException w:name="Grid Table 3" w:uiPriority="48"/>
-    <w:lsdException w:name="Grid Table 4" w:uiPriority="49"/>
-    <w:lsdException w:name="Grid Table 5 Dark" w:uiPriority="50"/>
-    <w:lsdException w:name="Grid Table 6 Colorful" w:uiPriority="51"/>
-    <w:lsdException w:name="Grid Table 7 Colorful" w:uiPriority="52"/>
-    <w:lsdException w:name="Grid Table 1 Light Accent 1" w:uiPriority="46"/>
-    <w:lsdException w:name="Grid Table 2 Accent 1" w:uiPriority="47"/>
-    <w:lsdException w:name="Grid Table 3 Accent 1" w:uiPriority="48"/>
-    <w:lsdException w:name="Grid Table 4 Accent 1" w:uiPriority="49"/>
-    <w:lsdException w:name="Grid Table 5 Dark Accent 1" w:uiPriority="50"/>
-    <w:lsdException w:name="Grid Table 6 Colorful Accent 1" w:uiPriority="51"/>
-    <w:lsdException w:name="Grid Table 7 Colorful Accent 1" w:uiPriority="52"/>
-    <w:lsdException w:name="Grid Table 1 Light Accent 2" w:uiPriority="46"/>
-    <w:lsdException w:name="Grid Table 2 Accent 2" w:uiPriority="47"/>
-    <w:lsdException w:name="Grid Table 3 Accent 2" w:uiPriority="48"/>
-    <w:lsdException w:name="Grid Table 4 Accent 2" w:uiPriority="49"/>
-    <w:lsdException w:name="Grid Table 5 Dark Accent 2" w:uiPriority="50"/>
-    <w:lsdException w:name="Grid Table 6 Colorful Accent 2" w:uiPriority="51"/>
-    <w:lsdException w:name="Grid Table 7 Colorful Accent 2" w:uiPriority="52"/>
-    <w:lsdException w:name="Grid Table 1 Light Accent 3" w:uiPriority="46"/>
-    <w:lsdException w:name="Grid Table 2 Accent 3" w:uiPriority="47"/>
-    <w:lsdException w:name="Grid Table 3 Accent 3" w:uiPriority="48"/>
-    <w:lsdException w:name="Grid Table 4 Accent 3" w:uiPriority="49"/>
-    <w:lsdException w:name="Grid Table 5 Dark Accent 3" w:uiPriority="50"/>
-    <w:lsdException w:name="Grid Table 6 Colorful Accent 3" w:uiPriority="51"/>
-    <w:lsdException w:name="Grid Table 7 Colorful Accent 3" w:uiPriority="52"/>
-    <w:lsdException w:name="Grid Table 1 Light Accent 4" w:uiPriority="46"/>
-    <w:lsdException w:name="Grid Table 2 Accent 4" w:uiPriority="47"/>
-    <w:lsdException w:name="Grid Table 3 Accent 4" w:uiPriority="48"/>
-    <w:lsdException w:name="Grid Table 4 Accent 4" w:uiPriority="49"/>
-    <w:lsdException w:name="Grid Table 5 Dark Accent 4" w:uiPriority="50"/>
-    <w:lsdException w:name="Grid Table 6 Colorful Accent 4" w:uiPriority="51"/>
-    <w:lsdException w:name="Grid Table 7 Colorful Accent 4" w:uiPriority="52"/>
-    <w:lsdException w:name="Grid Table 1 Light Accent 5" w:uiPriority="46"/>
-    <w:lsdException w:name="Grid Table 2 Accent 5" w:uiPriority="47"/>
-    <w:lsdException w:name="Grid Table 3 Accent 5" w:uiPriority="48"/>
-    <w:lsdException w:name="Grid Table 4 Accent 5" w:uiPriority="49"/>
-    <w:lsdException w:name="Grid Table 5 Dark Accent 5" w:uiPriority="50"/>
-    <w:lsdException w:name="Grid Table 6 Colorful Accent 5" w:uiPriority="51"/>
-    <w:lsdException w:name="Grid Table 7 Colorful Accent 5" w:uiPriority="52"/>
-    <w:lsdException w:name="Grid Table 1 Light Accent 6" w:uiPriority="46"/>
-    <w:lsdException w:name="Grid Table 2 Accent 6" w:uiPriority="47"/>
-    <w:lsdException w:name="Grid Table 3 Accent 6" w:uiPriority="48"/>
-    <w:lsdException w:name="Grid Table 4 Accent 6" w:uiPriority="49"/>
-    <w:lsdException w:name="Grid Table 5 Dark Accent 6" w:uiPriority="50"/>
-    <w:lsdException w:name="Grid Table 6 Colorful Accent 6" w:uiPriority="51"/>
-    <w:lsdException w:name="Grid Table 7 Colorful Accent 6" w:uiPriority="52"/>
-    <w:lsdException w:name="List Table 1 Light" w:uiPriority="46"/>
-    <w:lsdException w:name="List Table 2" w:uiPriority="47"/>
-    <w:lsdException w:name="List Table 3" w:uiPriority="48"/>
-    <w:lsdException w:name="List Table 4" w:uiPriority="49"/>
-    <w:lsdException w:name="List Table 5 Dark" w:uiPriority="50"/>
-    <w:lsdException w:name="List Table 6 Colorful" w:uiPriority="51"/>
-    <w:lsdException w:name="List Table 7 Colorful" w:uiPriority="52"/>
-    <w:lsdException w:name="List Table 1 Light Accent 1" w:uiPriority="46"/>
-    <w:lsdException w:name="List Table 2 Accent 1" w:uiPriority="47"/>
-    <w:lsdException w:name="List Table 3 Accent 1" w:uiPriority="48"/>
-    <w:lsdException w:name="List Table 4 Accent 1" w:uiPriority="49"/>
-    <w:lsdException w:name="List Table 5 Dark Accent 1" w:uiPriority="50"/>
-    <w:lsdException w:name="List Table 6 Colorful Accent 1" w:uiPriority="51"/>
-    <w:lsdException w:name="List Table 7 Colorful Accent 1" w:uiPriority="52"/>
-    <w:lsdException w:name="List Table 1 Light Accent 2" w:uiPriority="46"/>
-    <w:lsdException w:name="List Table 2 Accent 2" w:uiPriority="47"/>
-    <w:lsdException w:name="List Table 3 Accent 2" w:uiPriority="48"/>
-    <w:lsdException w:name="List Table 4 Accent 2" w:uiPriority="49"/>
-    <w:lsdException w:name="List Table 5 Dark Accent 2" w:uiPriority="50"/>
-    <w:lsdException w:name="List Table 6 Colorful Accent 2" w:uiPriority="51"/>
-    <w:lsdException w:name="List Table 7 Colorful Accent 2" w:uiPriority="52"/>
-    <w:lsdException w:name="List Table 1 Light Accent 3" w:uiPriority="46"/>
-    <w:lsdException w:name="List Table 2 Accent 3" w:uiPriority="47"/>
-    <w:lsdException w:name="List Table 3 Accent 3" w:uiPriority="48"/>
-    <w:lsdException w:name="List Table 4 Accent 3" w:uiPriority="49"/>
-    <w:lsdException w:name="List Table 5 Dark Accent 3" w:uiPriority="50"/>
-    <w:lsdException w:name="List Table 6 Colorful Accent 3" w:uiPriority="51"/>
-    <w:lsdException w:name="List Table 7 Colorful Accent 3" w:uiPriority="52"/>
-    <w:lsdException w:name="List Table 1 Light Accent 4" w:uiPriority="46"/>
-    <w:lsdException w:name="List Table 2 Accent 4" w:uiPriority="47"/>
-    <w:lsdException w:name="List Table 3 Accent 4" w:uiPriority="48"/>
-    <w:lsdException w:name="List Table 4 Accent 4" w:uiPriority="49"/>
-    <w:lsdException w:name="List Table 5 Dark Accent 4" w:uiPriority="50"/>
-    <w:lsdException w:name="List Table 6 Colorful Accent 4" w:uiPriority="51"/>
-    <w:lsdException w:name="List Table 7 Colorful Accent 4" w:uiPriority="52"/>
-    <w:lsdException w:name="List Table 1 Light Accent 5" w:uiPriority="46"/>
-    <w:lsdException w:name="List Table 2 Accent 5" w:uiPriority="47"/>
-    <w:lsdException w:name="List Table 3 Accent 5" w:uiPriority="48"/>
-    <w:lsdException w:name="List Table 4 Accent 5" w:uiPriority="49"/>
-    <w:lsdException w:name="List Table 5 Dark Accent 5" w:uiPriority="50"/>
-    <w:lsdException w:name="List Table 6 Colorful Accent 5" w:uiPriority="51"/>
-    <w:lsdException w:name="List Table 7 Colorful Accent 5" w:uiPriority="52"/>
-    <w:lsdException w:name="List Table 1 Light Accent 6" w:uiPriority="46"/>
-    <w:lsdException w:name="List Table 2 Accent 6" w:uiPriority="47"/>
-    <w:lsdException w:name="List Table 3 Accent 6" w:uiPriority="48"/>
-    <w:lsdException w:name="List Table 4 Accent 6" w:uiPriority="49"/>
-    <w:lsdException w:name="List Table 5 Dark Accent 6" w:uiPriority="50"/>
-    <w:lsdException w:name="List Table 6 Colorful Accent 6" w:uiPriority="51"/>
-    <w:lsdException w:name="List Table 7 Colorful Accent 6" w:uiPriority="52"/>
-  </w:latentStyles>
+  <w:latentStyles w:count="276" w:defLockedState="0" w:defQFormat="0" w:defSemiHidden="0" w:defUIPriority="0" w:defUnhideWhenUsed="0"/>
   <w:style w:default="1" w:styleId="Normal" w:type="paragraph">
     <w:name w:val="Normal"/>
     <w:qFormat/>
-    <w:rsid w:val="001C6832"/>
-  </w:style>
-  <w:style w:default="1" w:styleId="Policepardfaut" w:type="character">
-    <w:name w:val="Default Paragraph Font"/>
-    <w:uiPriority w:val="1"/>
+  </w:style>
+  <w:style w:styleId="BodyText" w:type="paragraph">
+    <w:name w:val="Body Text"/>
+    <w:basedOn w:val="Normal"/>
+    <w:link w:val="BodyTextChar"/>
+    <w:qFormat/>
+    <w:pPr>
+      <w:spacing w:after="180" w:before="180"/>
+    </w:pPr>
+  </w:style>
+  <w:style w:customStyle="1" w:styleId="FirstParagraph" w:type="paragraph">
+    <w:name w:val="First Paragraph"/>
+    <w:basedOn w:val="BodyText"/>
+    <w:next w:val="BodyText"/>
+    <w:qFormat/>
+  </w:style>
+  <w:style w:customStyle="1" w:styleId="Compact" w:type="paragraph">
+    <w:name w:val="Compact"/>
+    <w:basedOn w:val="BodyText"/>
+    <w:qFormat/>
+    <w:pPr>
+      <w:spacing w:after="36" w:before="36"/>
+    </w:pPr>
+  </w:style>
+  <w:style w:styleId="Title" w:type="paragraph">
+    <w:name w:val="Title"/>
+    <w:basedOn w:val="Normal"/>
+    <w:next w:val="BodyText"/>
+    <w:link w:val="TitleChar"/>
+    <w:uiPriority w:val="10"/>
+    <w:qFormat/>
+    <w:rsid w:val="00A10FD9"/>
+    <w:pPr>
+      <w:spacing w:after="80" w:line="240" w:lineRule="auto"/>
+      <w:contextualSpacing/>
+      <w:jc w:val="center"/>
+    </w:pPr>
+    <w:rPr>
+      <w:rFonts w:asciiTheme="majorHAnsi" w:cstheme="majorBidi" w:eastAsiaTheme="majorEastAsia" w:hAnsiTheme="majorHAnsi"/>
+      <w:sz w:val="56"/>
+      <w:szCs w:val="56"/>
+    </w:rPr>
+  </w:style>
+  <w:style w:customStyle="1" w:styleId="TitleChar" w:type="character">
+    <w:name w:val="Title Char"/>
+    <w:basedOn w:val="DefaultParagraphFont"/>
+    <w:link w:val="Title"/>
+    <w:uiPriority w:val="10"/>
+    <w:rsid w:val="00A10FD9"/>
+    <w:rPr>
+      <w:rFonts w:asciiTheme="majorHAnsi" w:cstheme="majorBidi" w:eastAsiaTheme="majorEastAsia" w:hAnsiTheme="majorHAnsi"/>
+      <w:sz w:val="56"/>
+      <w:szCs w:val="56"/>
+    </w:rPr>
+  </w:style>
+  <w:style w:styleId="Subtitle" w:type="paragraph">
+    <w:name w:val="Subtitle"/>
+    <w:basedOn w:val="Title"/>
+    <w:next w:val="BodyText"/>
+    <w:link w:val="SubtitleChar"/>
+    <w:uiPriority w:val="11"/>
+    <w:qFormat/>
+    <w:rsid w:val="00A10FD9"/>
+    <w:pPr>
+      <w:numPr>
+        <w:ilvl w:val="1"/>
+      </w:numPr>
+    </w:pPr>
+    <w:rPr>
+      <w:rFonts w:cstheme="majorBidi" w:eastAsiaTheme="majorEastAsia"/>
+      <w:spacing w:val="15"/>
+      <w:sz w:val="28"/>
+      <w:szCs w:val="28"/>
+    </w:rPr>
+  </w:style>
+  <w:style w:customStyle="1" w:styleId="SubtitleChar" w:type="character">
+    <w:name w:val="Subtitle Char"/>
+    <w:basedOn w:val="DefaultParagraphFont"/>
+    <w:link w:val="Subtitle"/>
+    <w:uiPriority w:val="11"/>
+    <w:rsid w:val="00A10FD9"/>
+    <w:rPr>
+      <w:rFonts w:cstheme="majorBidi" w:eastAsiaTheme="majorEastAsia"/>
+      <w:color w:themeColor="text1" w:themeTint="A6" w:val="595959"/>
+      <w:spacing w:val="15"/>
+      <w:sz w:val="28"/>
+      <w:szCs w:val="28"/>
+    </w:rPr>
+  </w:style>
+  <w:style w:customStyle="1" w:styleId="Author" w:type="paragraph">
+    <w:name w:val="Author"/>
+    <w:basedOn w:val="Title"/>
+    <w:next w:val="BodyText"/>
+    <w:qFormat/>
+    <w:pPr>
+      <w:keepNext/>
+      <w:keepLines/>
+    </w:pPr>
+    <w:rPr>
+      <w:sz w:val="24"/>
+      <w:szCs w:val="24"/>
+    </w:rPr>
+  </w:style>
+  <w:style w:styleId="Date" w:type="paragraph">
+    <w:name w:val="Date"/>
+    <w:basedOn w:val="Title"/>
+    <w:next w:val="BodyText"/>
+    <w:qFormat/>
+    <w:pPr>
+      <w:keepNext/>
+      <w:keepLines/>
+    </w:pPr>
+    <w:rPr>
+      <w:sz w:val="24"/>
+      <w:szCs w:val="24"/>
+    </w:rPr>
+  </w:style>
+  <w:style w:customStyle="1" w:styleId="AbstractTitle" w:type="paragraph">
+    <w:name w:val="Abstract Title"/>
+    <w:basedOn w:val="Normal"/>
+    <w:next w:val="Abstract"/>
+    <w:qFormat/>
+    <w:pPr>
+      <w:keepNext/>
+      <w:keepLines/>
+      <w:spacing w:after="0" w:before="300"/>
+      <w:jc w:val="center"/>
+    </w:pPr>
+    <w:rPr>
+      <w:b/>
+      <w:sz w:val="20"/>
+      <w:szCs w:val="20"/>
+    </w:rPr>
+  </w:style>
+  <w:style w:customStyle="1" w:styleId="Abstract" w:type="paragraph">
+    <w:name w:val="Abstract"/>
+    <w:basedOn w:val="Normal"/>
+    <w:next w:val="BodyText"/>
+    <w:qFormat/>
+    <w:pPr>
+      <w:keepNext/>
+      <w:keepLines/>
+      <w:spacing w:after="300" w:before="100"/>
+    </w:pPr>
+    <w:rPr>
+      <w:sz w:val="20"/>
+      <w:szCs w:val="20"/>
+    </w:rPr>
+  </w:style>
+  <w:style w:styleId="Bibliography" w:type="paragraph">
+    <w:name w:val="Bibliography"/>
+    <w:basedOn w:val="Normal"/>
+    <w:next w:val="Bibliography"/>
+    <w:qFormat/>
+    <w:pPr/>
+    <w:rPr/>
+  </w:style>
+  <w:style w:styleId="Heading1" w:type="paragraph">
+    <w:name w:val="heading 1"/>
+    <w:basedOn w:val="Normal"/>
+    <w:next w:val="BodyText"/>
+    <w:link w:val="Heading1Char"/>
+    <w:uiPriority w:val="9"/>
+    <w:qFormat/>
+    <w:rsid w:val="00A10FD9"/>
+    <w:pPr>
+      <w:keepNext/>
+      <w:keepLines/>
+      <w:spacing w:after="80" w:before="360"/>
+      <w:outlineLvl w:val="0"/>
+    </w:pPr>
+    <w:rPr>
+      <w:rFonts w:asciiTheme="majorHAnsi" w:cstheme="majorBidi" w:eastAsiaTheme="majorEastAsia" w:hAnsiTheme="majorHAnsi"/>
+      <w:color w:themeColor="accent1" w:themeShade="BF" w:val="0F4761"/>
+      <w:sz w:val="40"/>
+      <w:szCs w:val="40"/>
+    </w:rPr>
+  </w:style>
+  <w:style w:styleId="Heading2" w:type="paragraph">
+    <w:name w:val="heading 2"/>
+    <w:basedOn w:val="Normal"/>
+    <w:next w:val="BodyText"/>
+    <w:link w:val="Heading2Char"/>
+    <w:uiPriority w:val="9"/>
     <w:semiHidden/>
     <w:unhideWhenUsed/>
-  </w:style>
-  <w:style w:default="1" w:styleId="TableauNormal" w:type="table">
-    <w:name w:val="Normal Table"/>
-    <w:uiPriority w:val="99"/>
+    <w:qFormat/>
+    <w:rsid w:val="00A10FD9"/>
+    <w:pPr>
+      <w:keepNext/>
+      <w:keepLines/>
+      <w:spacing w:after="80" w:before="160"/>
+      <w:outlineLvl w:val="1"/>
+    </w:pPr>
+    <w:rPr>
+      <w:rFonts w:asciiTheme="majorHAnsi" w:cstheme="majorBidi" w:eastAsiaTheme="majorEastAsia" w:hAnsiTheme="majorHAnsi"/>
+      <w:color w:themeColor="accent1" w:themeShade="BF" w:val="0F4761"/>
+      <w:sz w:val="32"/>
+      <w:szCs w:val="32"/>
+    </w:rPr>
+  </w:style>
+  <w:style w:styleId="Heading3" w:type="paragraph">
+    <w:name w:val="heading 3"/>
+    <w:basedOn w:val="Normal"/>
+    <w:next w:val="BodyText"/>
+    <w:link w:val="Heading3Char"/>
+    <w:uiPriority w:val="9"/>
     <w:semiHidden/>
     <w:unhideWhenUsed/>
+    <w:qFormat/>
+    <w:rsid w:val="00A10FD9"/>
+    <w:pPr>
+      <w:keepNext/>
+      <w:keepLines/>
+      <w:spacing w:after="80" w:before="160"/>
+      <w:outlineLvl w:val="2"/>
+    </w:pPr>
+    <w:rPr>
+      <w:rFonts w:cstheme="majorBidi" w:eastAsiaTheme="majorEastAsia"/>
+      <w:color w:themeColor="accent1" w:themeShade="BF" w:val="0F4761"/>
+      <w:sz w:val="28"/>
+      <w:szCs w:val="28"/>
+    </w:rPr>
+  </w:style>
+  <w:style w:styleId="Heading4" w:type="paragraph">
+    <w:name w:val="heading 4"/>
+    <w:basedOn w:val="Normal"/>
+    <w:next w:val="BodyText"/>
+    <w:link w:val="Heading4Char"/>
+    <w:uiPriority w:val="9"/>
+    <w:semiHidden/>
+    <w:unhideWhenUsed/>
+    <w:qFormat/>
+    <w:rsid w:val="00A10FD9"/>
+    <w:pPr>
+      <w:keepNext/>
+      <w:keepLines/>
+      <w:spacing w:after="40" w:before="80"/>
+      <w:outlineLvl w:val="3"/>
+    </w:pPr>
+    <w:rPr>
+      <w:rFonts w:cstheme="majorBidi" w:eastAsiaTheme="majorEastAsia"/>
+      <w:i/>
+      <w:iCs/>
+      <w:color w:themeColor="accent1" w:themeShade="BF" w:val="0F4761"/>
+    </w:rPr>
+  </w:style>
+  <w:style w:styleId="Heading5" w:type="paragraph">
+    <w:name w:val="heading 5"/>
+    <w:basedOn w:val="Normal"/>
+    <w:next w:val="BodyText"/>
+    <w:link w:val="Heading5Char"/>
+    <w:uiPriority w:val="9"/>
+    <w:semiHidden/>
+    <w:unhideWhenUsed/>
+    <w:qFormat/>
+    <w:rsid w:val="00A10FD9"/>
+    <w:pPr>
+      <w:keepNext/>
+      <w:keepLines/>
+      <w:spacing w:after="40" w:before="80"/>
+      <w:outlineLvl w:val="4"/>
+    </w:pPr>
+    <w:rPr>
+      <w:rFonts w:cstheme="majorBidi" w:eastAsiaTheme="majorEastAsia"/>
+      <w:color w:themeColor="accent1" w:themeShade="BF" w:val="0F4761"/>
+    </w:rPr>
+  </w:style>
+  <w:style w:styleId="Heading6" w:type="paragraph">
+    <w:name w:val="heading 6"/>
+    <w:basedOn w:val="Normal"/>
+    <w:next w:val="BodyText"/>
+    <w:link w:val="Heading6Char"/>
+    <w:uiPriority w:val="9"/>
+    <w:semiHidden/>
+    <w:unhideWhenUsed/>
+    <w:qFormat/>
+    <w:rsid w:val="00A10FD9"/>
+    <w:pPr>
+      <w:keepNext/>
+      <w:keepLines/>
+      <w:spacing w:after="0" w:before="40"/>
+      <w:outlineLvl w:val="5"/>
+    </w:pPr>
+    <w:rPr>
+      <w:rFonts w:cstheme="majorBidi" w:eastAsiaTheme="majorEastAsia"/>
+      <w:i/>
+      <w:iCs/>
+      <w:color w:themeColor="text1" w:themeTint="A6" w:val="595959"/>
+    </w:rPr>
+  </w:style>
+  <w:style w:styleId="Heading7" w:type="paragraph">
+    <w:name w:val="heading 7"/>
+    <w:basedOn w:val="Normal"/>
+    <w:next w:val="BodyText"/>
+    <w:link w:val="Heading7Char"/>
+    <w:uiPriority w:val="9"/>
+    <w:semiHidden/>
+    <w:unhideWhenUsed/>
+    <w:qFormat/>
+    <w:rsid w:val="00A10FD9"/>
+    <w:pPr>
+      <w:keepNext/>
+      <w:keepLines/>
+      <w:spacing w:after="0" w:before="40"/>
+      <w:outlineLvl w:val="6"/>
+    </w:pPr>
+    <w:rPr>
+      <w:rFonts w:cstheme="majorBidi" w:eastAsiaTheme="majorEastAsia"/>
+      <w:color w:themeColor="text1" w:themeTint="A6" w:val="595959"/>
+    </w:rPr>
+  </w:style>
+  <w:style w:styleId="Heading8" w:type="paragraph">
+    <w:name w:val="heading 8"/>
+    <w:basedOn w:val="Normal"/>
+    <w:next w:val="BodyText"/>
+    <w:link w:val="Heading8Char"/>
+    <w:uiPriority w:val="9"/>
+    <w:semiHidden/>
+    <w:unhideWhenUsed/>
+    <w:qFormat/>
+    <w:rsid w:val="00A10FD9"/>
+    <w:pPr>
+      <w:keepNext/>
+      <w:keepLines/>
+      <w:spacing w:after="0"/>
+      <w:outlineLvl w:val="7"/>
+    </w:pPr>
+    <w:rPr>
+      <w:rFonts w:cstheme="majorBidi" w:eastAsiaTheme="majorEastAsia"/>
+      <w:i/>
+      <w:iCs/>
+      <w:color w:themeColor="text1" w:themeTint="D8" w:val="272727"/>
+    </w:rPr>
+  </w:style>
+  <w:style w:styleId="Heading9" w:type="paragraph">
+    <w:name w:val="heading 9"/>
+    <w:basedOn w:val="Normal"/>
+    <w:next w:val="BodyText"/>
+    <w:link w:val="Heading9Char"/>
+    <w:uiPriority w:val="9"/>
+    <w:semiHidden/>
+    <w:unhideWhenUsed/>
+    <w:qFormat/>
+    <w:rsid w:val="00A10FD9"/>
+    <w:pPr>
+      <w:keepNext/>
+      <w:keepLines/>
+      <w:spacing w:after="0"/>
+      <w:outlineLvl w:val="8"/>
+    </w:pPr>
+    <w:rPr>
+      <w:rFonts w:cstheme="majorBidi" w:eastAsiaTheme="majorEastAsia"/>
+      <w:color w:themeColor="text1" w:themeTint="D8" w:val="272727"/>
+    </w:rPr>
+  </w:style>
+  <w:style w:customStyle="1" w:styleId="Heading1Char" w:type="character">
+    <w:name w:val="Heading 1 Char"/>
+    <w:basedOn w:val="DefaultParagraphFont"/>
+    <w:link w:val="Heading1"/>
+    <w:uiPriority w:val="9"/>
+    <w:rsid w:val="00A10FD9"/>
+    <w:rPr>
+      <w:rFonts w:asciiTheme="majorHAnsi" w:cstheme="majorBidi" w:eastAsiaTheme="majorEastAsia" w:hAnsiTheme="majorHAnsi"/>
+      <w:color w:themeColor="accent1" w:themeShade="BF" w:val="0F4761"/>
+      <w:sz w:val="40"/>
+      <w:szCs w:val="40"/>
+    </w:rPr>
+  </w:style>
+  <w:style w:customStyle="1" w:styleId="Heading2Char" w:type="character">
+    <w:name w:val="Heading 2 Char"/>
+    <w:basedOn w:val="DefaultParagraphFont"/>
+    <w:link w:val="Heading2"/>
+    <w:uiPriority w:val="9"/>
+    <w:semiHidden/>
+    <w:rsid w:val="00A10FD9"/>
+    <w:rPr>
+      <w:rFonts w:asciiTheme="majorHAnsi" w:cstheme="majorBidi" w:eastAsiaTheme="majorEastAsia" w:hAnsiTheme="majorHAnsi"/>
+      <w:color w:themeColor="accent1" w:themeShade="BF" w:val="0F4761"/>
+      <w:sz w:val="32"/>
+      <w:szCs w:val="32"/>
+    </w:rPr>
+  </w:style>
+  <w:style w:customStyle="1" w:styleId="Heading3Char" w:type="character">
+    <w:name w:val="Heading 3 Char"/>
+    <w:basedOn w:val="DefaultParagraphFont"/>
+    <w:link w:val="Heading3"/>
+    <w:uiPriority w:val="9"/>
+    <w:semiHidden/>
+    <w:rsid w:val="00A10FD9"/>
+    <w:rPr>
+      <w:rFonts w:cstheme="majorBidi" w:eastAsiaTheme="majorEastAsia"/>
+      <w:color w:themeColor="accent1" w:themeShade="BF" w:val="0F4761"/>
+      <w:sz w:val="28"/>
+      <w:szCs w:val="28"/>
+    </w:rPr>
+  </w:style>
+  <w:style w:customStyle="1" w:styleId="Heading4Char" w:type="character">
+    <w:name w:val="Heading 4 Char"/>
+    <w:basedOn w:val="DefaultParagraphFont"/>
+    <w:link w:val="Heading4"/>
+    <w:uiPriority w:val="9"/>
+    <w:semiHidden/>
+    <w:rsid w:val="00A10FD9"/>
+    <w:rPr>
+      <w:rFonts w:cstheme="majorBidi" w:eastAsiaTheme="majorEastAsia"/>
+      <w:i/>
+      <w:iCs/>
+      <w:color w:themeColor="accent1" w:themeShade="BF" w:val="0F4761"/>
+    </w:rPr>
+  </w:style>
+  <w:style w:customStyle="1" w:styleId="Heading5Char" w:type="character">
+    <w:name w:val="Heading 5 Char"/>
+    <w:basedOn w:val="DefaultParagraphFont"/>
+    <w:link w:val="Heading5"/>
+    <w:uiPriority w:val="9"/>
+    <w:semiHidden/>
+    <w:rsid w:val="00A10FD9"/>
+    <w:rPr>
+      <w:rFonts w:cstheme="majorBidi" w:eastAsiaTheme="majorEastAsia"/>
+      <w:color w:themeColor="accent1" w:themeShade="BF" w:val="0F4761"/>
+    </w:rPr>
+  </w:style>
+  <w:style w:customStyle="1" w:styleId="Heading6Char" w:type="character">
+    <w:name w:val="Heading 6 Char"/>
+    <w:basedOn w:val="DefaultParagraphFont"/>
+    <w:link w:val="Heading6"/>
+    <w:uiPriority w:val="9"/>
+    <w:semiHidden/>
+    <w:rsid w:val="00A10FD9"/>
+    <w:rPr>
+      <w:rFonts w:cstheme="majorBidi" w:eastAsiaTheme="majorEastAsia"/>
+      <w:i/>
+      <w:iCs/>
+      <w:color w:themeColor="text1" w:themeTint="A6" w:val="595959"/>
+    </w:rPr>
+  </w:style>
+  <w:style w:customStyle="1" w:styleId="Heading7Char" w:type="character">
+    <w:name w:val="Heading 7 Char"/>
+    <w:basedOn w:val="DefaultParagraphFont"/>
+    <w:link w:val="Heading7"/>
+    <w:uiPriority w:val="9"/>
+    <w:semiHidden/>
+    <w:rsid w:val="00A10FD9"/>
+    <w:rPr>
+      <w:rFonts w:cstheme="majorBidi" w:eastAsiaTheme="majorEastAsia"/>
+      <w:color w:themeColor="text1" w:themeTint="A6" w:val="595959"/>
+    </w:rPr>
+  </w:style>
+  <w:style w:customStyle="1" w:styleId="Heading8Char" w:type="character">
+    <w:name w:val="Heading 8 Char"/>
+    <w:basedOn w:val="DefaultParagraphFont"/>
+    <w:link w:val="Heading8"/>
+    <w:uiPriority w:val="9"/>
+    <w:semiHidden/>
+    <w:rsid w:val="00A10FD9"/>
+    <w:rPr>
+      <w:rFonts w:cstheme="majorBidi" w:eastAsiaTheme="majorEastAsia"/>
+      <w:i/>
+      <w:iCs/>
+      <w:color w:themeColor="text1" w:themeTint="D8" w:val="272727"/>
+    </w:rPr>
+  </w:style>
+  <w:style w:customStyle="1" w:styleId="Heading9Char" w:type="character">
+    <w:name w:val="Heading 9 Char"/>
+    <w:basedOn w:val="DefaultParagraphFont"/>
+    <w:link w:val="Heading9"/>
+    <w:uiPriority w:val="9"/>
+    <w:semiHidden/>
+    <w:rsid w:val="00A10FD9"/>
+    <w:rPr>
+      <w:rFonts w:cstheme="majorBidi" w:eastAsiaTheme="majorEastAsia"/>
+      <w:color w:themeColor="text1" w:themeTint="D8" w:val="272727"/>
+    </w:rPr>
+  </w:style>
+  <w:style w:styleId="BlockText" w:type="paragraph">
+    <w:name w:val="Block Text"/>
+    <w:basedOn w:val="BodyText"/>
+    <w:next w:val="BodyText"/>
+    <w:uiPriority w:val="9"/>
+    <w:unhideWhenUsed/>
+    <w:qFormat/>
+    <w:pPr>
+      <w:spacing w:after="100" w:before="100"/>
+      <w:ind w:firstLine="0" w:left="480" w:right="480"/>
+    </w:pPr>
+  </w:style>
+  <w:style w:styleId="FootnoteText" w:type="paragraph">
+    <w:name w:val="Footnote Text"/>
+    <w:basedOn w:val="Normal"/>
+    <w:next w:val="FootnoteText"/>
+    <w:uiPriority w:val="9"/>
+    <w:unhideWhenUsed/>
+    <w:qFormat/>
+  </w:style>
+  <w:style w:styleId="FootnoteBlockText" w:type="paragraph">
+    <w:name w:val="Footnote Block Text"/>
+    <w:basedOn w:val="FootnoteText"/>
+    <w:next w:val="FootnoteText"/>
+    <w:uiPriority w:val="9"/>
+    <w:unhideWhenUsed/>
+    <w:qFormat/>
+    <w:pPr>
+      <w:spacing w:after="100" w:before="100"/>
+      <w:ind w:firstLine="0" w:left="480" w:right="480"/>
+    </w:pPr>
+  </w:style>
+  <w:style w:default="1" w:styleId="DefaultParagraphFont" w:type="character">
+    <w:name w:val="Default Paragraph Font"/>
+    <w:semiHidden/>
+    <w:unhideWhenUsed/>
+  </w:style>
+  <w:style w:default="1" w:styleId="Table" w:type="table">
+    <w:name w:val="Table"/>
+    <w:basedOn w:val="TableNormal"/>
+    <w:semiHidden/>
+    <w:unhideWhenUsed/>
+    <w:qFormat/>
     <w:tblPr>
       <w:tblInd w:type="dxa" w:w="0"/>
       <w:tblCellMar>
@@ -4768,67 +4441,113 @@
         <w:right w:type="dxa" w:w="108"/>
       </w:tblCellMar>
     </w:tblPr>
-  </w:style>
-  <w:style w:default="1" w:styleId="Aucuneliste" w:type="numbering">
-    <w:name w:val="No List"/>
-    <w:uiPriority w:val="99"/>
-    <w:semiHidden/>
+    <w:tblStylePr w:type="firstRow">
+      <w:tcPr>
+        <w:tcBorders>
+          <w:bottom w:val="single"/>
+        </w:tcBorders>
+        <w:vAlign w:val="bottom"/>
+      </w:tcPr>
+    </w:tblStylePr>
+  </w:style>
+  <w:style w:customStyle="1" w:styleId="DefinitionTerm" w:type="paragraph">
+    <w:name w:val="Definition Term"/>
+    <w:basedOn w:val="Normal"/>
+    <w:next w:val="Definition"/>
+    <w:pPr>
+      <w:keepNext/>
+      <w:keepLines/>
+      <w:spacing w:after="0"/>
+    </w:pPr>
+    <w:rPr>
+      <w:b/>
+    </w:rPr>
+  </w:style>
+  <w:style w:customStyle="1" w:styleId="Definition" w:type="paragraph">
+    <w:name w:val="Definition"/>
+    <w:basedOn w:val="Normal"/>
+  </w:style>
+  <w:style w:styleId="Caption" w:type="paragraph">
+    <w:name w:val="Caption"/>
+    <w:basedOn w:val="Normal"/>
+    <w:link w:val="BodyTextChar"/>
+    <w:pPr>
+      <w:spacing w:after="120" w:before="0"/>
+    </w:pPr>
+    <w:rPr>
+      <w:i/>
+    </w:rPr>
+  </w:style>
+  <w:style w:customStyle="1" w:styleId="TableCaption" w:type="paragraph">
+    <w:name w:val="Table Caption"/>
+    <w:basedOn w:val="Caption"/>
+    <w:pPr>
+      <w:keepNext/>
+    </w:pPr>
+  </w:style>
+  <w:style w:customStyle="1" w:styleId="ImageCaption" w:type="paragraph">
+    <w:name w:val="Image Caption"/>
+    <w:basedOn w:val="Caption"/>
+  </w:style>
+  <w:style w:customStyle="1" w:styleId="Figure" w:type="paragraph">
+    <w:name w:val="Figure"/>
+    <w:basedOn w:val="Normal"/>
+  </w:style>
+  <w:style w:customStyle="1" w:styleId="CaptionedFigure" w:type="paragraph">
+    <w:name w:val="Captioned Figure"/>
+    <w:basedOn w:val="Figure"/>
+    <w:pPr>
+      <w:keepNext/>
+    </w:pPr>
+  </w:style>
+  <w:style w:customStyle="1" w:styleId="BodyTextChar" w:type="character">
+    <w:name w:val="Body Text Char"/>
+    <w:basedOn w:val="DefaultParagraphFont"/>
+    <w:link w:val="BodyText"/>
+  </w:style>
+  <w:style w:customStyle="1" w:styleId="VerbatimChar" w:type="character">
+    <w:name w:val="Verbatim Char"/>
+    <w:basedOn w:val="BodyTextChar"/>
+    <w:rPr>
+      <w:rFonts w:ascii="Consolas" w:hAnsi="Consolas"/>
+      <w:sz w:val="22"/>
+    </w:rPr>
+  </w:style>
+  <w:style w:customStyle="1" w:styleId="SectionNumber" w:type="character">
+    <w:name w:val="Section Number"/>
+    <w:basedOn w:val="BodyTextChar"/>
+  </w:style>
+  <w:style w:styleId="FootnoteReference" w:type="character">
+    <w:name w:val="Footnote Reference"/>
+    <w:basedOn w:val="BodyTextChar"/>
+    <w:rPr>
+      <w:vertAlign w:val="superscript"/>
+    </w:rPr>
+  </w:style>
+  <w:style w:styleId="Hyperlink" w:type="character">
+    <w:name w:val="Hyperlink"/>
+    <w:basedOn w:val="BodyTextChar"/>
+    <w:rPr>
+      <w:color w:themeColor="accent1" w:val="4F81BD"/>
+    </w:rPr>
+  </w:style>
+  <w:style w:styleId="TOCHeading" w:type="paragraph">
+    <w:name w:val="TOC Heading"/>
+    <w:basedOn w:val="Heading1"/>
+    <w:next w:val="BodyText"/>
+    <w:uiPriority w:val="39"/>
     <w:unhideWhenUsed/>
-  </w:style>
-  <w:style w:styleId="En-tte" w:type="paragraph">
-    <w:name w:val="header"/>
-    <w:basedOn w:val="Normal"/>
-    <w:link w:val="En-tteCar"/>
-    <w:uiPriority w:val="99"/>
-    <w:unhideWhenUsed/>
-    <w:rsid w:val="005405C5"/>
+    <w:qFormat/>
     <w:pPr>
-      <w:tabs>
-        <w:tab w:pos="4536" w:val="center"/>
-        <w:tab w:pos="9072" w:val="right"/>
-      </w:tabs>
-      <w:spacing w:after="0" w:line="240" w:lineRule="auto"/>
+      <w:spacing w:before="240" w:line="259" w:lineRule="auto"/>
+      <w:outlineLvl w:val="9"/>
     </w:pPr>
-  </w:style>
-  <w:style w:customStyle="1" w:styleId="En-tteCar" w:type="character">
-    <w:name w:val="En-tête Car"/>
-    <w:basedOn w:val="Policepardfaut"/>
-    <w:link w:val="En-tte"/>
-    <w:uiPriority w:val="99"/>
-    <w:rsid w:val="005405C5"/>
-  </w:style>
-  <w:style w:styleId="Pieddepage" w:type="paragraph">
-    <w:name w:val="footer"/>
-    <w:basedOn w:val="Normal"/>
-    <w:link w:val="PieddepageCar"/>
-    <w:uiPriority w:val="99"/>
-    <w:unhideWhenUsed/>
-    <w:rsid w:val="005405C5"/>
-    <w:pPr>
-      <w:tabs>
-        <w:tab w:pos="4536" w:val="center"/>
-        <w:tab w:pos="9072" w:val="right"/>
-      </w:tabs>
-      <w:spacing w:after="0" w:line="240" w:lineRule="auto"/>
-    </w:pPr>
-  </w:style>
-  <w:style w:customStyle="1" w:styleId="PieddepageCar" w:type="character">
-    <w:name w:val="Pied de page Car"/>
-    <w:basedOn w:val="Policepardfaut"/>
-    <w:link w:val="Pieddepage"/>
-    <w:uiPriority w:val="99"/>
-    <w:rsid w:val="005405C5"/>
-  </w:style>
-  <w:style w:styleId="Paragraphedeliste" w:type="paragraph">
-    <w:name w:val="List Paragraph"/>
-    <w:basedOn w:val="Normal"/>
-    <w:uiPriority w:val="34"/>
-    <w:qFormat/>
-    <w:rsid w:val="0090180A"/>
-    <w:pPr>
-      <w:ind w:left="720"/>
-      <w:contextualSpacing/>
-    </w:pPr>
+    <w:rPr>
+      <w:rFonts w:asciiTheme="majorHAnsi" w:cstheme="majorBidi" w:eastAsiaTheme="majorEastAsia" w:hAnsiTheme="majorHAnsi"/>
+      <w:b w:val="0"/>
+      <w:bCs w:val="0"/>
+      <w:color w:themeColor="accent1" w:themeShade="BF" w:val="365F91"/>
+    </w:rPr>
   </w:style>
   <w:style w:type="paragraph" w:customStyle="1" w:styleId="SourceCode">
     <w:name w:val="Source Code"/>
@@ -5068,7 +4787,7 @@
 </file>
 
 <file path=word/theme/theme1.xml><?xml version="1.0" encoding="utf-8"?>
-<a:theme xmlns:a="http://schemas.openxmlformats.org/drawingml/2006/main" name="Thème Office">
+<a:theme xmlns:a="http://schemas.openxmlformats.org/drawingml/2006/main" name="Office Theme">
   <a:themeElements>
     <a:clrScheme name="Office">
       <a:dk1>
@@ -5078,39 +4797,39 @@
         <a:sysClr val="window" lastClr="FFFFFF"/>
       </a:lt1>
       <a:dk2>
-        <a:srgbClr val="44546A"/>
+        <a:srgbClr val="0E2841"/>
       </a:dk2>
       <a:lt2>
-        <a:srgbClr val="E7E6E6"/>
+        <a:srgbClr val="E8E8E8"/>
       </a:lt2>
       <a:accent1>
-        <a:srgbClr val="5B9BD5"/>
+        <a:srgbClr val="156082"/>
       </a:accent1>
       <a:accent2>
-        <a:srgbClr val="ED7D31"/>
+        <a:srgbClr val="E97132"/>
       </a:accent2>
       <a:accent3>
-        <a:srgbClr val="A5A5A5"/>
+        <a:srgbClr val="196B24"/>
       </a:accent3>
       <a:accent4>
-        <a:srgbClr val="FFC000"/>
+        <a:srgbClr val="0F9ED5"/>
       </a:accent4>
       <a:accent5>
-        <a:srgbClr val="4472C4"/>
+        <a:srgbClr val="A02B93"/>
       </a:accent5>
       <a:accent6>
-        <a:srgbClr val="70AD47"/>
+        <a:srgbClr val="4EA72E"/>
       </a:accent6>
       <a:hlink>
-        <a:srgbClr val="0563C1"/>
+        <a:srgbClr val="467886"/>
       </a:hlink>
       <a:folHlink>
-        <a:srgbClr val="954F72"/>
+        <a:srgbClr val="96607D"/>
       </a:folHlink>
     </a:clrScheme>
     <a:fontScheme name="Office">
       <a:majorFont>
-        <a:latin typeface="Calibri Light" panose="020F0302020204030204"/>
+        <a:latin typeface="Aptos Display" panose="02110004020202020204"/>
         <a:ea typeface=""/>
         <a:cs typeface=""/>
         <a:font script="Jpan" typeface="游ゴシック Light"/>
@@ -5143,9 +4862,26 @@
         <a:font script="Viet" typeface="Times New Roman"/>
         <a:font script="Uigh" typeface="Microsoft Uighur"/>
         <a:font script="Geor" typeface="Sylfaen"/>
+        <a:font script="Armn" typeface="Arial"/>
+        <a:font script="Bugi" typeface="Leelawadee UI"/>
+        <a:font script="Bopo" typeface="Microsoft JhengHei"/>
+        <a:font script="Java" typeface="Javanese Text"/>
+        <a:font script="Lisu" typeface="Segoe UI"/>
+        <a:font script="Mymr" typeface="Myanmar Text"/>
+        <a:font script="Nkoo" typeface="Ebrima"/>
+        <a:font script="Olck" typeface="Nirmala UI"/>
+        <a:font script="Osma" typeface="Ebrima"/>
+        <a:font script="Phag" typeface="Phagspa"/>
+        <a:font script="Syrn" typeface="Estrangelo Edessa"/>
+        <a:font script="Syrj" typeface="Estrangelo Edessa"/>
+        <a:font script="Syre" typeface="Estrangelo Edessa"/>
+        <a:font script="Sora" typeface="Nirmala UI"/>
+        <a:font script="Tale" typeface="Microsoft Tai Le"/>
+        <a:font script="Talu" typeface="Microsoft New Tai Lue"/>
+        <a:font script="Tfng" typeface="Ebrima"/>
       </a:majorFont>
       <a:minorFont>
-        <a:latin typeface="Calibri" panose="020F0502020204030204"/>
+        <a:latin typeface="Aptos" panose="02110004020202020204"/>
         <a:ea typeface=""/>
         <a:cs typeface=""/>
         <a:font script="Jpan" typeface="游明朝"/>
@@ -5178,6 +4914,23 @@
         <a:font script="Viet" typeface="Arial"/>
         <a:font script="Uigh" typeface="Microsoft Uighur"/>
         <a:font script="Geor" typeface="Sylfaen"/>
+        <a:font script="Armn" typeface="Arial"/>
+        <a:font script="Bugi" typeface="Leelawadee UI"/>
+        <a:font script="Bopo" typeface="Microsoft JhengHei"/>
+        <a:font script="Java" typeface="Javanese Text"/>
+        <a:font script="Lisu" typeface="Segoe UI"/>
+        <a:font script="Mymr" typeface="Myanmar Text"/>
+        <a:font script="Nkoo" typeface="Ebrima"/>
+        <a:font script="Olck" typeface="Nirmala UI"/>
+        <a:font script="Osma" typeface="Ebrima"/>
+        <a:font script="Phag" typeface="Phagspa"/>
+        <a:font script="Syrn" typeface="Estrangelo Edessa"/>
+        <a:font script="Syrj" typeface="Estrangelo Edessa"/>
+        <a:font script="Syre" typeface="Estrangelo Edessa"/>
+        <a:font script="Sora" typeface="Nirmala UI"/>
+        <a:font script="Tale" typeface="Microsoft Tai Le"/>
+        <a:font script="Talu" typeface="Microsoft New Tai Lue"/>
+        <a:font script="Tfng" typeface="Ebrima"/>
       </a:minorFont>
     </a:fontScheme>
     <a:fmtScheme name="Office">
@@ -5322,7 +5075,7 @@
   <a:extraClrSchemeLst/>
   <a:extLst>
     <a:ext uri="{05A4C25C-085E-4340-85A3-A5531E510DB2}">
-      <thm15:themeFamily xmlns:thm15="http://schemas.microsoft.com/office/thememl/2012/main" name="Office Theme" id="{62F939B6-93AF-4DB8-9C6B-D6C7DFDC589F}" vid="{4A3C46E8-61CC-4603-A589-7422A47A8E4A}"/>
+      <thm15:themeFamily xmlns:thm15="http://schemas.microsoft.com/office/thememl/2012/main" name="Office Theme" id="{2E142A2C-CD16-42D6-873A-C26D2A0506FA}" vid="{1BDDFF52-6CD6-40A5-AB3C-68EB2F1E4D0A}"/>
     </a:ext>
   </a:extLst>
 </a:theme>

</xml_diff>